<commit_message>
Second-pass review of So You Want to Meditate Chinese translation
Independent line-by-line re-check against the English source across all
nine chunks: 152 lines revised (mistranslations, omissions, Buddhist
terminology, fluency). Restores the missing half of footnote 2, adds the
table of contents back to the Word file, and records every change in
复校记录-第二轮.md. Also stores the English source manuscript.

Co-Authored-By: Claude Opus 5.5 <noreply@anthropic.com>
Claude-Session: https://claude.ai/code/session_01RHzAWnvxVSv9kYjz6aghjY
</commit_message>
<xml_diff>
--- a/translation2/So_You_Want_to_Meditate_zh-CN.docx
+++ b/translation2/So_You_Want_to_Meditate_zh-CN.docx
@@ -29,19 +29,19 @@
     </w:p>
     <w:p>
       <w:pPr>
-        <w:spacing w:after="200" w:before="240"/>
+        <w:spacing w:after="240" w:before="240"/>
         <w:jc w:val="center"/>
       </w:pPr>
     </w:p>
     <w:p>
       <w:pPr>
-        <w:spacing w:after="200" w:before="240"/>
+        <w:spacing w:after="240" w:before="240"/>
         <w:jc w:val="center"/>
       </w:pPr>
     </w:p>
     <w:p>
       <w:pPr>
-        <w:spacing w:after="200" w:before="240"/>
+        <w:spacing w:after="240" w:before="240"/>
         <w:jc w:val="center"/>
       </w:pPr>
       <w:r>
@@ -55,7 +55,7 @@
     </w:p>
     <w:p>
       <w:pPr>
-        <w:spacing w:after="160"/>
+        <w:spacing w:after="240" w:before="120"/>
         <w:jc w:val="center"/>
       </w:pPr>
       <w:r>
@@ -126,7 +126,7 @@
     </w:p>
     <w:p>
       <w:pPr>
-        <w:spacing w:after="200" w:before="240"/>
+        <w:spacing w:after="240" w:before="240"/>
         <w:jc w:val="center"/>
       </w:pPr>
       <w:r>
@@ -140,19 +140,19 @@
     </w:p>
     <w:p>
       <w:pPr>
-        <w:spacing w:after="200" w:before="240"/>
+        <w:spacing w:after="240" w:before="240"/>
         <w:jc w:val="center"/>
       </w:pPr>
     </w:p>
     <w:p>
       <w:pPr>
-        <w:spacing w:after="200" w:before="240"/>
+        <w:spacing w:after="240" w:before="240"/>
         <w:jc w:val="center"/>
       </w:pPr>
     </w:p>
     <w:p>
       <w:pPr>
-        <w:spacing w:after="200" w:before="240"/>
+        <w:spacing w:after="240" w:before="240"/>
         <w:jc w:val="center"/>
       </w:pPr>
       <w:r>
@@ -166,7 +166,7 @@
     </w:p>
     <w:p>
       <w:pPr>
-        <w:spacing w:after="160"/>
+        <w:spacing w:after="240" w:before="120"/>
         <w:jc w:val="center"/>
       </w:pPr>
       <w:r>
@@ -181,7 +181,7 @@
     </w:p>
     <w:p>
       <w:pPr>
-        <w:spacing w:after="160"/>
+        <w:spacing w:after="240" w:before="120"/>
         <w:jc w:val="center"/>
       </w:pPr>
       <w:r>
@@ -196,7 +196,7 @@
     </w:p>
     <w:p>
       <w:pPr>
-        <w:spacing w:after="160"/>
+        <w:spacing w:after="240" w:before="120"/>
         <w:jc w:val="center"/>
       </w:pPr>
       <w:r>
@@ -211,7 +211,7 @@
     </w:p>
     <w:p>
       <w:pPr>
-        <w:spacing w:after="160"/>
+        <w:spacing w:after="240" w:before="120"/>
         <w:jc w:val="center"/>
       </w:pPr>
       <w:r>
@@ -226,7 +226,7 @@
     </w:p>
     <w:p>
       <w:pPr>
-        <w:spacing w:after="160"/>
+        <w:spacing w:after="240" w:before="120"/>
         <w:jc w:val="center"/>
       </w:pPr>
       <w:r>
@@ -241,7 +241,7 @@
     </w:p>
     <w:p>
       <w:pPr>
-        <w:spacing w:after="160"/>
+        <w:spacing w:after="240" w:before="120"/>
         <w:jc w:val="center"/>
       </w:pPr>
       <w:r>
@@ -261,7 +261,7 @@
     </w:p>
     <w:p>
       <w:pPr>
-        <w:spacing w:after="160"/>
+        <w:spacing w:after="240" w:before="120"/>
         <w:jc w:val="center"/>
       </w:pPr>
     </w:p>
@@ -277,7 +277,7 @@
     </w:p>
     <w:p>
       <w:pPr>
-        <w:spacing w:after="160"/>
+        <w:spacing w:after="240" w:before="120"/>
         <w:jc w:val="center"/>
       </w:pPr>
       <w:r>
@@ -292,7 +292,7 @@
     </w:p>
     <w:p>
       <w:pPr>
-        <w:spacing w:after="160"/>
+        <w:spacing w:after="240" w:before="120"/>
         <w:jc w:val="center"/>
       </w:pPr>
       <w:r>
@@ -375,31 +375,31 @@
         <w:rPr>
           <w:rFonts w:ascii="SimSun" w:cs="SimSun" w:eastAsia="SimSun" w:hAnsi="SimSun"/>
         </w:rPr>
-        <w:t xml:space="preserve">本书由四十篇短文组成。我曾走遍世界寻访明师，却发现寻常人的常识同样足以为我指路。那些和我一样、以种种方式在或粗或细的层面上寻求幸福的人，往往早已拥有我所追寻的东西，并在我四处参访上师的途中给了我教益。所谓“平凡”的人竟有这样的智慧——只要心思稍加转用，便足以引向证悟与自知——这或许令人意外，其实却不足为奇。而我之所以能消化这些市井中的智慧，并把它们转化为自我证悟路上的实际运用，这份心思上的灵活无疑要归功于过去五十年间的诸位上师：尤其是 Trulshik 仁波切——我于一九六九年初次见到他，直至二〇一一年他圆寂，他一直是我的引路人——以及我的剃度恩师宣化上人，我依止他皈依，并自一九七二年至一九八二年过着出家生活。</w:t>
-      </w:r>
-    </w:p>
-    <w:p>
-      <w:pPr>
-        <w:spacing w:after="120" w:line="340"/>
-        <w:ind w:firstLine="480"/>
-      </w:pPr>
-      <w:r>
-        <w:rPr>
-          <w:rFonts w:ascii="SimSun" w:cs="SimSun" w:eastAsia="SimSun" w:hAnsi="SimSun"/>
-        </w:rPr>
-        <w:t xml:space="preserve">我的家庭生活始于尼泊尔，我在那里娶了卡玛拉（Kamala），一位比我小二十岁的古隆族山地姑娘。我们相识于一九八三年，其时我已结束十年的出家生活，三年之后正式舍戒还俗。就在那一年，我们成了婚。多年来，她那质朴的智慧一再证明：它有多质朴，就有多恢弘。她于我而言，既是空行母，也是老师。她偶尔一开口便是四十分钟的长谈，每一次都让我豁然开朗，又惊叹不已。从一开始我就学会了安静地领受。</w:t>
-      </w:r>
-    </w:p>
-    <w:p>
-      <w:pPr>
-        <w:spacing w:after="120" w:line="340"/>
-        <w:ind w:firstLine="480"/>
-      </w:pPr>
-      <w:r>
-        <w:rPr>
-          <w:rFonts w:ascii="SimSun" w:cs="SimSun" w:eastAsia="SimSun" w:hAnsi="SimSun"/>
-        </w:rPr>
-        <w:t xml:space="preserve">孩子总在教我们，我的孩子也不例外。蕾切尔（Rachel）、穆德拉（Mudra）和凯拉什（Kailash）只是做他们自己，就显露出孩童那颗明澈之心的游戏本性。证悟者常常提到这一点——他们亲身体验过，并指出：若想修习禅修，我们都必须像孩子一样保持游戏、开放而不造作。我的孩子那份开放与不造作的天然自发，是与我同住的上师，直到他们各自离家上大学，展翅去探索这个世界、理解这个世界。</w:t>
+        <w:t xml:space="preserve">本书由四十篇短文组成。我曾走遍世界寻访明师，却发现寻常人的常识同样足以为我指路。那些和我一样、以种种方式在或粗或细的层面上寻求幸福的人，往往早已拥有我所追寻的东西，并在我四处参访上师的途中给了我教益。所谓“平凡”的人竟有这样的智慧——只要心思稍加灵活，便足以引向证悟与自知——这或许令人意外，其实却不足为奇。我若还有几分心思上的灵活，能消化这些市井中的智慧，并把它们转化为自我证悟路上的实际运用，那无疑要归功于过去五十年间的诸位上师：尤其是楚西仁波切（Trulshik Rinpoche）——我于一九六九年初次见到他，直至二〇一一年他圆寂，他一直是我的引路人——以及我的剃度恩师宣化上人，我依止他皈依，并自一九七二年至一九八二年过着出家生活。</w:t>
+      </w:r>
+    </w:p>
+    <w:p>
+      <w:pPr>
+        <w:spacing w:after="120" w:line="340"/>
+        <w:ind w:firstLine="480"/>
+      </w:pPr>
+      <w:r>
+        <w:rPr>
+          <w:rFonts w:ascii="SimSun" w:cs="SimSun" w:eastAsia="SimSun" w:hAnsi="SimSun"/>
+        </w:rPr>
+        <w:t xml:space="preserve">我的家庭生活始于尼泊尔，我在那里娶了卡玛拉（Kamala），一位比我小二十岁的古隆族山地姑娘。我们相识于一九八三年，其时我已结束十年的出家生活，三年之后正式舍戒还俗。就在那一年，我们成了婚。多年来，她那质朴的智慧一再证明：它有多质朴，就有多恢弘。她于我而言，既是空行母，也是老师。她偶尔一开口便是四十分钟的长谈，每一次都让我豁然开朗，又目瞪口呆。从一开始我就学会了安静地领受。</w:t>
+      </w:r>
+    </w:p>
+    <w:p>
+      <w:pPr>
+        <w:spacing w:after="120" w:line="340"/>
+        <w:ind w:firstLine="480"/>
+      </w:pPr>
+      <w:r>
+        <w:rPr>
+          <w:rFonts w:ascii="SimSun" w:cs="SimSun" w:eastAsia="SimSun" w:hAnsi="SimSun"/>
+        </w:rPr>
+        <w:t xml:space="preserve">孩子总在教我们，我的孩子也不例外。蕾切尔（Rachel）、穆德拉（Mudra）和凯拉什（Kailash）只是做他们自己，就显露出孩童那颗明澈之心的游戏本性。证悟者常常提到这一点——他们亲身体验过，并指出：若想禅修，我们都必须变得像孩子一样爱玩、开放而不造作。我的孩子那份开放与不造作的天然自发，是与我同住的上师，直到他们各自离家上大学，展翅去探索这个世界、理解这个世界。</w:t>
       </w:r>
     </w:p>
     <w:p>
@@ -423,19 +423,19 @@
         <w:rPr>
           <w:rFonts w:ascii="SimSun" w:cs="SimSun" w:eastAsia="SimSun" w:hAnsi="SimSun"/>
         </w:rPr>
-        <w:t xml:space="preserve">这些文章涵盖了通往自我证悟之道的方方面面，而我倾向于不借助宗教说教，只诉诸我们共有的常识。写下它们的背后，是我的一个信念：经典与哲理最好的印证，正是常识。</w:t>
-      </w:r>
-    </w:p>
-    <w:p>
-      <w:pPr>
-        <w:spacing w:after="120" w:line="340"/>
-        <w:ind w:firstLine="480"/>
-      </w:pPr>
-      <w:r>
-        <w:rPr>
-          <w:rFonts w:ascii="SimSun" w:cs="SimSun" w:eastAsia="SimSun" w:hAnsi="SimSun"/>
-        </w:rPr>
-        <w:t xml:space="preserve">这些文章可以按任意次序阅读。它们意在照亮并激发读者亲证真理的同时，也带来阅读的乐趣——既包括我学到的功课，或许同样重要的，还有我在失败中学到的功课。</w:t>
+        <w:t xml:space="preserve">这些文章涵盖了通往自我证悟之道的方方面面，而我倾向于不借助宗教说教，只诉诸我们共有的常识。它们都受到我的一个信念影响：经典与哲理最好的印证，正是常识。</w:t>
+      </w:r>
+    </w:p>
+    <w:p>
+      <w:pPr>
+        <w:spacing w:after="120" w:line="340"/>
+        <w:ind w:firstLine="480"/>
+      </w:pPr>
+      <w:r>
+        <w:rPr>
+          <w:rFonts w:ascii="SimSun" w:cs="SimSun" w:eastAsia="SimSun" w:hAnsi="SimSun"/>
+        </w:rPr>
+        <w:t xml:space="preserve">这些文章可以按任意次序阅读。它们意在借我学到的功课——以及或许同样重要的、我在失败中学到的功课——照亮并激发读者对真理的亲身体验，并在此过程中带来阅读的乐趣。</w:t>
       </w:r>
     </w:p>
     <w:p>
@@ -503,6 +503,39 @@
         <w:t xml:space="preserve">加利福尼亚州尤凯亚</w:t>
       </w:r>
     </w:p>
+    <w:p>
+      <w:pPr>
+        <w:pageBreakBefore/>
+        <w:spacing w:after="240" w:before="240"/>
+      </w:pPr>
+      <w:r>
+        <w:rPr>
+          <w:rFonts w:ascii="SimHei" w:cs="SimHei" w:eastAsia="SimHei" w:hAnsi="SimHei"/>
+          <w:sz w:val="36"/>
+          <w:szCs w:val="36"/>
+        </w:rPr>
+        <w:t xml:space="preserve">目录</w:t>
+      </w:r>
+    </w:p>
+    <w:sdt>
+      <w:sdtPr>
+        <w:alias w:val="目录"/>
+      </w:sdtPr>
+      <w:sdtContent>
+        <w:p>
+          <w:r>
+            <w:fldChar w:fldCharType="begin" w:dirty="true"/>
+            <w:instrText xml:space="preserve">TOC \h \o "1-1"</w:instrText>
+            <w:fldChar w:fldCharType="separate"/>
+          </w:r>
+        </w:p>
+        <w:p>
+          <w:r>
+            <w:fldChar w:fldCharType="end"/>
+          </w:r>
+        </w:p>
+      </w:sdtContent>
+    </w:sdt>
     <w:p>
       <w:pPr>
         <w:spacing w:after="120" w:line="340"/>
@@ -613,19 +646,19 @@
         <w:rPr>
           <w:rFonts w:ascii="SimSun" w:cs="SimSun" w:eastAsia="SimSun" w:hAnsi="SimSun"/>
         </w:rPr>
-        <w:t xml:space="preserve">要紧的是，在考虑禅修“怎么做”之前，先有一个可以认同的窝。事实上，我们不妨先在这个新空间里读读书、静静坐坐，只为让它变得熟悉。无论是老参还是新学，在熟悉的空间里禅修都更有成效，就像在外奔波一阵后回到自己的床上。要禅修，我们需要有安全感。</w:t>
-      </w:r>
-    </w:p>
-    <w:p>
-      <w:pPr>
-        <w:spacing w:after="120" w:line="340"/>
-        <w:ind w:firstLine="480"/>
-      </w:pPr>
-      <w:r>
-        <w:rPr>
-          <w:rFonts w:ascii="SimSun" w:cs="SimSun" w:eastAsia="SimSun" w:hAnsi="SimSun"/>
-        </w:rPr>
-        <w:t xml:space="preserve">位置就是一切，而且必须固定。我们所拥有的，可以简单到只是一块专用的垫子和一个坐垫，也可以是一间讲究的佛堂。一旦确定下来，我们自然会倾向于在约定的时间到那里打坐，还常常临时加坐一支香。禅修所要求的纪律相当可观，而仔细解决“探究自心时该把这具身体安放在何处”这个实际问题，是最重要的一项前行准备。</w:t>
+        <w:t xml:space="preserve">要紧的是，在考虑禅修“怎么做”之前，先有一个让自己有归属感的窝。事实上，我们不妨先在这个新空间里读读书、静静坐坐，只为让它变得熟悉。无论是老参还是新学，在熟悉的空间里禅修都更有成效，就像在外奔波一阵后回到自己的床上。要禅修，我们需要有安全感。</w:t>
+      </w:r>
+    </w:p>
+    <w:p>
+      <w:pPr>
+        <w:spacing w:after="120" w:line="340"/>
+        <w:ind w:firstLine="480"/>
+      </w:pPr>
+      <w:r>
+        <w:rPr>
+          <w:rFonts w:ascii="SimSun" w:cs="SimSun" w:eastAsia="SimSun" w:hAnsi="SimSun"/>
+        </w:rPr>
+        <w:t xml:space="preserve">位置就是一切，而且必须固定。我们所拥有的，可以简单到只是一块专用的垫子和一个坐垫，也可以是一间讲究的佛堂。一旦确定下来，我们自然会倾向于在约定的时间到那里打坐，还常常临时加坐一支香。禅修所要求的纪律相当可观，而仔细解决“探究自心时该把这具身体安放在何处”这个实际问题，是事前所有考量中最重要的一项。</w:t>
       </w:r>
     </w:p>
     <w:p>
@@ -677,7 +710,7 @@
         <w:rPr>
           <w:rFonts w:ascii="SimSun" w:cs="SimSun" w:eastAsia="SimSun" w:hAnsi="SimSun"/>
         </w:rPr>
-        <w:t xml:space="preserve">最要紧的是，禅修应当是享受，是我们所期待的事。随着功夫渐熟、越来越享受其中，禅修的时长自然会增加。起初，禅修和任何一种训练一样，需要意愿和“不找借口”的态度；但几个月过去，我们会发现内心生起一股禅修的热情，期待打坐就像期待与好友相聚。</w:t>
+        <w:t xml:space="preserve">最要紧的是，禅修应当是享受，是我们所期待的事。随着功夫渐熟、越来越享受其中，禅修的时长也可以随之增加。起初，禅修和任何一种训练一样，需要意愿和“不找借口”的态度；但几个月过去，我们会发现内心生起一股禅修的热情，期待打坐就像期待与好友相聚。</w:t>
       </w:r>
     </w:p>
     <w:p>
@@ -765,7 +798,7 @@
         <w:rPr>
           <w:rFonts w:ascii="SimSun" w:cs="SimSun" w:eastAsia="SimSun" w:hAnsi="SimSun"/>
         </w:rPr>
-        <w:t xml:space="preserve">饮食对禅修影响甚大。禅修是对心的一种精微训练。因此，能让身体轻盈、柔软堪能的饮食，也会让心柔软堪能而轻盈。素食是有帮助的——前提是我们明白，素食同样可能染上其他饮食的毛病。简单说，我们吃饭是为了健康，不是为了娱乐。</w:t>
+        <w:t xml:space="preserve">饮食对禅修影响甚大。禅修是对心的一种精微训练。因此，能让身体轻盈、柔软堪能的饮食，也会让心柔软堪能而轻盈。素食是有帮助的——前提是我们明白，素食同样可能染上其他饮食的毛病。简单说，我们吃饭应当是为了健康，而不是为了娱乐。</w:t>
       </w:r>
     </w:p>
     <w:p>
@@ -789,7 +822,7 @@
         <w:rPr>
           <w:rFonts w:ascii="SimSun" w:cs="SimSun" w:eastAsia="SimSun" w:hAnsi="SimSun"/>
         </w:rPr>
-        <w:t xml:space="preserve">阿育吠陀（Ayurveda）是印度历经数百年发展起来的一套饮食与医学体系，也是世界上最古老的同类体系，可上溯到约五千年前。这套体系虽然繁复，却围绕三大纲领展开；这三纲可以细分出成千上万的子系统，也可以只守住最基本的三类（我偏好后者）。这三条准则是：悦性（sattvic）、变性（rajasic）、惰性（tamasic）。</w:t>
+        <w:t xml:space="preserve">阿育吠陀（Ayurveda）是印度历经千百年发展起来的一套饮食与医学体系，也是世界上最古老的同类体系，可上溯到约五千年前。这套体系虽然繁复，却围绕三大纲领展开；这三纲可以细分出成千上万的子系统，也可以只守住最基本的三类（我偏好后者）。这三条准则是：悦性（sattvic）、变性（rajasic）、惰性（tamasic）。</w:t>
       </w:r>
     </w:p>
     <w:p>
@@ -813,19 +846,19 @@
         <w:rPr>
           <w:rFonts w:ascii="SimSun" w:cs="SimSun" w:eastAsia="SimSun" w:hAnsi="SimSun"/>
         </w:rPr>
-        <w:t xml:space="preserve">悦性食物虽能让身心轻盈而有活力，却未必是我们最爱吃的。我们也许会看到，变性食物让我们趋向躁动、焦虑和紧张，尽管这并不是我们想要的状态。我们也许会注意到，惰性食物让我们迟钝、沉重、反应冷淡，而这同样不是我们喜欢的状态。</w:t>
-      </w:r>
-    </w:p>
-    <w:p>
-      <w:pPr>
-        <w:spacing w:after="120" w:line="340"/>
-        <w:ind w:firstLine="480"/>
-      </w:pPr>
-      <w:r>
-        <w:rPr>
-          <w:rFonts w:ascii="SimSun" w:cs="SimSun" w:eastAsia="SimSun" w:hAnsi="SimSun"/>
-        </w:rPr>
-        <w:t xml:space="preserve">我们最“喜欢”的食物往往造就不出灵敏的身心，而我们无所谓的那些食物通常可以。我们很少需要靠吃自己不喜欢的东西，才能获得想要的状态。通过尝试、观察并记录下来，一个月内我们应当就能把食物分入上述三类——悦性、变性、惰性——并据此为自己的身体定出一套很好的饮食。给三类食物定下一个比例，对配餐很有帮助。始终记住：重点永远是吃完之后感觉如何，而不是吃的时候有多享受。</w:t>
+        <w:t xml:space="preserve">悦性食物虽能让身心轻盈而有活力，却未必是我们最爱吃的。我们也许会看到，变性食物让我们趋向躁动、焦虑和紧张，尽管这并不是我们想要的状态。我们也许会注意到，惰性食物让我们迟钝、沉重、反应迟缓，而这同样不是我们喜欢的状态。</w:t>
+      </w:r>
+    </w:p>
+    <w:p>
+      <w:pPr>
+        <w:spacing w:after="120" w:line="340"/>
+        <w:ind w:firstLine="480"/>
+      </w:pPr>
+      <w:r>
+        <w:rPr>
+          <w:rFonts w:ascii="SimSun" w:cs="SimSun" w:eastAsia="SimSun" w:hAnsi="SimSun"/>
+        </w:rPr>
+        <w:t xml:space="preserve">我们最“喜欢”的食物未必能造就灵敏的身心，而我们无所谓的那些食物通常可以。我们很少需要靠吃自己不喜欢的东西，才能获得想要的状态。通过尝试、观察并记录下来，一个月内我们应当就能把食物分入上述三类——悦性、变性、惰性——并据此为自己的身体定出一套很好的饮食。给三类食物定下一个比例，对配餐很有帮助。始终记住：重点永远是吃完之后感觉如何，而不是吃的时候有多享受。</w:t>
       </w:r>
     </w:p>
     <w:p>
@@ -849,7 +882,7 @@
         <w:rPr>
           <w:rFonts w:ascii="SimSun" w:cs="SimSun" w:eastAsia="SimSun" w:hAnsi="SimSun"/>
         </w:rPr>
-        <w:t xml:space="preserve">吃饭和禅修一样，应当每天在固定的时间进行。禅修的饮食不鼓励吃零食，因为零食既可能不健康，又会强化随冲动与贪欲而转的习气；而这习气会让我们坐上蒲团时轻易被念头带走。每天在固定的时间进食，等于间接地训练我们的心在每天同一时间更容易入于禅修、专注而不摇动。从很多方面看，时间都是禅修生活方式的一个要害。</w:t>
+        <w:t xml:space="preserve">吃饭和禅修一样，应当每天在固定的时间进行。禅修的饮食不鼓励吃零食，因为零食既可能不健康，又会强化随冲动与贪欲而转的习气；而这习气会让我们坐上蒲团时轻易被念头带走。每天在固定的时间进食，等于间接地训练我们的心在每天同一时间更容易入于禅修、专注而不摇动。从很多方面看，时间都是禅修生活方式的一项关键考量。</w:t>
       </w:r>
     </w:p>
     <w:p>
@@ -961,7 +994,7 @@
         <w:rPr>
           <w:rFonts w:ascii="SimSun" w:cs="SimSun" w:eastAsia="SimSun" w:hAnsi="SimSun"/>
         </w:rPr>
-        <w:t xml:space="preserve">起步阶段最好去上课，但课程可能不便宜。每周一堂课就足以打下基础、提供持续的指导，其余时间我们主要在家里、附近的公园或健身房练习。像禅修和饮食一样，有一位志同道合的朋友同行，往往是一种支持，也是可以分享、可以增进友谊的事。人是社会性的生命，正面的行为与他人一同进行时会更有力量。但我们必须守住重点，不要偏离初衷。</w:t>
+        <w:t xml:space="preserve">起步阶段最好去上课，但课程可能不便宜。每周一堂课就足以打下基础，并提供让我们不断进步的持续指导，其余时间我们主要在家里、附近的公园或健身房练习。像禅修和饮食一样，有一位志同道合的朋友同行，往往是一种支持，也是可以分享、可以增进友谊的事。人是社会性的生命，正面的行为与他人一同进行时会更有力量。但我们必须守住重点，不要偏离初衷。</w:t>
       </w:r>
     </w:p>
     <w:p>
@@ -1001,7 +1034,7 @@
         <w:rPr>
           <w:rFonts w:ascii="SimSun" w:cs="SimSun" w:eastAsia="SimSun" w:hAnsi="SimSun"/>
         </w:rPr>
-        <w:t xml:space="preserve">从一开始，我们对禅修的态度就必须正确，并且随着岁月推移始终保持正确。在佛教术语中，这种正确的态度称为“见”（view）。见对老参和对初学同样不可或缺，只是理由不同。一位久修者若不慎执着于禅悦，就会失去正见，因而退堕。禅修不在于乐境，而在于观慧。乐境若无观慧相伴，禅修者两者都会失去。而初学者若见地不正，禅修就变成又一件事务，变成本已忙碌的一天里多出来的一项安排。当压力逼得我们想减轻负担时，第一个被扔掉的往往就是禅修。</w:t>
+        <w:t xml:space="preserve">从一开始，我们对禅修的态度就必须正确，并且随着岁月推移始终保持正确。在佛教术语中，这种正确的态度称为“见”（view）。见对老参和对初学同样不可或缺，只是理由不同。一位久修者若不慎执着于禅悦，就可能失去正见，因而退堕。禅修不在于乐境，而在于观慧。乐境若无观慧相伴，禅修者两者都会失去。而初学者若见地不正，禅修就变成又一件事务，变成本已忙碌的一天里多出来的一项安排。当压力逼得我们想减轻负担时，第一个被扔掉的往往就是禅修。</w:t>
       </w:r>
     </w:p>
     <w:p>
@@ -1025,19 +1058,19 @@
         <w:rPr>
           <w:rFonts w:ascii="SimSun" w:cs="SimSun" w:eastAsia="SimSun" w:hAnsi="SimSun"/>
         </w:rPr>
-        <w:t xml:space="preserve">有功夫的禅修者懂得爱上“道”本身，就像资深的登山者享受路上的每一步。我在尼泊尔与夏尔巴人一同徒步多年，亲眼见到：他们留心的是自己此刻身在何处，而不是要去哪里。乐趣在于走这一程，抵达不过是锦上添花。同样，作为禅修者，我们绝不能被结果驱使，而要把功夫下在这一点上——满怀热情地拥抱“道”，极少想到“目标”。目标自会照料它自己。</w:t>
-      </w:r>
-    </w:p>
-    <w:p>
-      <w:pPr>
-        <w:spacing w:after="120" w:line="340"/>
-        <w:ind w:firstLine="480"/>
-      </w:pPr>
-      <w:r>
-        <w:rPr>
-          <w:rFonts w:ascii="SimSun" w:cs="SimSun" w:eastAsia="SimSun" w:hAnsi="SimSun"/>
-        </w:rPr>
-        <w:t xml:space="preserve">初学者常觉得不确定感妨碍了禅修的乐趣。我们会怀疑自己是不是修对了；可若不是心里惦记着目标，这个疑问根本不会生起。禅修所产生的任何正面结果，都来自一个极其磨人的过程。我们不能拔苗助长。如果能让自己那颗狂乱的思维之心慢下来，就会察觉禅修之中内在正发生的细微转变。心若慢得足够，我们甚至能看见草在生长。</w:t>
+        <w:t xml:space="preserve">有功夫的禅修者懂得爱上“道”本身，就像资深的登山者享受路上的每一步。我在尼泊尔与夏尔巴人一同徒步多年，亲眼见到：他们留心的是自己此刻身在何处，而不是要去哪里。乐趣在于走这一程，抵达不过是锦上添花。同样，作为禅修者，我们绝不能被结果驱使，而要专心培养功夫，直到能满怀热情地拥抱“道”，极少去想“目标”。至于目标，就让它水到渠成。</w:t>
+      </w:r>
+    </w:p>
+    <w:p>
+      <w:pPr>
+        <w:spacing w:after="120" w:line="340"/>
+        <w:ind w:firstLine="480"/>
+      </w:pPr>
+      <w:r>
+        <w:rPr>
+          <w:rFonts w:ascii="SimSun" w:cs="SimSun" w:eastAsia="SimSun" w:hAnsi="SimSun"/>
+        </w:rPr>
+        <w:t xml:space="preserve">初学者常觉得不确定感妨碍了禅修的乐趣。我们会怀疑自己是不是修对了；可若不是心里惦记着目标，这个疑问根本不会生起。禅修所产生的任何正面结果，都来自一个极其磨人的过程。我们不能揠苗助长。如果能让自己那颗狂乱的思维之心慢下来，就会察觉禅修之中内在正发生的细微转变。心若慢得足够，我们甚至能看见草在生长。</w:t>
       </w:r>
     </w:p>
     <w:p>
@@ -1097,7 +1130,7 @@
         <w:rPr>
           <w:rFonts w:ascii="SimSun" w:cs="SimSun" w:eastAsia="SimSun" w:hAnsi="SimSun"/>
         </w:rPr>
-        <w:t xml:space="preserve">只要拨出一点时间学习佛教哲理，就能获得一个宏观的视野：我们为什么禅修、要去往哪里、会遇到哪些障碍，以及最终抵达是怎样一番包罗万象的境界。学习的重要性，再怎么强调都不为过。</w:t>
+        <w:t xml:space="preserve">只要拨出一点时间学习佛教哲理，就能获得一个宏观的视野：我们为什么禅修、要去往哪里、会遇到哪些障碍，以及最终抵达时会是怎样一番全貌。学习的重要性，再怎么强调都不为过。</w:t>
       </w:r>
     </w:p>
     <w:p>
@@ -1125,7 +1158,7 @@
         <w:rPr>
           <w:rFonts w:ascii="SimSun" w:cs="SimSun" w:eastAsia="SimSun" w:hAnsi="SimSun"/>
         </w:rPr>
-        <w:t xml:space="preserve">每个人生来都是天生的禅修者。这不是我随口说的话，因为佛陀本人就说过那句著名的话：“一切众生皆有佛性，只因妄想执着而不能证得。”人们常常拖着不肯开始禅修，理由是不知道该怎么修。可是，尽管我们以为自己不会，只要一试便会发现其实我们很懂。人们常把心形容为“自明”（self-illuminating）的，意思是只要我们肯试，它自会向我们显露自身。我们要做的，只是到场。</w:t>
+        <w:t xml:space="preserve">每个人都是天生的禅修者。这不是我随口说的话，因为佛陀本人就说过那句著名的话：“一切众生皆有佛性，只因妄想执着而不能证得。”人们常常拖着不肯开始禅修，理由是不知道该怎么修。可是，尽管我们以为自己不会，只要一试便会发现其实我们很懂。人们常把心形容为“自明”（self-illuminating）的，意思是只要我们肯试，它自会向我们显露自身。我们要做的，只是到场。</w:t>
       </w:r>
     </w:p>
     <w:p>
@@ -1185,7 +1218,7 @@
         <w:rPr>
           <w:rFonts w:ascii="SimSun" w:cs="SimSun" w:eastAsia="SimSun" w:hAnsi="SimSun"/>
         </w:rPr>
-        <w:t xml:space="preserve">当我们相信自己本来就具备条件，并照此去做，我们就赋予了自己力量。禅修的方法是助缘，能加快这个过程；之所以发展出这些方法，是为了帮我们从烦恼情绪、贪、瞋以及其他拖累我们的障碍中脱身。在学会安静地坐着、观看心的显现而不加干预之后，才是引入禅修方法的时候。当我们发现自己开始期待着在约定的时间去到禅修的地方坐下来，就该考虑挑选一种禅修方法，把它引入自己的修行了。</w:t>
+        <w:t xml:space="preserve">当我们相信自己本来就具备条件，并照此去做，我们就赋予了自己力量。禅修的方法是助力，能加快这个过程；之所以发展出这些方法，是为了帮我们从烦恼情绪、贪、瞋以及其他拖累我们的障碍中脱身。在学会安静地坐着、观看心的显现而不加干预之后，才是引入禅修方法的时候。当我们发现自己开始期待着在约定的时间去到禅修的地方坐下来，就该考虑挑选一种禅修方法，把它引入自己的修行了。</w:t>
       </w:r>
     </w:p>
     <w:p>
@@ -1225,7 +1258,7 @@
         <w:rPr>
           <w:rFonts w:ascii="SimSun" w:cs="SimSun" w:eastAsia="SimSun" w:hAnsi="SimSun"/>
         </w:rPr>
-        <w:t xml:space="preserve">禅修是一种心态。它是不安住于任何特定对象的全然觉知。禅修是醒觉的、开放领受的，感到全然投入，却说不出究竟是什么让我们如此投入。禅修是看见心的本性即是圆满的寂静，不论周遭一切如何环绕运转。禅修是认同于那个“能觉”，而不是认同于所觉之境——无论是物质的还是心理的。禅修是在千差万别中彻底自由。禅修是一颗不执着任何事物、也不排拒任何事物的心。</w:t>
+        <w:t xml:space="preserve">禅修是一种心态。它是不安住于任何特定对象的全然觉知。禅修是醒觉的、开放领受的，感到全然投入，却说不出究竟是什么让我们如此投入。禅修是看见心性即是圆满的寂静，不论周遭一切如何环绕运转。禅修是认同于那个“能觉”，而不是认同于所觉之境——无论是物质的还是心理的。禅修是在千差万别中彻底自由。禅修是一颗不执着任何事物、也不排拒任何事物的心。</w:t>
       </w:r>
     </w:p>
     <w:p>
@@ -1249,7 +1282,7 @@
         <w:rPr>
           <w:rFonts w:ascii="SimSun" w:cs="SimSun" w:eastAsia="SimSun" w:hAnsi="SimSun"/>
         </w:rPr>
-        <w:t xml:space="preserve">当然，这种极其平等、毫不动摇的心态看起来并不现实。我们甚至会以为，只有最冷漠无情的人才会对生命中的二元对立无动于衷。但禅修不是去款待好念头、屏蔽坏念头，而是放下一切评判。在我们心念的地貌被推平——不掺任何意见、价值判断、后天的熏习、个人经历，尤其是种种信念——之前，我们对这片地貌的评判对我们毫无价值。</w:t>
+        <w:t xml:space="preserve">当然，这种极其平等、毫不动摇的心态看起来并不现实。我们甚至会以为，只有最冷漠无情的人才会对生命中的二元对立无动于衷。但禅修不是去款待好念头、屏蔽坏念头，而是放下一切评判。在我们心念的地貌被推平——不掺任何意见、价值观、后天的熏习、个人经历，尤其是种种信念——之前，我们对这片地貌的评判对我们毫无价值。</w:t>
       </w:r>
     </w:p>
     <w:p>
@@ -1273,19 +1306,19 @@
         <w:rPr>
           <w:rFonts w:ascii="SimSun" w:cs="SimSun" w:eastAsia="SimSun" w:hAnsi="SimSun"/>
         </w:rPr>
-        <w:t xml:space="preserve">身为未开悟的凡夫，我们一刻不停地忙着谋求自己的安乐，几乎注意不到：自己的安乐其实依赖于他人的安乐。虽然我们的意识是同一个，用法却各不相同。只要不失去那份根本一体的感受，这本无妨；可一旦忘记它，把个体性当真，我们之间就制造出了分裂。</w:t>
-      </w:r>
-    </w:p>
-    <w:p>
-      <w:pPr>
-        <w:spacing w:after="120" w:line="340"/>
-        <w:ind w:firstLine="480"/>
-      </w:pPr>
-      <w:r>
-        <w:rPr>
-          <w:rFonts w:ascii="SimSun" w:cs="SimSun" w:eastAsia="SimSun" w:hAnsi="SimSun"/>
-        </w:rPr>
-        <w:t xml:space="preserve">如果我们能够理解那使我们作为一个个体活着的意识，并认同于它，而不是认同于我们用它塑造出来的自己，那么我们就朝着实现禅修的目的迈出了一大步。所有心得明澈的人都普遍描述过同一个特征：对同类怀有爱与温暖，而且完全平等无别。不受偏好束缚的爱，映现出一种跨越一切界线的仁厚，它能赋予人力量。觉醒所特有的那种充满力量的感受，正是让历代圣者能够不知疲倦地为人类工作的原因。虽然觉醒的人未必个个名声在外，但在我们中间有许多隐匿的圣者，他们同样分享着证悟所伴随的那份深邃体验。</w:t>
+        <w:t xml:space="preserve">身为未开悟的凡夫，我们一刻不停地忙着谋求自己的安乐，几乎注意不到：自己的安乐其实依赖于他人的安乐。虽然我们的意识是同一个，用法却各不相同。只要不失去那份根本一体的感受，这本无妨；可一旦忘记它，把个体性当真，在彼此之间制造分裂，那就不妥了。</w:t>
+      </w:r>
+    </w:p>
+    <w:p>
+      <w:pPr>
+        <w:spacing w:after="120" w:line="340"/>
+        <w:ind w:firstLine="480"/>
+      </w:pPr>
+      <w:r>
+        <w:rPr>
+          <w:rFonts w:ascii="SimSun" w:cs="SimSun" w:eastAsia="SimSun" w:hAnsi="SimSun"/>
+        </w:rPr>
+        <w:t xml:space="preserve">如果我们能够理解那使我们作为一个个体活着的意识，并认同于它，而不是认同于我们用它塑造出来的自己，那么我们就朝着实现禅修的目的迈出了一大步。心已明澈的人所普遍描述的特征之一，是对同类怀有爱与温暖，而且完全平等无别。不受偏好束缚的爱，映现出一种跨越一切界线的仁厚，它能赋予人力量。觉醒所特有的那种充满力量的感受，正是让历代圣者能够不知疲倦地为人类工作的原因。虽然觉醒的人未必个个名声在外，但在我们中间有许多隐匿的圣者，他们同样分享着证悟所伴随的那份深邃体验。</w:t>
       </w:r>
     </w:p>
     <w:p>
@@ -1321,7 +1354,7 @@
         <w:rPr>
           <w:rFonts w:ascii="SimSun" w:cs="SimSun" w:eastAsia="SimSun" w:hAnsi="SimSun"/>
         </w:rPr>
-        <w:t xml:space="preserve">人们会想：“我算什么人，也配禅修？”仿佛禅修只属于少数精英。可这就像一个穷人在机会面前问：“我算什么人，也配变富？”禅修之所以令人却步，是因为我们不了解它，也因为它是一种与众不同的训练。然而，真正懂得禅修的人都说它是一种“自然”的心境——本来常在，只是不知怎么从我们的觉知里失落了。问“我算什么人，也配禅修？”和问“我算什么人，竟能不禅修？”，差别只在心态。消极的心态对我们毫无益处；若发现自己有这样的心态，我们可以通过认清它对自己的损害而改变它。做法就是静静坐着，观察自己的心态。对负面心态只是赤裸地觉知，不评判、也不试图驱赶，久而久之它们自会消融。</w:t>
+        <w:t xml:space="preserve">人们会想：“我算什么人，也配禅修？”仿佛禅修只属于少数精英。可这就像一个穷人在机会面前问：“我算什么人，也配变富？”禅修之所以令人却步，是因为我们不了解它，也因为它是一种与众不同的训练。然而，真正懂得禅修的人都说它是一种“自然”的心境——本来常在，只是不知怎么从我们的觉知里失落了。问“我算什么人，也配禅修？”和问“我算什么人，又凭什么不禅修？”，差别只在心态。消极的心态对我们毫无益处；若发现自己有这样的心态，我们可以通过认清它对自己的损害而改变它。做法就是静静坐着，观察自己的心态。对负面心态只是赤裸地觉知，不评判、也不试图驱赶，久而久之它们自会消融。</w:t>
       </w:r>
     </w:p>
     <w:p>
@@ -1349,7 +1382,7 @@
         <w:rPr>
           <w:rFonts w:ascii="SimSun" w:cs="SimSun" w:eastAsia="SimSun" w:hAnsi="SimSun"/>
         </w:rPr>
-        <w:t xml:space="preserve">假定“我本已开悟”，其实是一种令人谦卑的态度，因为它要求我们必须成长到足以撑起这个身份。以“已然开悟”的态度踏上修行之路，是佛陀时代之后才出现的发展。这与玛丽亚·蒙台梭利（Maria Montessori）主张把幼儿当作成熟大人来养育的观点颇为相似。她不用儿语，不做夸张的表情，不逗弄孩子，而是以成人的方式与他们交往。这种方式促使孩子从很小的年纪——两岁起——就认真看待自己。同样，佛教后期的发展，尤其是藏传各派，教导说：既然我们本来就是觉悟的，就该反问自己为什么认不出这一点。这与佛陀时代通行的早期方法形成鲜明对照：那时强调的是道德戒律，是断除烦恼、清除通往清净的障碍，好让开悟之光在我们心中破晓。</w:t>
+        <w:t xml:space="preserve">假定“我本已开悟”，其实是一种令人谦卑的态度，因为它要求我们必须成长到足以撑起这个身份。以“已然开悟”的态度踏上修行之路，是佛陀时代之后才出现的发展。这与玛丽亚·蒙台梭利（Maria Montessori）主张把幼儿当作成熟大人来养育的观点颇为相似。她不用儿语，不做夸张的表情，不逗弄孩子，而是以成人的方式与他们交往。这种方式促使孩子从很小的年纪——两岁起——就认真看待自己。同样，佛教后期的发展，尤其是藏传各派，教导说：既然我们本来就是开悟的，就该反问自己为什么认不出这一点。这与佛陀时代通行的早期方法形成鲜明对照：那时强调的是道德戒律，是断除烦恼、清除通往清净的障碍，好让开悟之光在我们心中破晓。</w:t>
       </w:r>
     </w:p>
     <w:p>
@@ -1385,7 +1418,7 @@
         <w:rPr>
           <w:rFonts w:ascii="SimSun" w:cs="SimSun" w:eastAsia="SimSun" w:hAnsi="SimSun"/>
         </w:rPr>
-        <w:t xml:space="preserve">藏传佛教对待禅修的态度，与养育祖古的方式如出一辙。我们不是一上来就盯着自己的不净、烦恼、障碍等等，而是先把自己看作一位已经觉悟的存在。其用意在于：与其耗上许多年苦苦净化自己，不如直接从觉悟者的角度起步。当然，这好比把王冠往头上一戴就以为自己是国王；我们迟早会明白：做国王不止于戴王冠，开悟也不止于自以为开悟。尽管有这个问题，人们仍认为：只要认定我们的平常心就是觉悟的心，并当它本来如此而依之修行，终有一天它真会如此，而一切障碍都会作为这份证悟的副产品自行消融。</w:t>
+        <w:t xml:space="preserve">藏传佛教对待禅修的态度，与养育祖古的方式相仿。我们不是一上来就盯着自己的不净、烦恼、障碍等等，而是先把自己看作一位已经觉悟的存在。其用意在于：与其耗上许多年苦苦净化自己，不如直接从觉悟者的角度起步。当然，这好比把王冠往头上一戴就以为自己是国王；我们迟早会明白：做国王不止于戴王冠，开悟也不止于自以为开悟。尽管有这个问题，人们仍认为：只要认定我们的平常心就是觉悟的心，并当它本来如此而依之修行，终有一天它真会如此，而一切障碍都会作为这份证悟的副产品自行消融。</w:t>
       </w:r>
     </w:p>
     <w:p>
@@ -1409,7 +1442,7 @@
         <w:rPr>
           <w:rFonts w:ascii="SimSun" w:cs="SimSun" w:eastAsia="SimSun" w:hAnsi="SimSun"/>
         </w:rPr>
-        <w:t xml:space="preserve">脚下的地毯被抽走之后，年幼的祖古终会一举抖落所有牵绊；同样，一开始就相信自己是圆满觉悟者的禅修人，等到功夫成熟时，通往那份证悟的一切障碍也会在顷刻间一齐脱落。对修这一法门的人来说，结果与更传统的方法并无二致，只是被认为更为殊胜、更为快捷。这两种思路有时被称作“顿”与“渐”：前者一般被视为上根利器所修，后者则适合那些一想到打坐就心生怯意的人。</w:t>
+        <w:t xml:space="preserve">脚下的地毯被抽走之后，年幼的祖古终会一举抖落所有牵绊；同样，一开始就相信自己已经圆满觉悟的禅修者，等到功夫成熟时，通往那份证悟的一切障碍也会在顷刻间一齐脱落。对修这一法门的人来说，结果与更传统的方法并无二致，只是被认为更为殊胜、更为快捷。这两种思路有时被称作“顿”与“渐”：前者有时被视为上根利器所修，后者则适合那些一想到禅修就心生怯意的人。</w:t>
       </w:r>
     </w:p>
     <w:p>
@@ -1609,31 +1642,31 @@
         <w:rPr>
           <w:rFonts w:ascii="SimSun" w:cs="SimSun" w:eastAsia="SimSun" w:hAnsi="SimSun"/>
         </w:rPr>
-        <w:t xml:space="preserve">不耕地、不浇水，什么也长不出来。一粒微尘般的种子，用心照料，也能长成我们可以坐在底下乘凉的大树。倘若觉悟的种子不在我们心里，我们就不会有这份倾向，去寻求比常人所知更深的安宁。事实是，每一个人都隐约感到自身之内有某种存在，并本能地希望与之合一，因为唯有认识自己，才能彻底止住这份干渴。</w:t>
-      </w:r>
-    </w:p>
-    <w:p>
-      <w:pPr>
-        <w:spacing w:after="120" w:line="340"/>
-        <w:ind w:firstLine="480"/>
-      </w:pPr>
-      <w:r>
-        <w:rPr>
-          <w:rFonts w:ascii="SimSun" w:cs="SimSun" w:eastAsia="SimSun" w:hAnsi="SimSun"/>
-        </w:rPr>
-        <w:t xml:space="preserve">在认识自己的努力中，我们被外境的诱惑搅得心烦意乱——那些诱惑似乎越来越有吸引力，像是在跟我们向内回转的努力较劲。当我们问着“我是谁”，却像一只在西瓜外面爬来爬去的蚂蚁那样无从下口时，平日里的那些享乐显得越来越诱人，也就不足为奇了。这方面有专门的著述，每个修禅的人都会碰上。这个问题一句话就能概括：“道高一尺，魔高一丈。”</w:t>
-      </w:r>
-    </w:p>
-    <w:p>
-      <w:pPr>
-        <w:spacing w:after="120" w:line="340"/>
-        <w:ind w:firstLine="480"/>
-      </w:pPr>
-      <w:r>
-        <w:rPr>
-          <w:rFonts w:ascii="SimSun" w:cs="SimSun" w:eastAsia="SimSun" w:hAnsi="SimSun"/>
-        </w:rPr>
-        <w:t xml:space="preserve">我们必须把自己抓住，问问自己到底想要什么。这件事可以在“打坐”的时段里做。“我想要什么？”是一句极好的咒语。眼看着那些争抢我们注意力的东西一件件浮现——物件、野心、食物、人、想去的地方，以及一切想象得到的好奇——真是发人深省；但我们必须一直问下去，直到这股洪流细成涓滴。然后再问：“我是谁？”那个想要这些东西的“我”是谁？“离开这些东西，我又是谁？”</w:t>
+        <w:t xml:space="preserve">不耕地、不浇水，什么也长不出来。一粒微尘般的种子，用心照料，也能长成我们可以坐在底下乘凉的大树。倘若开悟的种子不在我们心里，我们就不会有这份倾向，去寻求比常人所知更深的安宁。事实是，每一个人都隐约感到自身之内有某种存在，并本能地希望与之合一，因为唯有认识自己，才能彻底止住这份干渴。</w:t>
+      </w:r>
+    </w:p>
+    <w:p>
+      <w:pPr>
+        <w:spacing w:after="120" w:line="340"/>
+        <w:ind w:firstLine="480"/>
+      </w:pPr>
+      <w:r>
+        <w:rPr>
+          <w:rFonts w:ascii="SimSun" w:cs="SimSun" w:eastAsia="SimSun" w:hAnsi="SimSun"/>
+        </w:rPr>
+        <w:t xml:space="preserve">在认识自己的努力中，我们被外境的诱惑搅得心神迷乱——那些诱惑似乎越来越有吸引力，像是在跟我们向内回转的努力较劲。当我们问着“我是谁”，却像一只在西瓜外面爬来爬去的蚂蚁那样无从下口时，平日里的那些享乐显得越来越诱人，也就不足为奇了。这方面有专门的著述，每个禅修者都会碰上。这个问题一句话就能概括：“道高一尺，魔高一丈。”</w:t>
+      </w:r>
+    </w:p>
+    <w:p>
+      <w:pPr>
+        <w:spacing w:after="120" w:line="340"/>
+        <w:ind w:firstLine="480"/>
+      </w:pPr>
+      <w:r>
+        <w:rPr>
+          <w:rFonts w:ascii="SimSun" w:cs="SimSun" w:eastAsia="SimSun" w:hAnsi="SimSun"/>
+        </w:rPr>
+        <w:t xml:space="preserve">我们必须把持住自己，问问自己到底想要什么。这件事可以在“打坐”的时段里做。“我想要什么？”是一句极好的咒语。眼看着那些争抢我们注意力的东西源源不断、一件件浮现——物件、野心、食物、人、想去的地方，以及一切想象得到的新奇玩意儿——真是发人深省；但我们必须一直问下去，直到这股洪流细成涓滴。然后再问：“我是谁？”那个想要这些东西的“我”是谁？“离开这些东西，我又是谁？”</w:t>
       </w:r>
     </w:p>
     <w:p>
@@ -1657,7 +1690,7 @@
         <w:rPr>
           <w:rFonts w:ascii="SimSun" w:cs="SimSun" w:eastAsia="SimSun" w:hAnsi="SimSun"/>
         </w:rPr>
-        <w:t xml:space="preserve">显然，自我参究是没有“答案”的。之所以没有答案，是因为前面说过，答案就在问题之中，两者谁也离不开谁而独立存在。参究的心里那个问号，也许要过很久才会变成一块磁石，把我们吸进去；但这一天终会到来，因为那个问号正是觉悟的种子，只要我们把注意力转向它，它就会生长。</w:t>
+        <w:t xml:space="preserve">显然，自我参究是没有“答案”的。之所以没有答案，是因为前面说过，答案就在问题之中，两者都不能离开对方而独立存在。参究的心里那个问号，也许要过很久才会变成一块磁石，把我们吸进去；但这一天终会到来，因为那个问号正是开悟的种子，只要我们把注意力转向它，它就会生长。</w:t>
       </w:r>
     </w:p>
     <w:p>
@@ -1750,19 +1783,19 @@
         <w:rPr>
           <w:rFonts w:ascii="SimSun" w:cs="SimSun" w:eastAsia="SimSun" w:hAnsi="SimSun"/>
         </w:rPr>
-        <w:t xml:space="preserve">我们不必把轮盘转到倾家荡产。聪明的赌徒进赌场时，只带自己输得起的钱。时间就像金钱，合理分配，就能避开成瘾，把省下的时间拿去把蒲团坐热。只要我们控制得住，种种娱乐在生活中仍有它们的位置；但必须认清：它们之所以还算享受，正是因为我们控制得住它们。</w:t>
-      </w:r>
-    </w:p>
-    <w:p>
-      <w:pPr>
-        <w:spacing w:after="120" w:line="340"/>
-        <w:ind w:firstLine="480"/>
-      </w:pPr>
-      <w:r>
-        <w:rPr>
-          <w:rFonts w:ascii="SimSun" w:cs="SimSun" w:eastAsia="SimSun" w:hAnsi="SimSun"/>
-        </w:rPr>
-        <w:t xml:space="preserve">迷失自己不是什么乐事。世间的快乐我们几乎都尝过了，却仍在追逐快乐，从不问一声：究竟是谁在感受快乐？如果我们所求的快乐本来不在我们之内，我们决不可能在所谓的乐境上感受到它；因为快乐若真在外境之中，同一个外境就该让所有人都快乐。事实并非如此：我喜欢的你未必喜欢，你喜欢的我也未必喜欢。我们的心和它的想象造出一个幻象，而当我们以为外物能使自己快乐时，就上了这个当。快乐是心的本性，而心非物质，殊妙而微细；外物则粗重、属于物质，而且虚诳不实。心的本性即是快乐，外物之中并无快乐。</w:t>
+        <w:t xml:space="preserve">我们不必把轮盘转到倾家荡产。聪明的赌徒进赌场时，只带自己输得起的钱。时间就像金钱，合理分配，就能避开成瘾，把省下的时间拿去把蒲团坐热。只要我们控制得住，种种娱乐在生活中仍有它们的位置；但必须认清：只有在我们控制得住的限度内，它们才称得上享受。</w:t>
+      </w:r>
+    </w:p>
+    <w:p>
+      <w:pPr>
+        <w:spacing w:after="120" w:line="340"/>
+        <w:ind w:firstLine="480"/>
+      </w:pPr>
+      <w:r>
+        <w:rPr>
+          <w:rFonts w:ascii="SimSun" w:cs="SimSun" w:eastAsia="SimSun" w:hAnsi="SimSun"/>
+        </w:rPr>
+        <w:t xml:space="preserve">迷失自己不是什么乐事。世间的快乐我们几乎都尝过了，却仍在追逐快乐，从不问一声：究竟是谁在感受快乐？如果我们所求的快乐本来不在我们之内，我们决不可能在所谓的乐境上感受到它；因为快乐若真在外境之中，同一个外境就该让所有人都快乐。事实并非如此：我喜欢的你未必喜欢，你喜欢的我也未必喜欢。我们的心和它的想象造出一个幻象，而当我们以为外物能使自己快乐时，就上了这个当。快乐即是心性，而心非物质，殊妙而微细；外物则粗重、属于物质，而且虚诳不实。心性即是快乐，外物之中并无快乐。</w:t>
       </w:r>
     </w:p>
     <w:p>
@@ -1882,7 +1915,7 @@
         <w:rPr>
           <w:rFonts w:ascii="SimSun" w:cs="SimSun" w:eastAsia="SimSun" w:hAnsi="SimSun"/>
         </w:rPr>
-        <w:t xml:space="preserve">富人里有聪明的，也有愚蠢的；有快活的，也有可怜的。是什么造成这种差别，稍加想象便知。每个人，无论贫富，都知道自己的界限在哪里，知道该在什么分寸内行事。拥有多少并不要紧。总有一种行事的方式能培养出出离的心，照着那个分寸去做，就能加深我们与身边人的联系。我们与家人朋友之间的纽带有多牢固，我们能否不急着说上一千句话而只是聆听，能否在他们需要时守在身旁，能否在他们顺遂时分享他们的喜悦，能否有求必应地给予、并大方地接受别人所给的，能否一同欢笑、一同悲伤——这一切，若是纵容自己的每一个物质幻想，就都做不到。</w:t>
+        <w:t xml:space="preserve">富人里有聪明的，也有愚蠢的；有快活的，也有可怜的。是什么造成这种差别，稍加想象便知。每个人，无论贫富，都知道自己的界限在哪里，知道该在什么分寸内行事。拥有多少并不要紧。总有一种行事的方式能培养出离之心，照着那个分寸去做，就能加深我们与身边人的联系。我们与家人朋友之间的纽带有多牢固，我们能否不急着说上一千句话而只是聆听，能否在他们需要时守在身旁，能否在他们顺遂时分享他们的喜悦，能否有求必应地给予、并大方地接受别人所给的，能否一同欢笑、一同悲伤——这一切，若是纵容自己的每一个物质幻想，就都做不到。</w:t>
       </w:r>
     </w:p>
     <w:p>
@@ -2077,19 +2110,19 @@
         <w:rPr>
           <w:rFonts w:ascii="SimSun" w:cs="SimSun" w:eastAsia="SimSun" w:hAnsi="SimSun"/>
         </w:rPr>
-        <w:t xml:space="preserve">每个人既是自己最好的朋友，也是自己最大的敌人。受了什么影响，有时会让人分不清这两者。好的习惯难以维持，坏的习惯难以打破。一旦积起了良性的势头，就要赶紧扶持，别让它散掉。一旦误入歧途而出现脱身的机会，一刻也不要拖延。路上岔口很多，有一位熟悉地形的朋友胜过一张地图；只可惜地图多，向导少。</w:t>
-      </w:r>
-    </w:p>
-    <w:p>
-      <w:pPr>
-        <w:spacing w:after="120" w:line="340"/>
-        <w:ind w:firstLine="480"/>
-      </w:pPr>
-      <w:r>
-        <w:rPr>
-          <w:rFonts w:ascii="SimSun" w:cs="SimSun" w:eastAsia="SimSun" w:hAnsi="SimSun"/>
-        </w:rPr>
-        <w:t xml:space="preserve">作为修行人，我们手上有一项资源，就是开悟祖师们的精彩论释，它们能除去经典那种令人望而生畏的艰深。这些论释有古代的，也有当代的。研读经典能让我们避免许多若不研读、不熟悉就会犯的错误。这些论释好比旅人的地图，出发前用心研读，便能免去失足与走错。佛陀宣说了许多经典，当时听闻或后来研习这些经典的人，自己也成了开悟的祖师。要通达经义，我们应当依止这些祖师，因为他们会体贴地依着我们的需要，把义理一层层打开。</w:t>
+        <w:t xml:space="preserve">每个人都可能是自己最好的朋友，也可能是自己最大的敌人。随所受影响的不同，这两者有时很难分清。好的习惯难以维持，坏的习惯难以打破。一旦积起了良性的势头，就要赶紧扶持，别让它散掉。一旦误入歧途而出现脱身的机会，一刻也不要拖延。路上岔口很多，有一位熟悉地形的朋友胜过一张地图；只可惜地图多，向导少。</w:t>
+      </w:r>
+    </w:p>
+    <w:p>
+      <w:pPr>
+        <w:spacing w:after="120" w:line="340"/>
+        <w:ind w:firstLine="480"/>
+      </w:pPr>
+      <w:r>
+        <w:rPr>
+          <w:rFonts w:ascii="SimSun" w:cs="SimSun" w:eastAsia="SimSun" w:hAnsi="SimSun"/>
+        </w:rPr>
+        <w:t xml:space="preserve">作为修行人，我们手上有一项资源，就是开悟大师们的精彩论释，它们能除去经典那种令人望而生畏的艰深。这些论释有古代的，也有当代的。研读经典能让我们避免许多若不研读、不熟悉就会犯的错误。这些论释好比旅人的地图，出发前用心研读，便能免去失足与走错。佛陀宣说了许多经典，当时听闻或后来研习这些经典的人，自己也成了开悟的大师。要通达经义，我们应当求教于这些大师，因为他们会体贴地依着我们的需要，把义理一层层打开。</w:t>
       </w:r>
     </w:p>
     <w:p>
@@ -2113,7 +2146,7 @@
         <w:rPr>
           <w:rFonts w:ascii="SimSun" w:cs="SimSun" w:eastAsia="SimSun" w:hAnsi="SimSun"/>
         </w:rPr>
-        <w:t xml:space="preserve">事实是，如果我们知道自己在犯错，也就知道错在哪里，否则根本不会把错误认作错误。我们常常对自己缺乏耐心，一撞上自己亲手筑起的墙就急躁沮丧。但凡是我们自己盖起来的，就一定拆得掉；牢记这一点，我们就有足够的信心与耐心去拆除障碍。伏在上师肩头哭一场，或许有助于我们鼓起所需的力气和自信；可是自己盖的还得自己拆。上师纵然万般想帮我们，一个无可回避的事实是：自己的业必须自己承担，这一点永远不会改变。他可以传授盖与拆的诀窍，但搬砖的终究是我们自己的手。</w:t>
+        <w:t xml:space="preserve">事实是，如果我们知道自己在犯错，也就知道自己为什么会犯，否则根本不会把错误认作错误。我们常常对自己缺乏耐心，一撞上自己亲手筑起的墙就急躁沮丧。但凡是我们自己盖起来的，就一定拆得掉；牢记这一点，我们就有足够的信心与耐心去拆除障碍。伏在上师肩头哭一场，或许有助于我们鼓起所需的力气和自信；可是自己盖的还得自己拆。上师纵然万般想帮我们，一个无可回避的事实是：自己的业必须自己承担，这一点永远不会改变。他可以传授盖与拆的诀窍，但搬砖的终究是我们自己的手。</w:t>
       </w:r>
     </w:p>
     <w:p>
@@ -2137,7 +2170,7 @@
         <w:rPr>
           <w:rFonts w:ascii="SimSun" w:cs="SimSun" w:eastAsia="SimSun" w:hAnsi="SimSun"/>
         </w:rPr>
-        <w:t xml:space="preserve">找到一位善知识、蒙他摄受，固然是最大的福分，但这并不抹杀另一个事实：只要留心别人对我们说的话，就会发现不只家人、朋友、子女，连泛泛之交也会说出有智慧的话——或许无心，或许有意——而这些话未尝没有转变我们、照亮前路的力量。我们彼此相连；若把每个人都当作自己的老师，就该以好学生的样子来证明这一点，因为连普通人身上都学不到东西，从高人那里就更学不到了。</w:t>
+        <w:t xml:space="preserve">找到一位善知识、蒙他摄受，固然是最大的福分，但这并不抹杀另一个事实：只要留心别人对我们说的话，就会发现不只家人、朋友、子女，连泛泛之交也会说出有智慧的话——或许无心，或许有意——而这些话未尝没有转变我们、照亮前路的力量。我们彼此相连；若把每个人都当作自己的老师，便能以做个好学生来证明这一点，因为连普通人身上都学不到东西，从高人那里就更学不到了。</w:t>
       </w:r>
     </w:p>
     <w:p>
@@ -2161,7 +2194,7 @@
         <w:rPr>
           <w:rFonts w:ascii="SimSun" w:cs="SimSun" w:eastAsia="SimSun" w:hAnsi="SimSun"/>
         </w:rPr>
-        <w:t xml:space="preserve">即使身处社会之中，也可能把佛法修成把自己与他人隔绝起来，但这是错的。我们的修行应当心量开阔、态度谦下，认清启发随时可能出现，而且往往来自最想不到的地方。若不谦虚、不警醒，宝贵的教益就会从眼前溜走。</w:t>
+        <w:t xml:space="preserve">即使身处社会之中，修持佛法的方式也可能让自己与他人隔绝开来，但这是错的。我们的修行应当心量开阔、态度谦下，认清启发随时可能出现，而且往往来自最想不到的地方。若不谦虚、不警醒，宝贵的教益就会从眼前溜走。</w:t>
       </w:r>
     </w:p>
     <w:p>
@@ -2201,7 +2234,7 @@
         <w:rPr>
           <w:rFonts w:ascii="SimSun" w:cs="SimSun" w:eastAsia="SimSun" w:hAnsi="SimSun"/>
         </w:rPr>
-        <w:t xml:space="preserve">我们心里那个总想要点什么的自我，并不是我们的本来面目。我们可以克制自己，不去攫取眼前所献上的东西，从而招感更为殊胜的馈赠。抵御诱惑，不过是对自身价值的一份精明。若能从那些显而易见的满足之源转身离开，我们也许会招来好得多的供养。除非我们本着“真理在内”的信念而行，否则真理永远只会显现为外在之物。一切想要实现真实安乐的努力，都必须从收摄外驰之心开始。</w:t>
+        <w:t xml:space="preserve">我们心里那个总想要点什么的自我，并不是我们的本来面目。我们可以克制自己，不去攫取眼前所献上的东西，从而招感更为殊胜的馈赠。抵御诱惑，不过是对自身价值的一份精明。若能从那些显而易见的满足之源转身离开，我们也许会招来好得多的馈赠。除非我们本着“真理在内”的信念而行，否则真理永远只会显现为外在之物。一切想要实现真实安乐的努力，都必须从收摄外驰之心开始。</w:t>
       </w:r>
     </w:p>
     <w:p>
@@ -2349,19 +2382,19 @@
         <w:rPr>
           <w:rFonts w:ascii="SimSun" w:cs="SimSun" w:eastAsia="SimSun" w:hAnsi="SimSun"/>
         </w:rPr>
-        <w:t xml:space="preserve">一旦生起禅修的意愿，我们就只需守住这一意愿，别的什么都不要多做，因为多做一分，只会给这个过程平添障碍。让意愿保持鲜活，这就够了。只要我们起一个意愿，就会觉察到它伴随着心旁的一种觉受。以第一人称代词“我”起头的意愿，尤其如此。哪怕说的是“我现在要去买东西”这样平常的话，我们也会感到心旁中段那一带有某种意识。在佛教与印度教中，这一区域被称为“识所依处”（seat of consciousness）；因此，当我们最初生起做某件事的意愿时，会觉得觉知向那里聚拢，也就不足为奇了。</w:t>
-      </w:r>
-    </w:p>
-    <w:p>
-      <w:pPr>
-        <w:spacing w:after="120" w:line="340"/>
-        <w:ind w:firstLine="480"/>
-      </w:pPr>
-      <w:r>
-        <w:rPr>
-          <w:rFonts w:ascii="SimSun" w:cs="SimSun" w:eastAsia="SimSun" w:hAnsi="SimSun"/>
-        </w:rPr>
-        <w:t xml:space="preserve">一般来说，我们的意愿总与某个将要做的行为相连；但禅修中所立的意愿，并不是从做某件事而来。它更多地与静观念头的生起与落下相关——既不加以铺陈，也不试图拦阻“坏”念头。我们平等地任由觉知生起，既不提示一个所缘，也不去发展已经现起的那个所缘，更不盼望出现更好的心境。它只是一种不设防、警醒而觉知的状态。</w:t>
+        <w:t xml:space="preserve">一旦生起禅修的意愿，我们就只需守住这一意愿，别的什么都不要多做，因为多做一分，只会给这个过程平添障碍。让意愿保持鲜活，这就够了。只要我们起一个意愿，就会觉察到它伴随着心旁的一种觉受。以第一人称代词“我”起头的意愿，尤其如此。哪怕说的是“我现在要去买东西”这样平常的话，我们也会多少意识到心旁中段那一带。在佛教与印度教中，这一区域被称为“识所依处”（seat of consciousness）；因此，当我们最初生起做某件事的意愿时，会觉得觉知向那里聚拢，也就不足为奇了。</w:t>
+      </w:r>
+    </w:p>
+    <w:p>
+      <w:pPr>
+        <w:spacing w:after="120" w:line="340"/>
+        <w:ind w:firstLine="480"/>
+      </w:pPr>
+      <w:r>
+        <w:rPr>
+          <w:rFonts w:ascii="SimSun" w:cs="SimSun" w:eastAsia="SimSun" w:hAnsi="SimSun"/>
+        </w:rPr>
+        <w:t xml:space="preserve">一般来说，我们的意愿总与某个将要做的行为相连；但禅修中所立的意愿，并不是从做某件事而来。它更多地与静观念头的生起与落下相关——既不加以铺陈，也不试图拦阻“坏”念头。我们平等地任由觉知生起，既不提出一个所缘，也不去发展已经现起的那个所缘，更不盼望出现更好的心境。它只是一种不设防、警醒而觉知的状态。</w:t>
       </w:r>
     </w:p>
     <w:p>
@@ -2397,7 +2430,7 @@
         <w:rPr>
           <w:rFonts w:ascii="SimSun" w:cs="SimSun" w:eastAsia="SimSun" w:hAnsi="SimSun"/>
         </w:rPr>
-        <w:t xml:space="preserve">起初，意愿难以稳住，我们的觉知也会时时被上述两种毛病压倒。但只要坚持下去，作为一种纯粹觉受的意愿，便会渐渐生出它自己的味道，而我们会越来越贪恋这味道。那是心脏右侧、略偏身体中线左方那一带的一种温热感。虽然我们指不出任何确凿的东西来解释它，却仍然会喜欢守着意愿在那里生出的这份奇特感受，并且信任它。这是一种没有客观目标的觉知方式，唯一的“目标”就是别让它溜走。可它偏偏一次又一次地溜走，我们也就得一次又一次地把意愿的觉受重新提起来，直到它不再溜走为止。这或许需要数月，也或许需要数年。</w:t>
+        <w:t xml:space="preserve">起初，意愿难以稳住，我们的觉知也会时时被上述两种毛病压倒。但只要坚持下去，作为一种纯粹觉受的意愿，便会渐渐生出它自己的味道，而我们会越来越渴望这味道。那是心脏右侧、略偏身体中线左方那一带的一种温热感。虽然我们指不出任何确凿的东西来解释它，却仍然会喜欢守着意愿在那里生出的这份奇特感受，并且信任它。这是一种不以任何对象为目标的觉知方式，唯一的“目标”就是别让它溜走。可它偏偏一次又一次地溜走，我们也就得一次又一次地把意愿的觉受重新提起来，直到它不再溜走为止。这或许需要数月，也或许需要数年。</w:t>
       </w:r>
     </w:p>
     <w:p>
@@ -2545,7 +2578,7 @@
         <w:rPr>
           <w:rFonts w:ascii="SimSun" w:cs="SimSun" w:eastAsia="SimSun" w:hAnsi="SimSun"/>
         </w:rPr>
-        <w:t xml:space="preserve">关于欲望，并没有一条人人适用的通则。确实有一些狂放的瑜伽士耽于种种享乐，而他们的禅定深湛、充满光明——但他们已经断除了欲望。我们大多数人注定不会以“狂慧”（Crazy Wisdom）成就者的方式示现自己的证悟，而更合乎情理地，会成为一个节制欲望却不否定欲望的人。享受不该是毫无约束的放纵。关键在于，我们必须看清自己在哪些方面欲望强烈、最易令人攀缘，并着力去节制它们。有些欲望则可以少花心思，因为我们对它们的执着与贪爱本来就轻。这里没有“一套尺码人人合身”的办法，每个人都必须对自己诚实，据此而行。做到这一点，我们生活中几乎任何一个方面，都能成为禅修的助缘。</w:t>
+        <w:t xml:space="preserve">关于欲望，并没有一条人人适用的通则。确实有一些狂放的瑜伽士耽于种种享乐，而他们的禅定深湛、充满光明——但他们已经断除了欲望。我们大多数人注定不会以“疯狂智慧”（Crazy Wisdom）成就者的方式示现自己的证悟，而更合乎情理地，会成为一个节制欲望却不否定欲望的人。享受不该是毫无约束的放纵。关键在于，我们必须看清自己在哪些方面欲望强烈、令心散乱，并着力去节制它们。有些欲望则可以少花心思，因为我们对它们的执着与贪爱本来就轻。这里没有“一套尺码人人合身”的办法，每个人都必须对自己诚实，据此而行。做到这一点，我们生活中几乎任何一个方面，都能成为禅修的助缘。</w:t>
       </w:r>
     </w:p>
     <w:p>
@@ -2597,7 +2630,7 @@
         <w:rPr>
           <w:rFonts w:ascii="SimSun" w:cs="SimSun" w:eastAsia="SimSun" w:hAnsi="SimSun"/>
         </w:rPr>
-        <w:t xml:space="preserve">我们千万不要以为，一颗能轻松适应禅修之严苛的心是可望而不可即的。我们可以培养对一切好心态与坏心态的平等心——无论它们有助于还是有违于我们求解脱的志向，都不加评判。对自己的过失与长处保持敏锐的觉知，而不夹杂指责或自负，这件事本身就是建设性的；我们不必多做什么，只需觉知到“事情本可以更好”，而不去推动它变好。对于自己的长处也是一样：若能不带执着地觉知它们，它们自会增长。正是对这一过程的信任，帮助我们认出：觉知本身即是良药，此外别无他药可用。</w:t>
+        <w:t xml:space="preserve">我们千万不要以为，一颗能轻松适应禅修之严苛的心是可望而不可即的。我们可以培养对一切好心态与坏心态的平等心——无论它们有助于还是有违于我们求解脱的志向，都不加评判。对自己的过失与长处保持敏锐的觉知，而不夹杂指责或自负，这件事本身就是建设性的；我们不必多做什么，只需觉知到“事情本可以更好”，而不去推动它变好。对于自己的长处也是一样：若能不带执着地觉知它们，它们自会增长。正是对这一过程的信任，帮助我们认出：觉知本身即是良药，此外无须他药。</w:t>
       </w:r>
     </w:p>
     <w:p>
@@ -2633,19 +2666,19 @@
         <w:rPr>
           <w:rFonts w:ascii="SimSun" w:cs="SimSun" w:eastAsia="SimSun" w:hAnsi="SimSun"/>
         </w:rPr>
-        <w:t xml:space="preserve">我们很容易发愿摧毁每一个过失、每一种破坏性的情绪，然而这份过于宏大的志愿反倒沉重得让我们再次跌回自满，向自己的弱点认输。反过来，如果我们只是培养单纯的觉知，而不承诺采取任何行动，我们便是在让那份觉知发挥它本有的功用，其结果便是嗔恚渐少、贪心渐少、破坏性的情绪渐少。</w:t>
-      </w:r>
-    </w:p>
-    <w:p>
-      <w:pPr>
-        <w:spacing w:after="120" w:line="340"/>
-        <w:ind w:firstLine="480"/>
-      </w:pPr>
-      <w:r>
-        <w:rPr>
-          <w:rFonts w:ascii="SimSun" w:cs="SimSun" w:eastAsia="SimSun" w:hAnsi="SimSun"/>
-        </w:rPr>
-        <w:t xml:space="preserve">我们对自己往往过于喜欢动手，总想像捏一团泥巴那样把自己塑造成形。可我们远不是一团柔软可塑的泥巴，而是一个个独立的个体，禀性经过一辈子的“做自己”早已根深蒂固，无论好坏。我们并非活在真空里；只要心一倾向于变好，宇宙就会围绕我们展开，来成就这份意愿。只要我们不去干预，这个过程是行得通的。</w:t>
+        <w:t xml:space="preserve">我们很容易发愿摧毁每一个过失、每一种破坏性的情绪，然而这份过于宏大的志愿反倒沉重得让我们再次跌回安于现状，向自己的弱点认输。反过来，如果我们只是培养单纯的觉知，而不承诺采取任何行动，我们便是在让那份觉知发挥它本有的功用，其结果便是嗔恚渐少、贪心渐少、破坏性的情绪渐少。</w:t>
+      </w:r>
+    </w:p>
+    <w:p>
+      <w:pPr>
+        <w:spacing w:after="120" w:line="340"/>
+        <w:ind w:firstLine="480"/>
+      </w:pPr>
+      <w:r>
+        <w:rPr>
+          <w:rFonts w:ascii="SimSun" w:cs="SimSun" w:eastAsia="SimSun" w:hAnsi="SimSun"/>
+        </w:rPr>
+        <w:t xml:space="preserve">我们对自己往往管得太多，总想像捏一团泥巴那样把自己塑造成形。可我们远不是一团柔软可塑的泥巴，而是一个个独立的个体，禀性经过一辈子的“做自己”早已根深蒂固，无论好坏。我们并非活在真空里；只要心一倾向于变好，宇宙就会围绕我们展开，来成就这份意愿。只要我们不去干预，这个过程是行得通的。</w:t>
       </w:r>
     </w:p>
     <w:p>
@@ -2709,7 +2742,7 @@
         <w:rPr>
           <w:rFonts w:ascii="SimSun" w:cs="SimSun" w:eastAsia="SimSun" w:hAnsi="SimSun"/>
         </w:rPr>
-        <w:t xml:space="preserve">我们天生就是禅修者。这个星球上，没有哪一个人的心不是一片觉悟的境地。念头之所以扰乱我们，并不是因为它们强，而是因为我们的心念现前太弱。宁静中的洞见时刻本是我们的自然状态，却极少有人学会安住在那份觉知里。学会真正“活在当下”——活在念与念之间的那一刻，并把它延展成洞见的一刻——这就是禅修。禅修中至关重要的那种“一体之感”，就是认出：一切念头都是平等的，因为它们同出一源。念头是那个本源的显现，我们却把显现误认作本源本身，并给念头安上“好”与“坏”、“嗔”与“慈”、“淫欲”与“良善”的名目，而实际上，一切念头本无二致。</w:t>
+        <w:t xml:space="preserve">我们天生就是禅修者。这个星球上，没有哪一个人的心不是一片觉悟的境地。念头之所以扰乱我们，并不是因为它们强，而是因为我们的心太弱，作不了主。宁静中的洞见时刻本是我们的自然状态，却极少有人学会安住在那份觉知里。学会真正“活在当下”——活在念与念之间的那一刻，并把它延展成洞见的一刻——这就是禅修。禅修中至关重要的那种“一体之感”，就是认出：一切念头都是平等的，因为它们同出一源。念头是那个本源的显现，我们却把显现误认作本源本身，并给念头安上“好”与“坏”、“嗔”与“慈”、“淫欲”与“良善”的名目，而实际上，一切念头本无二致。</w:t>
       </w:r>
     </w:p>
     <w:p>
@@ -2784,7 +2817,7 @@
         <w:rPr>
           <w:rFonts w:ascii="SimSun" w:cs="SimSun" w:eastAsia="SimSun" w:hAnsi="SimSun"/>
         </w:rPr>
-        <w:t xml:space="preserve">对正在发生的一切毫无觉察，并不就是那个间隙。设想一个人在暗室里看不见家具，他若因此断定屋里没有家具，那就好比一个初学禅修的人，把“对念头无所觉知”误当成“没有念头”。随着禅修功夫渐长，我们会像暗室中的那个人一样，眼睛渐渐适应了黑暗，发现原来屋里确有他先前没有注意到的家具。同样地，禅修者会逐渐觉察到：自己原以为的“没有念头”或“心里一片空白”，其实是错误禅修所造出的一种做作状态——那种禅修一心想把念头挡在外面，而不是把它们看作心中无害的家具。</w:t>
+        <w:t xml:space="preserve">对正在发生的一切毫无觉察，并不就是那个间隙。设想一个人在暗室里看不见家具，他若因此断定屋里没有家具，那就好比一个初学禅修的人，把“对念头无所觉知”误当成“没有念头”。随着禅修功夫渐长，我们会像暗室中的那个人一样，眼睛渐渐适应了黑暗，发现原来屋里确有他先前没有注意到的家具。同样地，禅修者会逐渐觉察到：自己原以为的“没有念头”或“心里一片空白”，其实是错误禅修所生的一种造作状态——那种禅修一心想把念头挡在外面，而不是把它们看作心中无害的家具。</w:t>
       </w:r>
     </w:p>
     <w:p>
@@ -2852,7 +2885,7 @@
         <w:rPr>
           <w:rFonts w:ascii="SimSun" w:cs="SimSun" w:eastAsia="SimSun" w:hAnsi="SimSun"/>
         </w:rPr>
-        <w:t xml:space="preserve">理解力的增长，来自学会向自己提出对的问题，而不是去寻找答案。无用的答案有千千万万，值得一问的问题却寥寥无几。读书当然有帮助，但唯有当那一点参究的火花深深燃起、让我们片刻都放不下时，读书才会引向寂静。重要的是，这份参究之心是广泛用功的副产品，绝不是我们刻意搜寻就能得来的东西。它从我们自身有机的努力中生发出来，而且往往被形容为不期而至。</w:t>
+        <w:t xml:space="preserve">理解力的增长，来自学会向自己提出对的问题，而不是去寻找答案。无用的答案有千千万万，值得一问的问题却寥寥无几。读书当然有帮助，但唯有当那一点参究的火花深深燃起、让我们片刻都放不下时，读书才会引向寂静。重要的是，这份参究之心是广泛用功的副产品，绝不是我们刻意搜寻就能得来的东西。它从我们自然而然的用功中生发出来，而且往往被形容为不期而至。</w:t>
       </w:r>
     </w:p>
     <w:p>
@@ -2937,24 +2970,24 @@
         <w:rPr>
           <w:rFonts w:ascii="SimSun" w:cs="SimSun" w:eastAsia="SimSun" w:hAnsi="SimSun"/>
         </w:rPr>
-        <w:t xml:space="preserve">呼吸离我们太近，人类或许因此低估了它作为证悟利器的能力；再加上各种调息法门都不能速见成效。对于那些凭着心念的现前与直觉去探究气息运行，并且（这一点尤为要紧）在数月甚至数年不见成效的情况下始终守住它、直至证得觉照的人，我恭敬顶礼。想到最早探索调息之道的先驱需要何等的毅力，才发现这件一直就在鼻子底下的事，这实在是非凡的贡献。</w:t>
-      </w:r>
-    </w:p>
-    <w:p>
-      <w:pPr>
-        <w:spacing w:after="120" w:line="340"/>
-      </w:pPr>
-    </w:p>
-    <w:p>
-      <w:pPr>
-        <w:spacing w:after="120" w:line="340"/>
-        <w:ind w:firstLine="480"/>
-      </w:pPr>
-      <w:r>
-        <w:rPr>
-          <w:rFonts w:ascii="SimSun" w:cs="SimSun" w:eastAsia="SimSun" w:hAnsi="SimSun"/>
-        </w:rPr>
-        <w:t xml:space="preserve">有古代仙人（rishi）的智慧为我们指路，我们才能明白：极其简单的禅修方法，也能真正带来解脱。</w:t>
+        <w:t xml:space="preserve">呼吸离我们太近，人类或许因此低估了它作为证悟利器的能力；再加上各种调息法门都不能速见成效。对于那些凭着清明的心智与直觉去探究气息运行，并且（这一点尤为要紧）在数月甚至数年不见成效的情况下始终守住它、直至证得觉照的人，我恭敬顶礼。想到最早探索调息之道的先驱需要何等的毅力，才发现这件一直就在鼻子底下的事，这实在是非凡的贡献。</w:t>
+      </w:r>
+    </w:p>
+    <w:p>
+      <w:pPr>
+        <w:spacing w:after="120" w:line="340"/>
+      </w:pPr>
+    </w:p>
+    <w:p>
+      <w:pPr>
+        <w:spacing w:after="120" w:line="340"/>
+        <w:ind w:firstLine="480"/>
+      </w:pPr>
+      <w:r>
+        <w:rPr>
+          <w:rFonts w:ascii="SimSun" w:cs="SimSun" w:eastAsia="SimSun" w:hAnsi="SimSun"/>
+        </w:rPr>
+        <w:t xml:space="preserve">有古代仙人（rishi）的智慧为我们指路，我们便能明白：极其简单的禅修方法，也能真正带来解脱。</w:t>
       </w:r>
     </w:p>
     <w:p>
@@ -3030,7 +3063,7 @@
         <w:rPr>
           <w:rFonts w:ascii="SimSun" w:cs="SimSun" w:eastAsia="SimSun" w:hAnsi="SimSun"/>
         </w:rPr>
-        <w:t xml:space="preserve">一旦明白种种念头都是自心的显现，我们就会渐渐不再留意念头是什么，而更留意它们从何而来。念头的源头，与流出的念头截然不同。倘若能与那源头合一，我们便超越了善与恶，进入自然觉知的状态。</w:t>
+        <w:t xml:space="preserve">一旦明白种种念头都是自心的显现，我们就会渐渐少去留意念头是什么，而更多地留意它们从何而来。念头的源头，与流出的念头截然不同。倘若能与那源头合一，我们便超越了善与恶，进入自然觉知的状态。</w:t>
       </w:r>
     </w:p>
     <w:p>
@@ -3266,19 +3299,19 @@
         <w:rPr>
           <w:rFonts w:ascii="SimSun" w:cs="SimSun" w:eastAsia="SimSun" w:hAnsi="SimSun"/>
         </w:rPr>
-        <w:t xml:space="preserve">财物的布施常常被误用，结果非但积不了功德，施者与受者反而都折损功德。有多少父母把钱给了子女，换来的却是子女拿去吸毒酗酒，买奇装异服、名牌配饰和珠宝，以及其他种种放纵。罗恩·戈滕斯坦（Ron Gottenstein）是一位亿万富翁企业家，几十年前发明了第一套家用安防系统。他没有给两个儿子留下一分钱，却为一位备受尊崇的印度女神——阿姆利塔普里的阿玛（Amritapuri Amma）——修建了数座寺庙。此事越滚越大，最终发展成一个遍布全球的机构，涵盖学校、贫民住房、印度的一所医院（被认为是全印度最好的医院）、芝加哥附近一处规模庞大的修行社区，以及其他类似的大型项目。他的一个儿子因为没分到自己那份财产而心怀怨恨；另一个儿子则拜在父亲的上师门下，常常得到这位被尊称为神圣“母亲”（印地语称“阿玛”）的上师亲自指点。</w:t>
-      </w:r>
-    </w:p>
-    <w:p>
-      <w:pPr>
-        <w:spacing w:after="120" w:line="340"/>
-        <w:ind w:firstLine="480"/>
-      </w:pPr>
-      <w:r>
-        <w:rPr>
-          <w:rFonts w:ascii="SimSun" w:cs="SimSun" w:eastAsia="SimSun" w:hAnsi="SimSun"/>
-        </w:rPr>
-        <w:t xml:space="preserve">打不过就加入！那个做得聪明的儿子，超越了个人的得失盘算，看出父亲的财富是用在更大的善事上。他能够放下自己的受伤，转而拜在父亲所护持的上师门下，以另一种方式承接父亲的财富而获益——这位上师如今在全球的声望，足以与达赖喇嘛尊者比肩。</w:t>
+        <w:t xml:space="preserve">财物的布施常常被误用，结果非但积不了功德，施者与受者反而都折损功德。有多少父母把钱给了子女，换来的却是子女拿去吸毒酗酒，买奇装异服、各色配饰和珠宝，以及其他种种放纵。罗恩·戈滕斯坦（Ron Gottenstein）是一位亿万富翁企业家，几十年前发明了第一套家用安防系统。他没有给两个儿子留下一分钱，却为一位备受尊崇的印度女神——阿姆利塔普里的阿玛（Amritapuri Amma）——修建了数座寺庙。此事越滚越大，最终发展成一个遍布全球的机构，涵盖学校、贫民住房、印度的一所医院（被认为是全印度最好的医院）、芝加哥附近一处规模庞大的修行社区，以及其他类似的大型项目。他的一个儿子因为没分到自己那份财产而心怀怨恨；另一个儿子则拜在父亲的上师门下，常常得到这位被尊称为神圣“母亲”（印地语称“阿玛”）的上师亲自指点。</w:t>
+      </w:r>
+    </w:p>
+    <w:p>
+      <w:pPr>
+        <w:spacing w:after="120" w:line="340"/>
+        <w:ind w:firstLine="480"/>
+      </w:pPr>
+      <w:r>
+        <w:rPr>
+          <w:rFonts w:ascii="SimSun" w:cs="SimSun" w:eastAsia="SimSun" w:hAnsi="SimSun"/>
+        </w:rPr>
+        <w:t xml:space="preserve">打不过就加入！那个做得聪明的儿子，超越了个人的得失盘算，看出父亲的财富是用在更大的善事上。他能够放下自己心中的伤痛，转而拜在父亲所护持的上师门下，以另一种方式承接父亲的财富而获益——这位上师如今在全球的声望，足以与达赖喇嘛尊者比肩。</w:t>
       </w:r>
     </w:p>
     <w:p>
@@ -3326,7 +3359,7 @@
         <w:rPr>
           <w:rFonts w:ascii="SimSun" w:cs="SimSun" w:eastAsia="SimSun" w:hAnsi="SimSun"/>
         </w:rPr>
-        <w:t xml:space="preserve">一代大德敦珠仁波切提醒我们：经典教导我们，要把这具色身看作借来之物，而人身难得，极为珍贵。如果这样看待自己的身体，那么就像对待任何借来的东西一样，我们对怎么使用它会更加留心。同样，如果把一切财物都看作别人赠予的礼物，就没有必要死死抓住不放。我们抓住东西不放，东西也同样抓住我们不放。放下，才腾出接受的空间。施与受不过是因果，遵循业力的法则。若不能施，便不会有所得，因为我们根本没有把这份业启动起来。</w:t>
+        <w:t xml:space="preserve">一代大德敦珠仁波切（Dudjom Rinpoche）提醒我们：经典教导我们，要把这具色身看作借来之物，而人身难得，极为珍贵。如果这样看待自己的身体，那么就像对待任何借来的东西一样，我们对怎么使用它会更加留心。同样，如果把一切财物都看作别人赠予的礼物，就没有必要死死抓住不放。我们抓住东西不放，东西也同样抓住我们不放。放下，才腾出接受的空间。施与受不过是因果，遵循业力的法则。若不能施，便不会有所得，因为我们根本没有把这份业启动起来。</w:t>
       </w:r>
     </w:p>
     <w:p>
@@ -3378,7 +3411,7 @@
         <w:rPr>
           <w:rFonts w:ascii="SimSun" w:cs="SimSun" w:eastAsia="SimSun" w:hAnsi="SimSun"/>
         </w:rPr>
-        <w:t xml:space="preserve">很早就出家的人，往往与真实世界的历练隔绝，活在一种什么都有人供给、什么都可预料的仙境里。可一旦被拔离那个世界，他们就不知所措了。出家人中间常常弥漫着一种轻慢普通人的态度，他们无法与常人感同身受。他们大谈“苦谛”，却只停留在抽象的层面。藏传佛教中地位极高的一位僧人宗萨仁波切，就曾拿这一点幽默地调侃过他那些仁波切同侪。那是在尼泊尔加德满都，他讲授“智慧”法教的时候。</w:t>
+        <w:t xml:space="preserve">很早就出家的人，往往与真实世界的历练隔绝，活在一种什么都有人供给、什么都可预料的仙境里。可一旦被拔离那个世界，他们就不知所措了。出家人中间常常弥漫着一种轻慢普通人的态度，他们无法与常人感同身受。他们大谈“苦谛”，却只停留在抽象的层面。藏传佛教中地位极高的一位僧人宗萨仁波切（Dzongsar Rinpoche），就曾拿这一点幽默地调侃过他那些仁波切同侪。那是在尼泊尔加德满都，他讲授“智慧”法教的时候。</w:t>
       </w:r>
     </w:p>
     <w:p>
@@ -3402,7 +3435,7 @@
         <w:rPr>
           <w:rFonts w:ascii="SimSun" w:cs="SimSun" w:eastAsia="SimSun" w:hAnsi="SimSun"/>
         </w:rPr>
-        <w:t xml:space="preserve">我们不要因为仁波切话中的幽默，而忽略了他这番话的分量。我们在事业与家庭生活中学到的功课，可以在步入晚年时成为修道生活的基础。人们常把退休看作放慢脚步的时候，其实它是换挡的时候——把心力转向自我参究。此前的几十年，正可作为内在成长的根基。养家糊口所担的责任，很容易就能转移成对自己修道之路的担当。无论我们出身背景如何，只要不曾伤害他人，都可以转过来用于成就我们的修道之志。</w:t>
+        <w:t xml:space="preserve">我们不要因为仁波切话中的幽默，而忽略了他这番话的分量。我们在事业与家庭生活中学到的功课，可以在步入晚年时成为修道生活的基础。人们常把退休看作放慢脚步的时候，其实它是换挡的时候——把心力转向自我参究。此前的几十年，正可作为内在成长的根基。养家糊口所担的责任，很容易就能转移成对自己修道之路的担当。无论我们出身背景如何，只要不伤害他人，都可以转过来用于成就我们的修道之志。</w:t>
       </w:r>
     </w:p>
     <w:p>
@@ -3426,7 +3459,7 @@
         <w:rPr>
           <w:rFonts w:ascii="SimSun" w:cs="SimSun" w:eastAsia="SimSun" w:hAnsi="SimSun"/>
         </w:rPr>
-        <w:t xml:space="preserve">此外，禅修式的生活方式有益健康，能预防阿尔茨海默症和痴呆。我在尼泊尔有一位亲近的朋友，是一位名叫敦都（Doundo）的僧人，八十多岁时病得很重。僧人们请我帮忙，我便带他去尼泊尔的一家阿育吠陀医院，看的是被公认为该领域第一人的马纳·巴杰拉查里亚（Mana Bajracharya）医生。医生给了我一些草药带回去给敦都，几个月后他就好转了。他活过了一百岁，直到临终头脑都一如既往地清晰。即使在最后一年跌了一跤摔断了髋骨、再也不能走路之后，他依然终日开朗慈和。</w:t>
+        <w:t xml:space="preserve">此外，禅修式的生活方式有益健康，能预防阿尔茨海默症和痴呆。我们家在尼泊尔有一位很亲近的朋友，是一位名叫敦都（Doundo）的僧人，八十多岁时病得很重。僧人们请我帮忙，我便带他去尼泊尔的一家阿育吠陀医院，看的是被公认为该领域第一人的马纳·巴杰拉查里亚（Mana Bajracharya）医生。医生给了我一些草药带回去给敦都，几个月后他就好转了。他活过了一百岁，直到临终头脑都一如既往地清晰。即使在最后一年跌了一跤摔断了髋骨、再也不能走路之后，他依然终日开朗慈和。</w:t>
       </w:r>
     </w:p>
     <w:p>
@@ -3462,7 +3495,7 @@
         <w:rPr>
           <w:rFonts w:ascii="SimSun" w:cs="SimSun" w:eastAsia="SimSun" w:hAnsi="SimSun"/>
         </w:rPr>
-        <w:t xml:space="preserve">养老院和养老社区帮不了我们生发对人生的洞见与领悟。它们的目的是照料我们直到我们倒下，并从中收取费用。我们远不如就待在原处，每天去寺院、道场（ashram）或僧院做义工，好好利用那里的藏书楼与禅堂，去听闻开示，和方丈以及其他同样在做自我参究的同道交谈。而开始的时机，应当是在不得不如此之前的许多年。</w:t>
+        <w:t xml:space="preserve">养老院和养老社区帮不了我们生发对人生的洞见与领悟。它们的目的是照料我们直到我们倒下，并从中收取费用。我们不如就待在原处，每天去寺院、道场（ashram）或僧院做义工，好好利用那里的藏书楼与禅堂，去听闻开示，和方丈以及其他同样在做自我参究的同道交谈——这样要好得多。而开始的时机，应当是在不得不如此之前的许多年。</w:t>
       </w:r>
     </w:p>
     <w:p>
@@ -3486,7 +3519,7 @@
         <w:rPr>
           <w:rFonts w:ascii="SimSun" w:cs="SimSun" w:eastAsia="SimSun" w:hAnsi="SimSun"/>
         </w:rPr>
-        <w:t xml:space="preserve">寻找一处探索自心的场所，本身就该看作成长过程的一部分。如果我们退休后有退休金、社会保障或别的福利，有房可住、有饭可吃，就很容易沉溺于安逸悠闲的生活——那种生活会在不知不觉中抽走我们的生命力。我们可以说不，主动抖擞精神，甩掉这份懈怠。放弃自己不是一个选项。我们辛苦了一辈子，没有理由现在停下来。像我们这样有胆识的人是有的，只是要去把他们找出来。我们还需要外在的支持，也就是前面说过的：一位老师、一处道场、一群志同道合的朋友。</w:t>
+        <w:t xml:space="preserve">寻找一处探索自心的场所，本身就该看作成长过程的一部分。如果我们退休后有退休金、社会保障或别的福利，有房可住、有饭可吃，就很容易沉溺于安逸悠闲的生活——那种生活会在不知不觉中抽走我们的生命力。我们可以说不，主动抖擞精神，甩掉这份懈怠。我们决不能放弃自己。我们辛苦了一辈子，没有理由现在停下来。像我们这样有胆识的人是有的，只是要去把他们找出来。我们还需要外在的支持，也就是前面说过的：一位老师、一处道场、一群志同道合的朋友。</w:t>
       </w:r>
     </w:p>
     <w:p>
@@ -3510,7 +3543,7 @@
         <w:rPr>
           <w:rFonts w:ascii="SimSun" w:cs="SimSun" w:eastAsia="SimSun" w:hAnsi="SimSun"/>
         </w:rPr>
-        <w:t xml:space="preserve">亲友们会觉得我们疯了，用尽办法劝阻我们，不让我们跳出常规。人人都希望别人和自己一个样。莫非真是“同病相怜”？总有一天，他们会称赞我们有魄力，赞不绝口地说我们是个又聪明又勇敢的家伙。我们会成为他们的“知心信箱”（Dear Abby），事事都来向我们讨主意。他们会为当初怀疑我们而致歉，转而来讨我们的欢心。</w:t>
+        <w:t xml:space="preserve">亲友们会觉得我们疯了，用尽办法劝阻我们，不让我们跳出常规。人人都希望别人和自己一个样。莫非是自己过得苦闷，便巴不得别人也来作伴？总有一天，他们会称赞我们有魄力，赞不绝口地说我们是个又聪明又勇敢的家伙。我们会成为他们的“知心信箱”（Dear Abby），事事都来向我们讨主意。他们会为当初怀疑我们而致歉，转而来讨我们的欢心。</w:t>
       </w:r>
     </w:p>
     <w:p>
@@ -3622,7 +3655,7 @@
         <w:rPr>
           <w:rFonts w:ascii="SimSun" w:cs="SimSun" w:eastAsia="SimSun" w:hAnsi="SimSun"/>
         </w:rPr>
-        <w:t xml:space="preserve">理解业的关键，在于理解业与动机的关系。动机是一个控制阀，能够调节一个行为中所夹带的负面成分的多少。渐渐地，恶业减少，连造恶的习性也随之消融。善的方面也是如此。如果我们在该行善时心生抗拒——比如布施济贫、远离淫行、不说他人是非——并且看清这种对善的抗拒，纯粹是因为我们没有听从内心的提醒，那么我们就可以立定动机，做一个更善于聆听的人，去听那个策励我们行正道的声音，从而施舍得更慷慨、爱得更少贪染、说话更加厚道。</w:t>
+        <w:t xml:space="preserve">理解业的关键，在于理解业与动机的关系。动机是一个控制阀，能够调节一个行为中所夹带的负面成分的多少。渐渐地，恶行减少，连造恶的习性也随之消融。善的方面也是如此。如果我们在该行善时心生抗拒——比如布施济贫、远离淫行、不说他人是非——并且看清这种对善的抗拒，纯粹是因为我们没有听从内心的提醒，那么我们就可以立定动机，做一个更善于聆听的人，去听那个策励我们行正道的声音，从而施舍得更慷慨、爱得更少贪染、说话更加厚道。</w:t>
       </w:r>
     </w:p>
     <w:p>
@@ -3706,7 +3739,7 @@
         <w:rPr>
           <w:rFonts w:ascii="SimSun" w:cs="SimSun" w:eastAsia="SimSun" w:hAnsi="SimSun"/>
         </w:rPr>
-        <w:t xml:space="preserve">所谓“善业”，不过是让善延续下去的业；而“恶业”则消耗已经积累的善。这样的取舍看似再明白不过，实际做起来却不然，因为过去积业有它的惯性。人的处境受欲望支配，我们的行为多半是以自我为中心的，因而是遮蔽更高觉知的行为——在这个意义上便是恶业。唯有那些精进修持佛法、或一生行事端正的人，才积下了足够的善行，使那股惯性偏向正直而非自私。</w:t>
+        <w:t xml:space="preserve">所谓“善业”，不过是让善延续下去的业；而“恶业”则消耗已经积累的善。这样的取舍看似再明白不过，实际做起来却不然，因为过去积业有它的惯性。由于人的处境受欲望支配，我们以往的行为多半是以自我为中心的，因而是遮蔽更高觉知的行为——在这个意义上便是不善的。唯有那些精进修持佛法、或一生行事端正的人，才积下了足够的善行，使那股惯性偏向正直而非自私。</w:t>
       </w:r>
     </w:p>
     <w:p>
@@ -3794,7 +3827,7 @@
         <w:rPr>
           <w:rFonts w:ascii="SimSun" w:cs="SimSun" w:eastAsia="SimSun" w:hAnsi="SimSun"/>
         </w:rPr>
-        <w:t xml:space="preserve">平衡带来和谐与安宁。人人都有付出的环境才有和谐，因为人人都觉得自己受到了公平的对待。孩子小的时候，我总在替他们收拾，一直收拾到他们十几岁。有一天，我们家的一位朋友、儿童心理学家阿莱特，看出了我的毛病。我自己并没有意识到：我对孩子宽纵，是因为我想得到他们的爱。</w:t>
+        <w:t xml:space="preserve">平衡带来和谐与安宁。人人都有所付出的环境能孕育和谐，因为人人都觉得自己受到了公平的对待。孩子小的时候，我总在替他们收拾，一直收拾到他们十几岁。有一天，我们家的一位朋友、儿童心理学家阿莱特，看出了我的毛病。我自己并没有意识到：我对孩子宽纵，是因为我想得到他们的爱。</w:t>
       </w:r>
     </w:p>
     <w:p>
@@ -3902,7 +3935,7 @@
         <w:rPr>
           <w:rFonts w:ascii="SimSun" w:cs="SimSun" w:eastAsia="SimSun" w:hAnsi="SimSun"/>
         </w:rPr>
-        <w:t xml:space="preserve">竞争是自然的事，我们都想往前走。出问题的地方在于，我们看不见往前走所付出的代价。在奔向自以为极重要的目标时，若是粗心失念，就容易把生活里那些细密的纹理忘个干净，代价可能是亲情与友谊。该不该陪孩子去打垒球，该不该一家人一起吃早饭、吃晚饭——一不留神，这笔账就算错了。我们与家人之间，是靠错综复杂的关系缝缀在一起的；若不想让这层缝缀散开，就得时时留心。</w:t>
+        <w:t xml:space="preserve">竞争是自然的事，我们都想往前走。出问题的地方在于，我们看不见往前走所付出的代价。在奔向自以为极重要的目标时，忘了生活里那些细密的纹理，代价可能是亲情与友谊。陪孩子去垒球场，一家人一起吃早饭、吃晚饭，这些事有多少价值——我们若是粗心失念，这笔账就很容易算错。我们与家人之间，是靠错综复杂的关系缝缀在一起的；若不想让这层缝缀散开，就得时时留心。</w:t>
       </w:r>
     </w:p>
     <w:p>
@@ -3926,7 +3959,7 @@
         <w:rPr>
           <w:rFonts w:ascii="SimSun" w:cs="SimSun" w:eastAsia="SimSun" w:hAnsi="SimSun"/>
         </w:rPr>
-        <w:t xml:space="preserve">个人成长的样貌并不单调。我认识的最帅的男人詹姆斯是个运动员，也是速比涛（Speedo）的男模；他从十几岁起就和同一个女人萨拉在一起，始终忠贞。我们做邻居的时候，常一起在圣莫尼卡的海滨栈道上散步。有一回我提起他招来的那些贪恋的目光，他说：“我知道。给速比涛拍片的时候，为了在有限的时间里拍完各式泳装，流程排得很紧，男女模特是在一起换衣服的；‘光着身子’的时候，我们有时也会彼此看得心生欲念，可对我来说，从来没有越过这一步。”</w:t>
+        <w:t xml:space="preserve">个人成长的样貌并不单调。我认识的最帅的男人詹姆斯是个运动员，也是速比涛（Speedo）的男超模；他从十几岁起就和同一个女人萨拉在一起，始终忠贞。我们做邻居的时候，常一起在圣莫尼卡的海滨栈道上散步。有一回我提起他招来的那些贪恋的目光，他说：“我知道。给速比涛拍片的时候，为了在有限的时间里拍完各式泳装，流程排得很紧，男女模特是在一起换衣服的；‘光着身子’的时候，我们有时也会彼此看得心生欲念，可对我来说，从来没有越过这一步。”</w:t>
       </w:r>
     </w:p>
     <w:p>
@@ -4026,7 +4059,7 @@
         <w:rPr>
           <w:rFonts w:ascii="SimSun" w:cs="SimSun" w:eastAsia="SimSun" w:hAnsi="SimSun"/>
         </w:rPr>
-        <w:t xml:space="preserve">关系是相互的。我们没法与一辆车、一栋房子、一块表、食物、衣服，或者红、白、绿、蓝建立关系，因为东西什么都不知道。我们造出一种与物有关系的幻象，就像“圣地亚哥”对大海那样，但这些都是虚幻的关系。一样东西无法与自身发生关系，正如刀不能自割，因为它没有意识；出于同样的道理，它也无法与别的东西发生关系。刀不知道自己切的是奶酪还是手指。</w:t>
+        <w:t xml:space="preserve">关系是相互的。我们没法与一辆车、一栋房子、一块表、食物、衣服，或者红、白、绿、蓝建立关系，因为东西什么都不知道。我们造出一种与物有关系的幻象，就像“圣地亚哥”对大海那样，但这些都是虚幻的关系。一样东西无法与自身建立关系，正如刀不能自割，因为它没有意识；出于同样的道理，它也无法与别的东西建立关系。刀不知道自己切的是奶酪还是手指。</w:t>
       </w:r>
     </w:p>
     <w:p>
@@ -4086,31 +4119,31 @@
         <w:rPr>
           <w:rFonts w:ascii="SimSun" w:cs="SimSun" w:eastAsia="SimSun" w:hAnsi="SimSun"/>
         </w:rPr>
-        <w:t xml:space="preserve">虽然割舍起来会疼，但那些我们执着太深的东西，也许最好归别人所有。若要与执着分离，就不必担心它会反过来咬我们一口。并不是每一个立得住的意愿我们都非实现不可。布施和别的事一样，是要练的。在物质上放下，并不等于在心上放下，但那是朝正确方向迈出的一步。</w:t>
-      </w:r>
-    </w:p>
-    <w:p>
-      <w:pPr>
-        <w:spacing w:after="120" w:line="340"/>
-        <w:ind w:firstLine="480"/>
-      </w:pPr>
-      <w:r>
-        <w:rPr>
-          <w:rFonts w:ascii="SimSun" w:cs="SimSun" w:eastAsia="SimSun" w:hAnsi="SimSun"/>
-        </w:rPr>
-        <w:t xml:space="preserve">当然，把送出去的东西再添置回来，正是“慷慨”这个鬼在作祟。它缠着我们不放，直到把我们纠缠得不那么看重物质为止。结果是，我们与自己、与他人的关系更好了——虽然手头也更紧了一点。</w:t>
-      </w:r>
-    </w:p>
-    <w:p>
-      <w:pPr>
-        <w:spacing w:after="120" w:line="340"/>
-        <w:ind w:firstLine="480"/>
-      </w:pPr>
-      <w:r>
-        <w:rPr>
-          <w:rFonts w:ascii="SimSun" w:cs="SimSun" w:eastAsia="SimSun" w:hAnsi="SimSun"/>
-        </w:rPr>
-        <w:t xml:space="preserve">从数量上说，世上的东西比人多，这就使人更稀有；而越稀有的越珍贵，也最值得我们去结识。幸而，每个人本身就是一座宝藏。个体之所以成为个体，是因为有他人；他人又在一条环环相扣的因果之链中受我们影响。只要我们还认为这两者是分开的，它们就是分开的。然而，唯有化掉界线、体认到一体与相互依存，才能寻得幸福。</w:t>
+        <w:t xml:space="preserve">虽然割舍起来会疼，但那些我们执着太深的东西，也许最好归别人所有。我们若与所执着的东西分开了，就算它回过头来咬我们一口，也不必为此担心。并不是每一个立得住的意愿我们都非实现不可。布施和别的事一样，是要练的。在物质上放下，并不等于在心上放下，但那是朝正确方向迈出的一步。</w:t>
+      </w:r>
+    </w:p>
+    <w:p>
+      <w:pPr>
+        <w:spacing w:after="120" w:line="340"/>
+        <w:ind w:firstLine="480"/>
+      </w:pPr>
+      <w:r>
+        <w:rPr>
+          <w:rFonts w:ascii="SimSun" w:cs="SimSun" w:eastAsia="SimSun" w:hAnsi="SimSun"/>
+        </w:rPr>
+        <w:t xml:space="preserve">当然，把送出去的东西再添置回来，正是“慷慨”这个鬼在作祟。它缠着我们，也只缠到我们变得不那么看重物质为止。结果是，我们与自己、与他人的关系更好了——虽然手头也更紧了一点。</w:t>
+      </w:r>
+    </w:p>
+    <w:p>
+      <w:pPr>
+        <w:spacing w:after="120" w:line="340"/>
+        <w:ind w:firstLine="480"/>
+      </w:pPr>
+      <w:r>
+        <w:rPr>
+          <w:rFonts w:ascii="SimSun" w:cs="SimSun" w:eastAsia="SimSun" w:hAnsi="SimSun"/>
+        </w:rPr>
+        <w:t xml:space="preserve">从数量上说，世上的东西比人多，这就使人更稀有；而越稀有的越珍贵，也最值得我们去结识。幸而，每个人本身就是一座宝藏。个体之所以成为个体，是因为有他人；他人又在一条环环相扣的因果之链中受我们影响。只要我们还认为这两者是分开的，它们就是分开的。然而，当我们化掉界线、体认到一体与相互依存时，便会寻得幸福。</w:t>
       </w:r>
     </w:p>
     <w:p>
@@ -4242,7 +4275,7 @@
         <w:rPr>
           <w:rFonts w:ascii="SimSun" w:cs="SimSun" w:eastAsia="SimSun" w:hAnsi="SimSun"/>
         </w:rPr>
-        <w:t xml:space="preserve">尽管如此，那些觉得买台电视是个聪明主意的人，还是把雪球滚了起来。五年多下来，大多数村民都有了自己的电视。这些电视往往是以像样的衣服和孩子的学费为代价换来的。可是，谁家要是没有电视，就被看作“不开化”；电视越大，乡里乡亲就越觉得你有派头。</w:t>
+        <w:t xml:space="preserve">尽管如此，那些觉得买台电视是个聪明主意的人，还是把雪球滚了起来。五年多下来，大多数村民都有了自己的电视。这些电视往往是以像样的衣服和孩子的学费为代价换来的。可是，谁家要是没有电视，就被看作“土气”；电视越大，乡里乡亲就越觉得你有派头。</w:t>
       </w:r>
     </w:p>
     <w:p>
@@ -4278,7 +4311,7 @@
         <w:rPr>
           <w:rFonts w:ascii="SimSun" w:cs="SimSun" w:eastAsia="SimSun" w:hAnsi="SimSun"/>
         </w:rPr>
-        <w:t xml:space="preserve">往往，即便我们鼓起勇气去支持“做减法”的道理，这道理也还是会被暗中瓦解。同伴的影响能把最高尚的意愿带偏。我们生活在一个物质主义的世界里，同伴的压力对我们的影响，远超我们自己的估计。如果我们经由审察而觉察到自己正受着不当的牵引而随大流，并且加以抵抗，浮在水面上的机会就大一些。</w:t>
+        <w:t xml:space="preserve">即便我们鼓起勇气去支持“做减法”的道理，这道理也往往会被暗中瓦解。同伴的影响能把最高尚的意愿带偏。我们生活在一个物质主义的世界里，同伴的压力对我们的影响，可能比我们意识到的还要大。如果我们经由审察而觉察到自己正受着不当的牵引而随大流，并且加以抵抗，浮在水面上的机会就大一些。</w:t>
       </w:r>
     </w:p>
     <w:p>
@@ -4326,7 +4359,7 @@
         <w:rPr>
           <w:rFonts w:ascii="SimSun" w:cs="SimSun" w:eastAsia="SimSun" w:hAnsi="SimSun"/>
         </w:rPr>
-        <w:t xml:space="preserve">我们把“能让我们快乐”这种本事投射到物上；可若物当真有这本事，同样的东西对别人也该起同样的作用。事实却恰恰相反。我们各有各的好恶，这正说明一切好恶都是心的投射，而且往往是闲来无事的投射。物不“能”使我们快乐，还有一个证据：它所给的快乐维持不了多久。凡不是必需品的东西，都老得很快。而我们对一只心爱的杯子、一条心爱的牛仔裤的珍惜，却会随着每一次使用而增加——直到某位好心的朋友又送来一只新的。</w:t>
+        <w:t xml:space="preserve">我们把“能让我们快乐”这种本事投射到物上；可若物当真有这本事，同样的东西对别人也该起同样的作用。事实却恰恰相反。我们各有各的好恶，这正说明一切好恶都是心的投射，而且往往是闲来无事的投射。物不“能”使我们快乐，还有一个证据：它所给的快乐维持不了多久。凡不是必需品的东西，很快就让人腻了。而我们对一只心爱的杯子、一条心爱的牛仔裤的珍惜，却会随着每一次使用而增加——直到某位好心的朋友又送来一只新的。</w:t>
       </w:r>
     </w:p>
     <w:p>
@@ -4350,7 +4383,7 @@
         <w:rPr>
           <w:rFonts w:ascii="SimSun" w:cs="SimSun" w:eastAsia="SimSun" w:hAnsi="SimSun"/>
         </w:rPr>
-        <w:t xml:space="preserve">我们嫌自己的电子产品和机器功能不如新款多；可我们手头这些设备的功能，究竟还有多少压根没用过，以至于换新显得那么理所当然？对“最新”的贪求把我们困住，逼着我们重新给脑子布线，去想要一个新的东西——这是再耗时不过的工程，而且毫无实在的意义。</w:t>
+        <w:t xml:space="preserve">我们嫌自己的电子产品和机器功能不如新款多；可我们手头这些设备的功能，究竟还有多少压根没用过？既然如此，换新又凭什么显得理所当然？对“最新”的贪求把我们困住，逼着我们重新给脑子布线，去想要一个新的东西——这是再耗时不过的工程，而且毫无实在的意义。</w:t>
       </w:r>
     </w:p>
     <w:p>
@@ -4398,7 +4431,7 @@
         <w:rPr>
           <w:rFonts w:ascii="SimSun" w:cs="SimSun" w:eastAsia="SimSun" w:hAnsi="SimSun"/>
         </w:rPr>
-        <w:t xml:space="preserve">我们做对了这件事、能够及时收住自己的时候，往往会发现自己没那么多疑虑了。“我这个决定做对了吗？”我们会这样嘀咕。如果我们不再用“对”和“错”去想，只是把它当作一个“决定”，抱着“出错本属常事”的态度，这个决定就不那么让人忧心了。这样反复地做，能让我们更坚定，也更少疑惑。</w:t>
+        <w:t xml:space="preserve">我们做了该做的事、能够及时收住自己的时候，往往会发现自己没那么多疑虑了。“我这个决定做对了吗？”我们会这样嘀咕。如果我们不再用“对”和“错”去想，只是把它当作一个“决定”，抱着“出错本属常事”的态度，这个决定就不那么让人忧心了。这样反复地做，能让我们更坚定，也更少疑惑。</w:t>
       </w:r>
     </w:p>
     <w:p>
@@ -4434,31 +4467,31 @@
         <w:rPr>
           <w:rFonts w:ascii="SimSun" w:cs="SimSun" w:eastAsia="SimSun" w:hAnsi="SimSun"/>
         </w:rPr>
-        <w:t xml:space="preserve">想象力的破产，从“购物是闲暇时最爱的消遣”这个简单事实上就看得出来。如果我们趁着身强体健就只顾吃喝作乐，那我们就会一直这么下去，哪怕种种迹象都在告诉我们：下坡路越走越快，而刹车皮早已磨光。等到撞上墙的那一刻，我们根本不知道发生了什么。</w:t>
-      </w:r>
-    </w:p>
-    <w:p>
-      <w:pPr>
-        <w:spacing w:after="120" w:line="340"/>
-        <w:ind w:firstLine="480"/>
-      </w:pPr>
-      <w:r>
-        <w:rPr>
-          <w:rFonts w:ascii="SimSun" w:cs="SimSun" w:eastAsia="SimSun" w:hAnsi="SimSun"/>
-        </w:rPr>
-        <w:t xml:space="preserve">凡事都有其时节，“身强体健”也有它的时节；可我们忘了这一点，往往只想一直收割，却不肯播下更新的种子。酗酒、肥胖、乖戾、抑郁、错乱，都是我们失了时节感之后显而易见的病。与生命的潮起潮落保持和谐，至关重要。只要我们知道什么时候该踩刹车、什么时候该收油滑行，那堵墙就用不着来提醒我们了。</w:t>
-      </w:r>
-    </w:p>
-    <w:p>
-      <w:pPr>
-        <w:spacing w:after="120" w:line="340"/>
-        <w:ind w:firstLine="480"/>
-      </w:pPr>
-      <w:r>
-        <w:rPr>
-          <w:rFonts w:ascii="SimSun" w:cs="SimSun" w:eastAsia="SimSun" w:hAnsi="SimSun"/>
-        </w:rPr>
-        <w:t xml:space="preserve">派对散场、人都回家之后，我们要不要继续庆祝，是我们自己的选择。我们共处的这个世界如此多样，正说明每一种生活方式都有它的位置，每一种生活方式都可以成为通向开悟的路。若能顺着水流的方向走，并且守在水流之中，找到自己的路就容易些。圆满在喜马拉雅的山洞里并不比在曼哈顿的摩天楼里更容易寻得——尽管住在这两处的人，有时都以为钥匙在对方手上。</w:t>
+        <w:t xml:space="preserve">想象力的破产，从“购物是闲暇时最爱的消遣”这个简单事实上就看得出来。如果我们趁着身强体健就只顾吃喝作乐，那我们就会这样一直过下去，能撑多久撑多久，哪怕种种迹象都在告诉我们：下坡路越走越快，而刹车皮早已磨光。等到撞上墙的那一刻，我们根本不知道发生了什么。</w:t>
+      </w:r>
+    </w:p>
+    <w:p>
+      <w:pPr>
+        <w:spacing w:after="120" w:line="340"/>
+        <w:ind w:firstLine="480"/>
+      </w:pPr>
+      <w:r>
+        <w:rPr>
+          <w:rFonts w:ascii="SimSun" w:cs="SimSun" w:eastAsia="SimSun" w:hAnsi="SimSun"/>
+        </w:rPr>
+        <w:t xml:space="preserve">凡事都有其时节，“身强体健”也有它的时节；可我们忘了这一点，往往只想一直收割，却不为来日的复苏播下种子。酗酒、肥胖、乖戾、抑郁、错乱，都是我们失了时节感之后显而易见的病。与生命的潮起潮落保持和谐，至关重要。只要我们知道什么时候该踩刹车、什么时候该收油滑行，那堵墙就用不着来提醒我们了。</w:t>
+      </w:r>
+    </w:p>
+    <w:p>
+      <w:pPr>
+        <w:spacing w:after="120" w:line="340"/>
+        <w:ind w:firstLine="480"/>
+      </w:pPr>
+      <w:r>
+        <w:rPr>
+          <w:rFonts w:ascii="SimSun" w:cs="SimSun" w:eastAsia="SimSun" w:hAnsi="SimSun"/>
+        </w:rPr>
+        <w:t xml:space="preserve">派对早已散场、人都回了家，我们还要不要继续庆祝，是我们自己的选择。我们共处的这个世界如此多样，正说明每一种生活方式都有它的位置，每一种生活方式都可以成为通向开悟的路。若能顺着水流的方向走，并且守在水流之中，找到自己的路就容易些。圆满在喜马拉雅的山洞里并不比在曼哈顿的摩天楼里更容易寻得——尽管住在这两处的人，有时都以为钥匙在对方手上。</w:t>
       </w:r>
     </w:p>
     <w:p>
@@ -4518,7 +4551,7 @@
         <w:rPr>
           <w:rFonts w:ascii="SimSun" w:cs="SimSun" w:eastAsia="SimSun" w:hAnsi="SimSun"/>
         </w:rPr>
-        <w:t xml:space="preserve">不过，常识够用的时候，我们还是先别忙着讲宗教。正如凡出生的人都会长出智齿，也正如人除了生命最初的那几个阶段之外，都不再需要别人替自己嚼饭，常识同样会自行浮现来指引我们，使我们除了最有智慧的人之外，无须四处求教。我们本来就能应付人生的曲折起伏；只要能避开途中的纠缠，我们是会去避的。可众所周知，那些纠缠十分诱人，而我们的抵抗力又薄弱，结果我们把自己引进陌生的地界，除了自己无人可怪——虽然我们照旧怪，而且怪得很勤。</w:t>
+        <w:t xml:space="preserve">不过，常识够用的时候，我们还是先别忙着讲宗教。正如凡出生的人必定都会长出智齿以及别的牙齿，好让自己除了生命最初的那几个阶段之外，都不再需要别人替自己嚼饭，常识同样会自行浮现来指引我们，使我们除了最有智慧的人之外，无须四处求教。我们本来就能应付人生的曲折起伏；只要能避开途中的纠缠，我们是会去避的。可众所周知，那些纠缠十分诱人，而我们的抵抗力又薄弱，结果我们把自己引进陌生的地界，除了自己无人可怪——虽然我们照样会去怪别人，而且怪得很勤。</w:t>
       </w:r>
     </w:p>
     <w:p>
@@ -4694,7 +4727,7 @@
         <w:rPr>
           <w:rFonts w:ascii="SimSun" w:cs="SimSun" w:eastAsia="SimSun" w:hAnsi="SimSun"/>
         </w:rPr>
-        <w:t xml:space="preserve">当然，道是自己找上门来，还是要我们去力争，取决于我们如何立心、如何度过此生；但看来只要有加持，要有意识地进入梦境、并在梦中保持清醒，应该不会太难。梦瑜伽（梦观成就法）虽然与那洛六法中的其余诸法一样，被视为高阶的修法，但作为初学者，我们或许也能做出几分近似的尝试。</w:t>
+        <w:t xml:space="preserve">当然，道是自己找上门来，还是要我们去力争，取决于我们如何立心、如何度过此生；但看来只要有加持，要有意识地进入梦境、并在梦中保持清醒，应该不会太难。梦瑜伽（Dream Yoga）虽然与那洛六法中的其余诸法一样，被视为高阶的修法，但作为初学者，我们或许也能做出几分近似的尝试。</w:t>
       </w:r>
     </w:p>
     <w:p>
@@ -4863,7 +4896,7 @@
         <w:rPr>
           <w:rFonts w:ascii="SimSun" w:cs="SimSun" w:eastAsia="SimSun" w:hAnsi="SimSun"/>
         </w:rPr>
-        <w:t xml:space="preserve">弗雷德那种缓慢的节奏，自然意味着与通常的念法相比，音节与音节之间的空档被大大拉长了。显然，这与前面提到的“拉长前念与后念之间的间隙”是一脉相承的。音节之间的这段时间当然会招来攀缘，唯有靠提起的觉知才能挡住它——这种觉知，与禅宗“参话头</w:t>
+        <w:t xml:space="preserve">弗雷德那种缓慢的节奏，自然意味着与通常的念法相比，音节与音节之间的空档被大大拉长了。显然，这与前面提到的“拉长前念与后念之间的间隙”是一脉相承的。音节之间的这段时间当然会招来散乱，唯有靠提起的觉知才能挡住它——这种觉知，与禅宗“参话头</w:t>
       </w:r>
       <w:r>
         <w:rPr>
@@ -4943,7 +4976,7 @@
         <w:rPr>
           <w:rFonts w:ascii="SimSun" w:cs="SimSun" w:eastAsia="SimSun" w:hAnsi="SimSun"/>
         </w:rPr>
-        <w:t xml:space="preserve">我们一天中所做的一切与禅修之间，不应有一道生硬的界线。这条界线应当是模糊的。我们要把禅修与其余一切这两个领域交融在一起。到了该坐下来持咒的时候，应当能平顺地进入，几乎不受打断，也不需要刻意调整心态。最好是怀着热忱去期待它，就像期待与朋友相约一样。这个比方很贴切，因为静静持咒用功的时光，正如一段好友谊那样滋养人。瑜伽士能在偏远之地独居多年，又有什么奇怪的呢？</w:t>
+        <w:t xml:space="preserve">我们一天中所做的一切与禅修之间，不应有一道生硬的界线。这条界线应当是模糊的。我们要把禅修与其余一切这两个领域交融在一起。到了该坐下来持咒的时候，应当能平顺地进入，几乎不受打断，也不需要刻意调整心态。最好是怀着热忱去期待它，就像期待与朋友相约一样。这个比方很贴切，因为静静持咒用功的时光，正如一段好友谊那样滋养人。瑜伽士能安然在偏远之地独居多年，又有什么奇怪的呢？</w:t>
       </w:r>
     </w:p>
     <w:p>
@@ -5005,7 +5038,7 @@
         <w:rPr>
           <w:rFonts w:ascii="SimSun" w:cs="SimSun" w:eastAsia="SimSun" w:hAnsi="SimSun"/>
         </w:rPr>
-        <w:t xml:space="preserve">修行极难。回顾五十年的修持，尤其是出家的那十年，我真不知道自己当年是怎么活下来的。但因为那时我的功夫完全向内用，戒愿也守得严谨，所以当下从未觉得难。本该如此。外人看我们，会觉得修学佛法多么艰难；而身在其中的我们，却几乎觉察不到有什么事情在发生。事实上，上人赐给我的那幅字轴里有一句话：“修行人不觉有事。”我们就像梦中人，做着种种不凡的事。</w:t>
+        <w:t xml:space="preserve">修行极难。回顾五十年的修持，尤其是出家的那十年，我真不知道自己当年是怎么活下来的——这话毫不夸张。但因为那时我的功夫完全向内用，戒愿也守得严谨，所以当下从未觉得难。本该如此。外人看我们，会觉得修学佛法多么艰难；而身在其中的我们，却几乎觉察不到有什么事情在发生。事实上，上人赐给我的那幅字轴里有一句话：“修行人不觉有事。”我们就像梦中人，做着种种不凡的事。</w:t>
       </w:r>
     </w:p>
     <w:p>
@@ -5102,7 +5135,7 @@
         <w:rPr>
           <w:rFonts w:ascii="SimSun" w:cs="SimSun" w:eastAsia="SimSun" w:hAnsi="SimSun"/>
         </w:rPr>
-        <w:t xml:space="preserve">宣化上人常说的一句话是：“你所需要的，只是一颗诚心。”在我打基础的那些年里，一想起这句话，就多次得到加持。诸如咒持得对不对、该持多久、快些还是慢些、睁眼还是闭眼、出声还是默念，这一类程序上的疑惑，只能保证我的修行一步也走不动。上述这些细节，只要我们尽好本分——按时上座，把禅修与研读的时长固定下来——自然会迎刃而解。起初的用功难免不够有效率，但只要坚持下去，门路自会作为用功的副产品，不求而自来。</w:t>
+        <w:t xml:space="preserve">宣化上人常说的一句话是：“你所需要的，只是一颗诚心。”在我打基础的那些年里，每每想起这句话，我都得到加持。诸如咒持得对不对、该持多久、快些还是慢些、睁眼还是闭眼、出声还是默念，这一类程序上的疑惑，只能保证我的修行一步也走不动。上述这些细节，只要我们尽好本分——按时上座，把禅修与研读的时长固定下来——自然会迎刃而解。起初的用功难免不够有效率，但只要坚持下去，门路自会作为用功的副产品，不求而自来。</w:t>
       </w:r>
     </w:p>
     <w:p>
@@ -5153,24 +5186,24 @@
         <w:rPr>
           <w:rFonts w:ascii="SimSun" w:cs="SimSun" w:eastAsia="SimSun" w:hAnsi="SimSun"/>
         </w:rPr>
-        <w:t xml:space="preserve">对同修道友的这份责任，应当成为我们不容懈怠的强大动力，而这份动力，正是随众共修而非独自摸索的好处之一。一位懈怠的禅修老手，对道友的支持还比不上一位精进的初学者。宣化上人花在帮助一个诚心初学者身上的时间，远多于花在一个懈怠却有功夫的修行人身上。要赢得善知识的垂顾，靠的是诚，而不是功夫。</w:t>
-      </w:r>
-    </w:p>
-    <w:p>
-      <w:pPr>
-        <w:spacing w:after="120" w:line="340"/>
-      </w:pPr>
-    </w:p>
-    <w:p>
-      <w:pPr>
-        <w:spacing w:after="120" w:line="340"/>
-        <w:ind w:firstLine="480"/>
-      </w:pPr>
-      <w:r>
-        <w:rPr>
-          <w:rFonts w:ascii="SimSun" w:cs="SimSun" w:eastAsia="SimSun" w:hAnsi="SimSun"/>
-        </w:rPr>
-        <w:t xml:space="preserve">这里还可以补充一点：同修道友看到有人真下功夫时，反应也会积极得多，远胜于看到一个懈怠却有功夫的人。在尼泊尔时，我和一位玛囊（Manang）朋友吃午饭，他的一位朋友前来，为他们社区的一个人募一笔可观的捐款，用途是给这人盖房子。玛囊人是居住在喜马拉雅高山地区玛囊一带的一支很有自尊的族群。我的朋友向我解释说：只要有一个人看起来穷，那就是他们全体的脸面问题。所以整个社区都会帮助那些贫穷、无力维生的人。僧团也是如此。</w:t>
+        <w:t xml:space="preserve">对同修道友的这份责任，应当成为我们不容懈怠的强大动力，而这份动力，正是随众共修而非独自摸索的好处之一。一位懈怠的禅修老手，对道友的支持还比不上一位精进的初学者。宣化上人花在帮助一个诚心初学者身上的时间，远多于花在一个懈怠却有功夫的修行人身上。要赢得善知识的垂顾，靠的更多是诚，而不是功夫。</w:t>
+      </w:r>
+    </w:p>
+    <w:p>
+      <w:pPr>
+        <w:spacing w:after="120" w:line="340"/>
+      </w:pPr>
+    </w:p>
+    <w:p>
+      <w:pPr>
+        <w:spacing w:after="120" w:line="340"/>
+        <w:ind w:firstLine="480"/>
+      </w:pPr>
+      <w:r>
+        <w:rPr>
+          <w:rFonts w:ascii="SimSun" w:cs="SimSun" w:eastAsia="SimSun" w:hAnsi="SimSun"/>
+        </w:rPr>
+        <w:t xml:space="preserve">这里还可以补充一点：同修道友看到有人真下功夫时，反应也会积极得多，远胜于看到一个懈怠却有功夫的人。在尼泊尔时，我和一位马南（Manang）朋友吃午饭，他的一位朋友前来，为他们社区的一个人募一笔可观的捐款，用途是给这人盖房子。马南人是居住在喜马拉雅高山地区马南一带的一支很有自尊的族群。我的朋友向我解释说：只要有一个人看起来穷，那就是他们全体的脸面问题。所以整个社区都会帮助那些贫穷、无力维生的人。僧团也是如此。</w:t>
       </w:r>
     </w:p>
     <w:p>
@@ -5215,7 +5248,7 @@
         <w:rPr>
           <w:rFonts w:ascii="SimSun" w:cs="SimSun" w:eastAsia="SimSun" w:hAnsi="SimSun"/>
         </w:rPr>
-        <w:t xml:space="preserve">然而，随着我们多方兼修渐趋成熟——通常在三年或更短的时间内——与某些修法之间的自然相应就会浮现出来；那时我们便可以开始把重心更多地放在与自己相应的法门上，把不相应的剔除掉。老话说“一法通，万法通”，其中确有几分真实，这也是多种修法有时会汇归为一种修法的原因。诸法彼此相通，互相映照。</w:t>
+        <w:t xml:space="preserve">然而，随着我们多方兼修渐趋成熟——通常在三年或更短的时间内——与某些修法之间的自然相应就会浮现出来；那时我们便可以开始把重心更多地放在与自己相应的法门上，把不相应的剔除掉。老话说“一法通，万法通”，其中颇有道理，这也是多种修法有时会汇归为一种修法的一个原因。诸法彼此相通，互相映照。</w:t>
       </w:r>
     </w:p>
     <w:p>
@@ -5266,24 +5299,24 @@
         <w:rPr>
           <w:rFonts w:ascii="SimSun" w:cs="SimSun" w:eastAsia="SimSun" w:hAnsi="SimSun"/>
         </w:rPr>
-        <w:t xml:space="preserve">疲劳是个非常非常要紧的问题，而把我们逼到那一步的，往往是我执。持咒的遍数或打坐的钟点，并不代表效果。我曾亲眼见过有功夫的禅者一坐下、心一收，立刻进入气息俱停的三昧。也有的瑜伽士日复一日就那么坐着。但没有人是为了坐而坐。一位有功夫的禅者，坐到这一座圆满为止，不多也不少。重点永远在质量上——我知道这是个相对的说法。但我们每个人都必须认得出：这一座结束了，该去做别的了。</w:t>
-      </w:r>
-    </w:p>
-    <w:p>
-      <w:pPr>
-        <w:spacing w:after="120" w:line="340"/>
-      </w:pPr>
-    </w:p>
-    <w:p>
-      <w:pPr>
-        <w:spacing w:after="120" w:line="340"/>
-        <w:ind w:firstLine="480"/>
-      </w:pPr>
-      <w:r>
-        <w:rPr>
-          <w:rFonts w:ascii="SimSun" w:cs="SimSun" w:eastAsia="SimSun" w:hAnsi="SimSun"/>
-        </w:rPr>
-        <w:t xml:space="preserve">下座之后我们所做的“别的事”，应当能支持整体的修行。我认识一些人会捧起书本读上几个小时（禅修往往让心对研读格外亲和），也有人拿起园艺工具去园子里干活，还有人扫寺院的院子、打扫佛殿、切菜，或者像我一样去洗厕所、开车巡逻、修剪草坪。这些选择没有高下之分，因为它们都提供了在动中修正念的机会。我们也需要运动，心也需要多样的刺激。</w:t>
+        <w:t xml:space="preserve">疲劳是个非常非常要紧的问题，而把我们逼到那一步的，往往是我执。持咒的遍数或打坐的钟点，并不代表效果。我曾亲眼见过有功夫的禅者一坐下、心一收，立刻进入气息俱停的三昧。也有的瑜伽士能以那样的状态日复一日地坐下去。但没有人是为了坐而坐。一位有功夫的禅者，坐到这一座圆满为止，不多也不少。重点永远在质量上——我知道这是个相对的说法。但我们每个人都必须认得出：这一座结束了，该去做别的了。</w:t>
+      </w:r>
+    </w:p>
+    <w:p>
+      <w:pPr>
+        <w:spacing w:after="120" w:line="340"/>
+      </w:pPr>
+    </w:p>
+    <w:p>
+      <w:pPr>
+        <w:spacing w:after="120" w:line="340"/>
+        <w:ind w:firstLine="480"/>
+      </w:pPr>
+      <w:r>
+        <w:rPr>
+          <w:rFonts w:ascii="SimSun" w:cs="SimSun" w:eastAsia="SimSun" w:hAnsi="SimSun"/>
+        </w:rPr>
+        <w:t xml:space="preserve">下座之后我们所做的“别的事”，应当能支持整体的修行。我认识一些人会捧起书本读上几个小时（禅修往往让心格外乐于研读），也有人拿起园艺工具去园子里干活，还有人扫寺院的院子、打扫佛殿、切菜，或者像我一样去洗厕所、开车巡逻、修剪草坪。这些选择没有高下之分，因为它们都提供了在动中修正念的机会。我们也需要运动，心也需要多样的刺激。</w:t>
       </w:r>
     </w:p>
     <w:p>
@@ -5413,7 +5446,7 @@
         <w:rPr>
           <w:rFonts w:ascii="SimSun" w:cs="SimSun" w:eastAsia="SimSun" w:hAnsi="SimSun"/>
         </w:rPr>
-        <w:t xml:space="preserve">对有些人来说，所谓满足，就是探头探脑向外寻找心理刺激的那种满足。真正有用的刺激只能来自内在，因为别的一切都只会遮蔽它。可如果真是这样，我们为什么还向外求呢？难道我们的内在世界如此乏味？它若显得乏味，只是因为我们还没有把自己练到能在其中安住得够久。看不见它的神奇，并不等于神奇不在。过在我们，不在心。</w:t>
+        <w:t xml:space="preserve">对有些人来说，所谓满足，就是甘冒风险、向外寻求心理刺激的那种满足。真正有用的刺激只能来自内在，因为别的一切都只会遮蔽它。可如果真是这样，我们为什么还向外求呢？难道我们的内在世界如此乏味？它若显得乏味，只是因为我们还没有把自己练到能在其中安住得够久。看不见它的神奇，并不等于神奇不在。过在我们，不在心。</w:t>
       </w:r>
     </w:p>
     <w:p>
@@ -5447,7 +5480,7 @@
         <w:rPr>
           <w:rFonts w:ascii="SimSun" w:cs="SimSun" w:eastAsia="SimSun" w:hAnsi="SimSun"/>
         </w:rPr>
-        <w:t xml:space="preserve">问题的一部分在于：我们是很好的求取者，却是很差的领受者。我们懂得如何得到自己想要的，却不懂如何敞开心去领受自己真正需要的。我们可以学着让自己做好准备，去承接加持。但我们那种志在必得的进取心态，反倒可能断送了这番努力。</w:t>
+        <w:t xml:space="preserve">问题的一部分在于：我们是很好的求取者，却是很差的领受者。我们懂得如何得到自己想要的，却不懂如何敞开心去领受自己真正需要的。我们可以学着让自己做好准备，去承接加持。但我们一心强求满足的急切心态，反倒可能断送了这番努力。</w:t>
       </w:r>
     </w:p>
     <w:p>
@@ -5634,7 +5667,7 @@
         <w:rPr>
           <w:rFonts w:ascii="SimSun" w:cs="SimSun" w:eastAsia="SimSun" w:hAnsi="SimSun"/>
         </w:rPr>
-        <w:t xml:space="preserve">持咒或坐禅时，时间似乎过得飞快；但（除非人已在定中）之所以如此，是因为在这类修法里，背景中的种种思绪可以毫不受阻地继续运转。胡思乱想可以很有娱乐性，而且常被开脱为无害——只要咒还在，或者我们还双盘面壁、还在观呼吸（虽说观呼吸对胡思乱想的容忍度要低一些）。心分成两半，是很常见的事。相形之下，观察修（分析式的禅修）对胡思乱想毫不留情：我们不可能一边胡思乱想一边推究。这正是观察修比其他多数禅修方式更为有效的原因之一，但它也要求更多的耐心与技巧。</w:t>
+        <w:t xml:space="preserve">持咒或坐禅时，时间似乎过得飞快；但（除非人已在定中）之所以如此，是因为在这类修法里，背景中的种种思绪可以毫不受阻地继续运转。胡思乱想可以很有娱乐性，而且常被开脱为无害——只要咒还在，或者我们还双盘面壁、还在观呼吸（虽说观呼吸对胡思乱想的容忍度要低一些）。心分成两半，是很常见的事。相形之下，观察修对胡思乱想毫不留情：我们不可能一边胡思乱想一边推究。这正是观察修比其他多数禅修方式更为有效的原因之一，但它也要求更多的耐心与技巧。</w:t>
       </w:r>
     </w:p>
     <w:p>
@@ -5685,7 +5718,7 @@
         <w:rPr>
           <w:rFonts w:ascii="SimSun" w:cs="SimSun" w:eastAsia="SimSun" w:hAnsi="SimSun"/>
         </w:rPr>
-        <w:t xml:space="preserve">但“我是谁”并不是故意刁难的怪题。它的答案只以启示的方式向参究者本人到来，对其他任何人都毫无意义。这就是为什么开悟常被形容为“不可言说”。真正参究并明白这一点的人，都知道自己是要打一场长久的仗，知道自己必须学会爱上道路本身——因为那个目标遥不可及，而一旦到达，又没有任何可执取、可言说的东西。我们正是通过证悟到“那个目标想它也没有意义，更不用说去谈论”，才发生了根本的转变。</w:t>
+        <w:t xml:space="preserve">但“我是谁”并不是故意刁难的怪题。它的答案只以启示的方式向参究者本人显现，对其他任何人都毫无意义。这就是为什么开悟常被形容为“不可言说”。修自我参究而又明白这一点的人，都知道自己是要打一场长久的仗，知道自己必须学会爱上道路本身——因为那个目标远而难寻，而一旦到达，又没有任何可执取、可言说的东西。我们正是通过证悟到“那个目标想它也没有意义，更不用说去谈论”，才发生了根本的转变。</w:t>
       </w:r>
     </w:p>
     <w:p>
@@ -5764,24 +5797,24 @@
         <w:rPr>
           <w:rFonts w:ascii="SimSun" w:cs="SimSun" w:eastAsia="SimSun" w:hAnsi="SimSun"/>
         </w:rPr>
-        <w:t xml:space="preserve">佛教认为，在死亡与受生之间，我们要经过一处朦胧不明的境地，称为“中阴”（bardo），即死与生之间的境域。我们在中阴里停留多久，更要紧的是我们在那里的种种经历，若能事先熟知其中的路标、讯号、地形与话语，便会对我们大为有利；凡此种种，古今证悟的圣者都曾费尽心血地记述过，其中最著名的无疑是《中阴闻教得度》（Bardo Thodol）——一部赫赫有名而又极为详尽的指南，教人如何应对死与生“之间”的重重曲折。</w:t>
-      </w:r>
-    </w:p>
-    <w:p>
-      <w:pPr>
-        <w:spacing w:after="120" w:line="340"/>
-      </w:pPr>
-    </w:p>
-    <w:p>
-      <w:pPr>
-        <w:spacing w:after="120" w:line="340"/>
-        <w:ind w:firstLine="480"/>
-      </w:pPr>
-      <w:r>
-        <w:rPr>
-          <w:rFonts w:ascii="SimSun" w:cs="SimSun" w:eastAsia="SimSun" w:hAnsi="SimSun"/>
-        </w:rPr>
-        <w:t xml:space="preserve">这些教人死亡的手册，同样也包括如何有准备地离去、又有准备地再入。我们多数人都会在迷惑、脆弱、无助中死去，也会以同样的方式再入身躯。但事情本不必如此。只要肯花些时间研究从死亡到受生这段旅程的路线图，情形就可以好得多。“我死后会去哪里？”“我究竟还有没有来生？”——这些问题，尤其是第一个，我们不愿向自己提起，因为我们对这类讨论所必需的整套框架十分陌生。</w:t>
+        <w:t xml:space="preserve">佛教认为，在死亡与受生之间，我们要经过一处朦胧不明的境地，称为“中阴”（bardo），即死与生之间的境域。我们在中阴里停留多久，更要紧的是我们在那里的种种经历，若能事先熟知其中的路标、讯号、地形与话语，便会对我们大为有利；凡此种种，古今心地明澈的圣者都曾费尽心血地记述过，其中最著名的无疑是《中阴闻教得度》（Bardo Thodol）——一部赫赫有名而又极为详尽的指南，教人如何应对死与生“之间”的重重曲折。</w:t>
+      </w:r>
+    </w:p>
+    <w:p>
+      <w:pPr>
+        <w:spacing w:after="120" w:line="340"/>
+      </w:pPr>
+    </w:p>
+    <w:p>
+      <w:pPr>
+        <w:spacing w:after="120" w:line="340"/>
+        <w:ind w:firstLine="480"/>
+      </w:pPr>
+      <w:r>
+        <w:rPr>
+          <w:rFonts w:ascii="SimSun" w:cs="SimSun" w:eastAsia="SimSun" w:hAnsi="SimSun"/>
+        </w:rPr>
+        <w:t xml:space="preserve">这些关于临终的手册，同样也包括如何有准备地离去、又有准备地再入。我们多数人都会在迷惑、脆弱、无助中死去，也会以同样的方式再入身躯。但事情本不必如此。只要肯花些时间研究从死亡到受生这段旅程的路线图，情形就可以好得多。“我死后会去哪里？”“如果有来生，我的来生会是怎样？”——这些问题，尤其是第一个，我们不愿向自己提起，因为我们对这类讨论所必需的整套框架十分陌生。</w:t>
       </w:r>
     </w:p>
     <w:p>
@@ -5832,7 +5865,7 @@
         <w:rPr>
           <w:rFonts w:ascii="SimSun" w:cs="SimSun" w:eastAsia="SimSun" w:hAnsi="SimSun"/>
         </w:rPr>
-        <w:t xml:space="preserve">看今天的人如何推广禅修——说它是培养正念、借以改善生活的手段——我们几乎猜不到，它同样也是从此生过渡到来生的手段。大多数现代老师对这一部分避而不谈。只要我们稍加用功，去考察佛陀与古代仙人（rishi，也包括基督）的原初教导，就会发现一切佛经、圣典及其注疏，谈论来世的分量丝毫不亚于谈论我们眼下所过的这种好日子。</w:t>
+        <w:t xml:space="preserve">看今天的人如何推广禅修——说它是培养正念、借以改善生活的手段——我们几乎猜不到，它同样也是从此生过渡到来生的手段。大多数现代老师对这一部分避而不谈。只要我们稍加用功，去考察佛陀以及包括基督在内的古代仙人（rishi）的原初教导，就会发现一切佛经、圣典及其注疏，谈论来世的分量丝毫不亚于谈论我们眼下所过的这种好日子。</w:t>
       </w:r>
     </w:p>
     <w:p>
@@ -5883,7 +5916,7 @@
         <w:rPr>
           <w:rFonts w:ascii="SimSun" w:cs="SimSun" w:eastAsia="SimSun" w:hAnsi="SimSun"/>
         </w:rPr>
-        <w:t xml:space="preserve">那些认识到死亡与无身之艺术的人，其卓绝的智慧毋庸置疑。而身为健康美丽的标本，我们被“活着”迷得神魂颠倒，几乎察觉不到自身存在的另一面，并因这份疏忽而受苦良多。</w:t>
+        <w:t xml:space="preserve">那些认识到死亡与无身之艺术的人，其卓绝的智慧毋庸置疑。而正因身体健康、容貌姣好，我们被“活着”迷得神魂颠倒，几乎察觉不到自身存在的另一面，并因这份疏忽而受苦良多。</w:t>
       </w:r>
     </w:p>
     <w:p>
@@ -5934,7 +5967,7 @@
         <w:rPr>
           <w:rFonts w:ascii="SimSun" w:cs="SimSun" w:eastAsia="SimSun" w:hAnsi="SimSun"/>
         </w:rPr>
-        <w:t xml:space="preserve">佛法修持的大部分是一段孤独的旅程，而处理死亡、过渡到来世与受生这一面的佛法尤其如此。我们独自来到这世间，也将独自离去；同样，我们也可能得独自用功，去修习这“有准备地放手”之道。这个提议听来固然毫无吸引力，但只要我们尽了自己的本分，就会招感来许多加持。</w:t>
+        <w:t xml:space="preserve">佛法修持的大部分是一段孤独的旅程，而处理死亡、过渡到来世与受生这一面的佛法尤其如此。我们独自来到这世间，也将独自离去；因此，我们也可能得独自用功，去修习这“有准备地放手”之道。这个提议听来固然毫无吸引力，但只要我们尽了自己的本分，就会招感来许多加持。</w:t>
       </w:r>
     </w:p>
     <w:p>
@@ -5996,7 +6029,7 @@
         <w:rPr>
           <w:rFonts w:ascii="SimSun" w:cs="SimSun" w:eastAsia="SimSun" w:hAnsi="SimSun"/>
         </w:rPr>
-        <w:t xml:space="preserve">从事日常活动是容易的，即便那是极其复杂、需要相当技巧的活动。因为寻常事务熟悉，它们让我们觉得自己在做有意义的事，又不至于枯燥乏味。相比之下，一切参究式的禅修，永远像是上班的第一天——只不过这样的“第一天”可以、而且常常一拖就是三位数。在我们运用心的其他领域里，对与错扮演着重要角色，帮我们判断事情做得对不对；而禅修与参究中的“对”与“错”却程度不明，没有一个可以让我们咬得住的明确答案。在其他动用心思的领域，我们会别扭，直到“上手”为止，一旦上手便能驾轻就熟。但禅修却像走在流沙上：今天管用的，明天未必管用。所有的禅修手册都强调心的柔软堪能，这又有什么奇怪的呢？</w:t>
+        <w:t xml:space="preserve">从事日常活动是容易的，即便那是极其复杂、需要相当技巧的活动。因为寻常事务熟悉，它们让我们觉得自己在做有意义的事，又不至于枯燥乏味。相比之下，一切参究式的禅修，永远像是上班的第一天——只不过这样的“第一天”可能——而且常常——一拖就是上百天。在我们运用心的其他领域里，对与错扮演着重要角色，帮我们判断事情做得对不对；而禅修与参究虽也有某种程度的“对”与“错”，却没有一个可以让我们咬得住的明确答案。在其他动用心思的领域，我们会别扭，直到“上手”为止，一旦上手便能驾轻就熟。但禅修却像走在流沙上：今天管用的，明天未必管用。所有的禅修手册都强调心的柔软堪能，这又有什么奇怪的呢？</w:t>
       </w:r>
     </w:p>
     <w:p>
@@ -6047,58 +6080,58 @@
         <w:rPr>
           <w:rFonts w:ascii="SimSun" w:cs="SimSun" w:eastAsia="SimSun" w:hAnsi="SimSun"/>
         </w:rPr>
-        <w:t xml:space="preserve">沙弥或沙弥尼学会与嗔怒、淫欲以及其他扰动人心的情绪安然共处，或许大有益处，但对久修的行者却未必如此。持守梵行、收摄自制的规矩自有其位置，它教我们如何把这些能量导向禅修，转化为禅修的燃料。这门功夫一旦学会，这些情绪本不应再起，但有时仍会起来。这时候，压制也许就是错误的办法。</w:t>
-      </w:r>
-    </w:p>
-    <w:p>
-      <w:pPr>
-        <w:spacing w:after="120" w:line="340"/>
-      </w:pPr>
-    </w:p>
-    <w:p>
-      <w:pPr>
-        <w:spacing w:after="120" w:line="340"/>
-        <w:ind w:firstLine="480"/>
-      </w:pPr>
-      <w:r>
-        <w:rPr>
-          <w:rFonts w:ascii="SimSun" w:cs="SimSun" w:eastAsia="SimSun" w:hAnsi="SimSun"/>
-        </w:rPr>
-        <w:t xml:space="preserve">压制是一帖短效药，用起来只能听天由命。更好的办法是培养出把负面能量转向的本领。人各不同，有些人淫欲极强，或极易暴怒。事实上，暴怒往往正是被憋住的过盛淫欲所助燃。在佛法修持中，我们绝不应把自己逼到能够安然承受的限度之外。我们可以提升正念的力量、抵御诱惑，却不能指望百分之百成功。凡是能让我们不至于爆发、又不伤害任何人的办法，都应当去做；否则我们一定会伤害到人——伤不到别人，就伤到自己。</w:t>
-      </w:r>
-    </w:p>
-    <w:p>
-      <w:pPr>
-        <w:spacing w:after="120" w:line="340"/>
-      </w:pPr>
-    </w:p>
-    <w:p>
-      <w:pPr>
-        <w:spacing w:after="120" w:line="340"/>
-        <w:ind w:firstLine="480"/>
-      </w:pPr>
-      <w:r>
-        <w:rPr>
-          <w:rFonts w:ascii="SimSun" w:cs="SimSun" w:eastAsia="SimSun" w:hAnsi="SimSun"/>
-        </w:rPr>
-        <w:t xml:space="preserve">显而易见，如果我们领受过好的教导，就应当在自己的功课上主动用功，防止负面情绪或强烈欲望生起、酿成问题。一般而言，嗔与贪之所以生起，正是因为我们自己懈怠。扎实的日常功课几乎总能防患于未然。譬如强烈的性欲，未必就是负面的。一个性欲强的人，可供他调度的禅修能量也更多。如果他能把这股能量向内转——这个“如果”确实很大——他就会体认到这份本来会是负面情绪的东西所具有的正面潜能。嗔怒也是如此。若明知自己有这些强烈情绪，而能主动采取行动加以疏导，其负面的潜能便被扭转过来了。</w:t>
-      </w:r>
-    </w:p>
-    <w:p>
-      <w:pPr>
-        <w:spacing w:after="120" w:line="340"/>
-      </w:pPr>
-    </w:p>
-    <w:p>
-      <w:pPr>
-        <w:spacing w:after="120" w:line="340"/>
-        <w:ind w:firstLine="480"/>
-      </w:pPr>
-      <w:r>
-        <w:rPr>
-          <w:rFonts w:ascii="SimSun" w:cs="SimSun" w:eastAsia="SimSun" w:hAnsi="SimSun"/>
-        </w:rPr>
-        <w:t xml:space="preserve">当然，“疏导转向”正是密续修持的主题；密续与金刚乘一同被视为佛教最高深的修持体系。这是初学者不涉足的领域，在戒律与德行上根基未稳的人，避开它才是明智的。</w:t>
+        <w:t xml:space="preserve">沙弥或沙弥尼学会与嗔怒、淫欲以及其他扰动人心的情绪安然共处，或许大有益处，久修的行者则不然。持守梵行、收摄自制的规矩自有其位置，它教我们如何把这些能量导向禅修，转化为禅修的燃料。这门功夫一旦学会，这些情绪本不应再起，但有时仍会起来。这时候，压制也许就是错误的办法。</w:t>
+      </w:r>
+    </w:p>
+    <w:p>
+      <w:pPr>
+        <w:spacing w:after="120" w:line="340"/>
+      </w:pPr>
+    </w:p>
+    <w:p>
+      <w:pPr>
+        <w:spacing w:after="120" w:line="340"/>
+        <w:ind w:firstLine="480"/>
+      </w:pPr>
+      <w:r>
+        <w:rPr>
+          <w:rFonts w:ascii="SimSun" w:cs="SimSun" w:eastAsia="SimSun" w:hAnsi="SimSun"/>
+        </w:rPr>
+        <w:t xml:space="preserve">压制是一帖短效药，用起来只能听天由命。更好的办法是培养出把负面能量转向的本领。人各不同，有些人淫欲极强，或极易暴怒。事实上，暴怒可能正是由憋住的过盛淫欲所助燃。在佛法修持中，我们绝不应把自己逼到能够安然承受的限度之外。我们可以提升正念的力量、抵御诱惑，却不能指望百分之百成功。凡是能让我们不至于爆发、又不伤害任何人的办法，都应当去做；否则我们一定会伤害到人——伤不到别人，就伤到自己。</w:t>
+      </w:r>
+    </w:p>
+    <w:p>
+      <w:pPr>
+        <w:spacing w:after="120" w:line="340"/>
+      </w:pPr>
+    </w:p>
+    <w:p>
+      <w:pPr>
+        <w:spacing w:after="120" w:line="340"/>
+        <w:ind w:firstLine="480"/>
+      </w:pPr>
+      <w:r>
+        <w:rPr>
+          <w:rFonts w:ascii="SimSun" w:cs="SimSun" w:eastAsia="SimSun" w:hAnsi="SimSun"/>
+        </w:rPr>
+        <w:t xml:space="preserve">显而易见，如果我们领受过好的教导，就应当在自己的功课上主动用功，防止负面情绪或强烈欲望生起、酿成问题。一般而言，嗔与贪之所以生起，正是因为我们自己懈怠。扎实的日常功课几乎总能防患于未然。譬如强烈的性欲，未必就是负面的。一个性欲强的人，可供他调度的禅修能量也更多。如果他能把这股能量向内转——这个“如果”确实很大——他就能把这本来会是负面情绪的东西所蕴含的正面潜能发挥出来。嗔怒也是如此。若明知自己有这些强烈情绪，而能主动采取行动加以疏导，其负面的潜能便被扭转过来了。</w:t>
+      </w:r>
+    </w:p>
+    <w:p>
+      <w:pPr>
+        <w:spacing w:after="120" w:line="340"/>
+      </w:pPr>
+    </w:p>
+    <w:p>
+      <w:pPr>
+        <w:spacing w:after="120" w:line="340"/>
+        <w:ind w:firstLine="480"/>
+      </w:pPr>
+      <w:r>
+        <w:rPr>
+          <w:rFonts w:ascii="SimSun" w:cs="SimSun" w:eastAsia="SimSun" w:hAnsi="SimSun"/>
+        </w:rPr>
+        <w:t xml:space="preserve">当然，“疏导转向”正是密法修持的主题；密续与金刚乘一同被视为佛教最高深的修持体系。这是初学者不涉足的领域，在戒律与德行上根基未稳的人，避开它才是明智的。</w:t>
       </w:r>
     </w:p>
     <w:p>
@@ -6166,24 +6199,24 @@
         <w:rPr>
           <w:rFonts w:ascii="SimSun" w:cs="SimSun" w:eastAsia="SimSun" w:hAnsi="SimSun"/>
         </w:rPr>
-        <w:t xml:space="preserve">应当很清楚：修密续并不是满足淫欲的借口，尽管它常常被人拿来作此用途。密续无疑是佛教修持中最被误解的一项，而那些滥用它的人，必定是误解了它。</w:t>
-      </w:r>
-    </w:p>
-    <w:p>
-      <w:pPr>
-        <w:spacing w:after="120" w:line="340"/>
-      </w:pPr>
-    </w:p>
-    <w:p>
-      <w:pPr>
-        <w:spacing w:after="120" w:line="340"/>
-        <w:ind w:firstLine="480"/>
-      </w:pPr>
-      <w:r>
-        <w:rPr>
-          <w:rFonts w:ascii="SimSun" w:cs="SimSun" w:eastAsia="SimSun" w:hAnsi="SimSun"/>
-        </w:rPr>
-        <w:t xml:space="preserve">几乎所有的密法行者终其一生都持守梵行。即便是修为极高的密续大成就者，通常也不觉得需要伴侣；一旦需要，那往往也是一生一世的伴侣。密续修持固然需要伴侣，但那只在最高层次的修持上才如此——彼时一切寻常的淫念都已彻底消失。如果我们还有通常意义上的淫欲，就不能与伴侣共修密续，尽管可以独自修。</w:t>
+        <w:t xml:space="preserve">应当很清楚：修密法并不是满足淫欲的借口，尽管它常常被人拿来作此用途。密法无疑是佛教修持中最被误解的一项，而那些滥用它的人，必定是误解了它。</w:t>
+      </w:r>
+    </w:p>
+    <w:p>
+      <w:pPr>
+        <w:spacing w:after="120" w:line="340"/>
+      </w:pPr>
+    </w:p>
+    <w:p>
+      <w:pPr>
+        <w:spacing w:after="120" w:line="340"/>
+        <w:ind w:firstLine="480"/>
+      </w:pPr>
+      <w:r>
+        <w:rPr>
+          <w:rFonts w:ascii="SimSun" w:cs="SimSun" w:eastAsia="SimSun" w:hAnsi="SimSun"/>
+        </w:rPr>
+        <w:t xml:space="preserve">几乎所有的密法行者终其一生都持守梵行。即便是修为极高的密续大成就者，通常也不觉得需要伴侣；一旦需要，那往往也是一生一世的伴侣。密法修持固然需要伴侣，但那只在最高层次的修持上才如此——彼时一切寻常的淫念都已彻底消失。如果我们还有通常意义上的淫欲，就不能与伴侣共修密法，尽管可以独自修。</w:t>
       </w:r>
     </w:p>
     <w:p>
@@ -6234,7 +6267,7 @@
         <w:rPr>
           <w:rFonts w:ascii="SimSun" w:cs="SimSun" w:eastAsia="SimSun" w:hAnsi="SimSun"/>
         </w:rPr>
-        <w:t xml:space="preserve">去教堂是为了演奏或聆听音乐，这固然不是最高的动机，却也无伤大雅，因为音乐是我们自身的一种创造性表达，培养它可以视为自利利他的事。但淫欲不是创造性的表达，若以为借“神圣的双运”来修密续便能圆满开悟的智见，最终只会以灾难收场。密续典籍对一切想把密续挪作此用的人，都给出了充分的警告与免责之词，然而并非人人都肯听从。更糟的是，缺乏辨别力的人可能加入伪密续团体，这类团体不但误导人，还以密续之名鼓励不良行为与仪式化的性交。</w:t>
+        <w:t xml:space="preserve">去教堂是为了演奏或聆听音乐，这固然不是最高的动机，却也无伤大雅，因为音乐是我们自身的一种创造性表达，培养它可以视为自利利他的事。但淫欲不是创造性的表达，若以为借“神圣的双运”来修密法便能圆满开悟的观慧，最终只会以灾难收场。密续典籍对一切想把密续挪作此用的人，都给出了充分的警告与免责之词，然而并非人人都肯听从。更糟的是，缺乏辨别力的人可能加入伪密续团体，这类团体不但误导人，还以密续之名鼓励不良行为与仪式化的性交。</w:t>
       </w:r>
     </w:p>
     <w:p>
@@ -6285,7 +6318,7 @@
         <w:rPr>
           <w:rFonts w:ascii="SimSun" w:cs="SimSun" w:eastAsia="SimSun" w:hAnsi="SimSun"/>
         </w:rPr>
-        <w:t xml:space="preserve">夫妻常常并不相合，但这并不意味着他们是仇敌。欲望与觉照也是如此：二者不相合，却不是仇敌。如果我们错把欲望当作敌人，就会想除掉它、堵住它，而这两件事都不可能做到。我们却可以善用它，而这实在是唯一行得通的办法。一切瑜伽与禅修的技巧，都旨在帮助我们懂得如何运用自身的微细能量，懂得欲望不过是极微细能量的粗重显现。倘若我们明白性欲只是一种精微潜能未经提炼的显现，那么与其在它的粗重形态上开采，不如将它提炼，直接体验它的微细层面。在这里，觉照就像精炼过的油，能够推动原油所推不动的东西。</w:t>
+        <w:t xml:space="preserve">夫妻常常并不相合，但这并不意味着他们是仇敌。欲望与觉照也是如此：二者不相合，却不是仇敌。如果我们错把欲望当作敌人，就会想除掉它、堵住它，而这两件事都不可能做到。我们却可以善用它，而这实在是唯一行得通的办法。一切瑜伽与禅修的技巧，都旨在帮助我们懂得如何运用自身的微细能量，懂得欲望不过是极微细能量的粗重显现。倘若我们明白性欲只是一种精微潜能未经提炼的显现，就不会在它的粗重形态上开采，而会将它提炼，直接体验它的微细层面。在这里，觉照就像精炼过的油，能够推动原油所推不动的东西。</w:t>
       </w:r>
     </w:p>
     <w:p>
@@ -6381,7 +6414,7 @@
         <w:rPr>
           <w:rFonts w:ascii="SimSun" w:cs="SimSun" w:eastAsia="SimSun" w:hAnsi="SimSun"/>
         </w:rPr>
-        <w:t xml:space="preserve">二十世纪后半叶最著名的哲学家威拉德·范·奥曼·蒯因（Willard Van Orman Quine）沿着弗雷格开辟的路子，又指出了许多别的分歧指称，并在此过程中表明：词语需要语境才有意义。同一个词究竟指搭在马背中段的那件东西，还是两道山脊之间那道 U 形的低凹（saddle），取决于我们是要去徒步，还是准备纵马奔驰。画家“see red”究竟是指她下一笔要涂的红色，还是被同事在背后掐了一把之后的怒火，取决于“红”被放在什么语境里。你可以 cook books（做假账），也可以 cook turkey（烤火鸡）；可以 fry your nerves（把神经煎熬得受不了），也可以 fry chicken（炸鸡块）；可以 milk a cow（给母牛挤奶），也可以 milk the system（榨取体制的好处）。稍一反省便可看出：初学我们这门语言的人——无论我们的语言是哪一种——都必须学会词语的习惯用法，才能在这门语言里应付自如。</w:t>
+        <w:t xml:space="preserve">二十世纪后半叶最著名的哲学家威拉德·范·奥曼·蒯因（Willard Van Orman Quine）沿着弗雷格开辟的路子，又指出了许多别的分歧指称，并在此过程中表明：词语需要语境才有意义。同一个词究竟指搭在马背中段的那件东西，还是两道山脊之间那道 U 形的低凹（saddle），取决于我们是要去徒步，还是准备纵马奔驰。画家“see red”究竟是指她下一笔要涂的红色，还是被同事在臀部掐了一把之后的怒火，取决于“红”被放在什么语境里。你可以 cook books（做假账），也可以 cook turkey（烤火鸡）；可以 fry your nerves（把神经煎熬得受不了），也可以 fry chicken（炸鸡块）；可以 milk a cow（给母牛挤奶），也可以 milk the system（榨取体制的好处）。稍加思索便可看出：初学我们这门语言的人——无论我们的语言是哪一种——都必须学会词语的习惯用法，才能在这门语言里应付自如。</w:t>
       </w:r>
     </w:p>
     <w:p>
@@ -6466,41 +6499,41 @@
         <w:rPr>
           <w:rFonts w:ascii="SimSun" w:cs="SimSun" w:eastAsia="SimSun" w:hAnsi="SimSun"/>
         </w:rPr>
-        <w:t xml:space="preserve">当代圣者拉玛那·马哈希有一次行走时，不慎撞落了一个胡蜂窝，结果左腿爬满了螫人的胡蜂。他没有像我们多数人那样与眼前的处境认同、伸手去拍打，而是转而参究这样一个事实：胡蜂不过是照它们的处境作出恰当的反应，毕竟是他自己惊扰了蜂巢，或许他本该更留意自己走在哪里。这番参究一直持续到胡蜂自行散去，拉玛那带着一条肿胀的腿回到了道场。我们当然不能指望自己做到圣者拉玛那那样，但要点是清楚的：我们应当努力把自己安立于内在，有意识地回应外境。</w:t>
-      </w:r>
-    </w:p>
-    <w:p>
-      <w:pPr>
-        <w:spacing w:after="120" w:line="340"/>
-      </w:pPr>
-    </w:p>
-    <w:p>
-      <w:pPr>
-        <w:spacing w:after="120" w:line="340"/>
-        <w:ind w:firstLine="480"/>
-      </w:pPr>
-      <w:r>
-        <w:rPr>
-          <w:rFonts w:ascii="SimSun" w:cs="SimSun" w:eastAsia="SimSun" w:hAnsi="SimSun"/>
-        </w:rPr>
-        <w:t xml:space="preserve">眼下我们的自我觉知也许还很微弱，任由外境摆布。但这些身份认同并非固定不变，随着我们修习向内、不断把心转向内在、锲而不舍地抗拒向外，它们很容易被瓦解。我们也可以在拍掉脖子上的蜜蜂之前迟疑一下、反省片刻，在冲动行事之前插入一个自我觉知的瞬间。带着明确的意愿把它拂开，与冲动之下的拍打截然不同，并且会加深我们在自我觉知中的扎根。</w:t>
-      </w:r>
-    </w:p>
-    <w:p>
-      <w:pPr>
-        <w:spacing w:after="120" w:line="340"/>
-      </w:pPr>
-    </w:p>
-    <w:p>
-      <w:pPr>
-        <w:spacing w:after="120" w:line="340"/>
-        <w:ind w:firstLine="480"/>
-      </w:pPr>
-      <w:r>
-        <w:rPr>
-          <w:rFonts w:ascii="SimSun" w:cs="SimSun" w:eastAsia="SimSun" w:hAnsi="SimSun"/>
-        </w:rPr>
-        <w:t xml:space="preserve">反思性的自我觉知（reflective）与反射性的自我觉知（reflexive）之间有着重大的差别。在一个本来会是条件反射的动作之前，哪怕只反省一瞬，也能使我们从虚假的身份中脱离出来，安立于“我们究竟是谁”的核心。但这需要练习，需要大量的练习，因为习气的力量像一列货运列车，它的惯性不会因为我们的善愿与高尚意图而止息。新的习惯、新的应对生活挑战的方式，必须给它们时间扎根，而在这期间我们需要耐心。</w:t>
+        <w:t xml:space="preserve">当代圣者拉玛那·马哈希（Ramana Maharshi）有一次行走时，不慎撞落了一个胡蜂窝，结果左腿爬满了螫人的胡蜂。他没有像我们多数人那样与眼前的处境认同、伸手去拍打，而是转而参究这样一个事实：胡蜂不过是照它们的处境作出恰当的反应，毕竟是他自己惊扰了蜂巢，或许他本该更留意自己走在哪里。这番参究一直持续到胡蜂自行散去，拉玛那带着一条肿胀的腿回到了道场。我们当然不能指望自己做到圣者拉玛那那样，但要点是清楚的：我们应当努力把自己安立于内在，有意识地回应外境。</w:t>
+      </w:r>
+    </w:p>
+    <w:p>
+      <w:pPr>
+        <w:spacing w:after="120" w:line="340"/>
+      </w:pPr>
+    </w:p>
+    <w:p>
+      <w:pPr>
+        <w:spacing w:after="120" w:line="340"/>
+        <w:ind w:firstLine="480"/>
+      </w:pPr>
+      <w:r>
+        <w:rPr>
+          <w:rFonts w:ascii="SimSun" w:cs="SimSun" w:eastAsia="SimSun" w:hAnsi="SimSun"/>
+        </w:rPr>
+        <w:t xml:space="preserve">眼下我们的自我觉知也许还很微弱，任由外境摆布。但这些身份认同并非固定不变，随着我们修习向内、不断把心转向内在、锲而不舍地抗拒向外，它们很容易被瓦解。我们也可以在拍掉脖子上的蜜蜂之前迟疑一下、反省片刻，在冲动行事之前插入一个自我觉知的瞬间。带着明确的意愿把它拍掉，与凭一时冲动拍掉截然不同，并且会加深我们在自我觉知中的扎根。</w:t>
+      </w:r>
+    </w:p>
+    <w:p>
+      <w:pPr>
+        <w:spacing w:after="120" w:line="340"/>
+      </w:pPr>
+    </w:p>
+    <w:p>
+      <w:pPr>
+        <w:spacing w:after="120" w:line="340"/>
+        <w:ind w:firstLine="480"/>
+      </w:pPr>
+      <w:r>
+        <w:rPr>
+          <w:rFonts w:ascii="SimSun" w:cs="SimSun" w:eastAsia="SimSun" w:hAnsi="SimSun"/>
+        </w:rPr>
+        <w:t xml:space="preserve">反思性的自我觉知（reflective）与反射性的自我觉知（reflexive）之间有着重大的差别。在一个本来会是条件反射的动作之前，哪怕只反省一瞬，也能使我们从虚假的身份中脱离出来，安立于“我们究竟是谁”的核心。但这需要练习，需要大量的练习，因为习气的力量像一列货运列车，它的惯性不会因为我们的善愿与高尚意愿而止息。新的习惯、新的应对生活挑战的方式，必须给它们时间扎根，而在这期间我们需要耐心。</w:t>
       </w:r>
     </w:p>
     <w:p>
@@ -6596,7 +6629,7 @@
         <w:rPr>
           <w:rFonts w:ascii="SimSun" w:cs="SimSun" w:eastAsia="SimSun" w:hAnsi="SimSun"/>
         </w:rPr>
-        <w:t xml:space="preserve">如果我们能培养出这样一种能力：安坐于自我觉知之中，不借助咒语或其他任何“技巧”，并且到达一种被内在吸引的状态，那么我们对自我的信念便已扎根。由此获得的力量，可以运用到其他属于外在修法的禅修技巧上。禅修技巧容易助长依赖，使人相信一种在我们自身之外的力量，从而把信心寄托在技巧而非自己身上。但如果我们一开始就修习赤裸的自我觉知，就会对自己有一种不可动摇的信心，无论此后采用哪一种修法，都能有一个正确的起步。</w:t>
+        <w:t xml:space="preserve">如果我们能培养出这样一种能力：安坐于自我觉知之中，不借助咒语或其他任何“技巧”，并且到达一种被内在吸引的状态，那么我们对自我的信念便开始扎根了。由此获得的力量，可以运用到其他属于外在修法的禅修技巧上。禅修技巧容易助长依赖，使人相信一种在我们自身之外的力量，从而把信心寄托在技巧而非自己身上。但如果我们一开始就修习赤裸的自我觉知，就会对自己有一种不可动摇的信心，无论此后采用哪一种修法，都能有一个正确的起步。</w:t>
       </w:r>
     </w:p>
     <w:p>
@@ -6630,24 +6663,24 @@
         <w:rPr>
           <w:rFonts w:ascii="SimSun" w:cs="SimSun" w:eastAsia="SimSun" w:hAnsi="SimSun"/>
         </w:rPr>
-        <w:t xml:space="preserve">坚实的现实是我们的竞争对手。这并不奇怪，因为自从来到这个世界，我们所熟习的正是它。问题还因这一点而加重：我们几乎必定会把自我参究与“坚实的现实”对立起来，质疑前者的价值。更为明达的看法是：这两者其实并不相争，世界与自我参究完全可以并行不悖。</w:t>
-      </w:r>
-    </w:p>
-    <w:p>
-      <w:pPr>
-        <w:spacing w:after="120" w:line="340"/>
-      </w:pPr>
-    </w:p>
-    <w:p>
-      <w:pPr>
-        <w:spacing w:after="120" w:line="340"/>
-        <w:ind w:firstLine="480"/>
-      </w:pPr>
-      <w:r>
-        <w:rPr>
-          <w:rFonts w:ascii="SimSun" w:cs="SimSun" w:eastAsia="SimSun" w:hAnsi="SimSun"/>
-        </w:rPr>
-        <w:t xml:space="preserve">培养自我参究，看上去也许不过是形而上的空想。由于没有任何可以抓住的实在之物，自我参究似乎是一场我们不愿下注的赌博。当疑惑积聚、变得尖锐时，我们的决心可能动摇，转而投向那些看得见摸得着的东西——这种诱惑也许无法抵挡。这一困局之所以生起，是因为没有看清：自我参究并不比我们生活中的其他任何事物更不坚实。那些对教会的信心坚定到足以让他们持守良好习惯与戒条的人，我们随处可见。从对教会的信，到对自我参究的信，不过一步之遥——只要有一点耐心，我们自己就能验证这一点。</w:t>
+        <w:t xml:space="preserve">坚实的现实是我们的竞争对手。这并不奇怪，因为自从来到这个世界，我们所熟习的正是它。问题还因这一点而加重：我们几乎必定会把自我参究与“坚实的现实”对立起来，质疑前者的价值。更为明澈的看法是：这两者其实并不相争，世界与自我参究完全可以并行不悖。</w:t>
+      </w:r>
+    </w:p>
+    <w:p>
+      <w:pPr>
+        <w:spacing w:after="120" w:line="340"/>
+      </w:pPr>
+    </w:p>
+    <w:p>
+      <w:pPr>
+        <w:spacing w:after="120" w:line="340"/>
+        <w:ind w:firstLine="480"/>
+      </w:pPr>
+      <w:r>
+        <w:rPr>
+          <w:rFonts w:ascii="SimSun" w:cs="SimSun" w:eastAsia="SimSun" w:hAnsi="SimSun"/>
+        </w:rPr>
+        <w:t xml:space="preserve">培养自我参究，看上去也许不过是形而上的空想。由于没有任何可以抓住的实在之物，自我参究似乎是一场我们不愿下注的赌博。当疑惑积聚、变得尖锐时，我们的决心可能动摇，想要就此放弃、转投那些看得见摸得着的东西——这种诱惑也许无法抵挡。这一困局之所以生起，是因为没有看清：自我参究并不比我们生活中的其他任何事物更不坚实。那些对教会的信心坚定到足以让他们持守良好习惯与戒条的人，我们随处可见。从对教会的信，到自我参究，不过一步之遥——只要有一点耐心，我们自己就能验证这一点。</w:t>
       </w:r>
     </w:p>
     <w:p>
@@ -6777,7 +6810,7 @@
         <w:rPr>
           <w:rFonts w:ascii="SimSun" w:cs="SimSun" w:eastAsia="SimSun" w:hAnsi="SimSun"/>
         </w:rPr>
-        <w:t xml:space="preserve">我慢不仅使人不愿向他人请教，也常使人不肯从书本中求指导。哪怕自己的禅修还很生疏，我们仍旧深信不疑。凡是暗示我们不懂门道的东西，我们都不爱听。</w:t>
+        <w:t xml:space="preserve">我慢不仅使人不愿向他人请教，也常使人不肯从书本中求指导。哪怕自己的禅修还很生疏，我们仍旧对它深信不疑。凡是暗示我们不懂门道的东西，我们都不爱听。</w:t>
       </w:r>
     </w:p>
     <w:p>
@@ -7105,7 +7138,7 @@
         <w:rPr>
           <w:rFonts w:ascii="SimSun" w:cs="SimSun" w:eastAsia="SimSun" w:hAnsi="SimSun"/>
         </w:rPr>
-        <w:t xml:space="preserve">不请自来的建议很少出于善意，大可置之不理。但我们可以、也应当主动请教。只是，该向谁请教呢？这要看住在哪里——有些人或许能在自己所在的城市或附近听到著名大德开示。我住在洛杉矶附近时，曾参加达赖喇嘛尊者为期四天的讲座；后来又与家人一同参加了在华盛顿特区为期十天的教授。其他巡访大德的开示，我们也常常一家人一起去听。</w:t>
+        <w:t xml:space="preserve">不请自来的建议很少出于善意，大可置之不理。但我们可以、也应当主动请教。只是，该向谁请教呢？这要看住在哪里——有些人或许能在自己所在的城市或附近，听到来访的著名大德开示。我住在洛杉矶附近时，曾参加达赖喇嘛尊者为期四天的讲座；也曾与家人一同参加了在华盛顿特区为期十天的教授。其他巡访大德的开示，我们也常常一家人一起去听。</w:t>
       </w:r>
     </w:p>
     <w:p>
@@ -7150,24 +7183,24 @@
         <w:rPr>
           <w:rFonts w:ascii="SimSun" w:cs="SimSun" w:eastAsia="SimSun" w:hAnsi="SimSun"/>
         </w:rPr>
-        <w:t xml:space="preserve">找到老师，是一种卸下重担。有了老师，我们可以比从前用功得多，却感觉不到那么吃力。找到自己老师的学生，常有一种所向无敌、无所畏惧的感觉，就像小孩子跟着大哥走在镇上一样。好的老师是与自己相应的老师；当我们皈依依止他、道路因此明澈时，我们自己知道。如果没有那种势不可挡的感觉，我们大概就得重新掂量这位老师了——这种情况并不少见。我们的心态必须是极大的信心，因为那正是老师应当在我们心中植入的。若非如此，这位老师很可能本身具格，只是与我们不相应。</w:t>
-      </w:r>
-    </w:p>
-    <w:p>
-      <w:pPr>
-        <w:spacing w:after="120" w:line="340"/>
-      </w:pPr>
-    </w:p>
-    <w:p>
-      <w:pPr>
-        <w:spacing w:after="120" w:line="340"/>
-        <w:ind w:firstLine="480"/>
-      </w:pPr>
-      <w:r>
-        <w:rPr>
-          <w:rFonts w:ascii="SimSun" w:cs="SimSun" w:eastAsia="SimSun" w:hAnsi="SimSun"/>
-        </w:rPr>
-        <w:t xml:space="preserve">上面所说的这些，并不是灵性领域独有的。各种运动都建议请私人教练，学业上有家教；从书籍装帧到音乐、烹饪、礼仪，以及其他可能吸引我们的事情，也都有老师。灵性之事关系重大得多，所需时间也长得多，但这个类比仍然贴切，因为它说明了有人引导与单打独斗之间的差别。我们不仅要用功，还要用得有效率，而这就非有老师不可。</w:t>
+        <w:t xml:space="preserve">找到老师，是一种卸下重担。有了老师，我们可以比从前用功得多，却感觉不到那么吃力。找到自己老师的学生，常有一种所向无敌、无所畏惧的感觉，就像小孩子跟着大哥走在镇上一样。好的老师是与自己相应的老师；当我们皈依于他、道路因此明澈时，自己心里就会知道。如果没有那种势不可挡的感觉，我们大概就得重新掂量这位老师了——这种情况并不少见。我们的心态必须是极大的信心，因为那正是老师应当在我们心中植入的。若非如此，这位老师很可能本身具格，只是与我们不相应。</w:t>
+      </w:r>
+    </w:p>
+    <w:p>
+      <w:pPr>
+        <w:spacing w:after="120" w:line="340"/>
+      </w:pPr>
+    </w:p>
+    <w:p>
+      <w:pPr>
+        <w:spacing w:after="120" w:line="340"/>
+        <w:ind w:firstLine="480"/>
+      </w:pPr>
+      <w:r>
+        <w:rPr>
+          <w:rFonts w:ascii="SimSun" w:cs="SimSun" w:eastAsia="SimSun" w:hAnsi="SimSun"/>
+        </w:rPr>
+        <w:t xml:space="preserve">上面所说的这些，并不是灵性领域独有的。各种运动都建议请私人教练，学业上有家教；从书籍装帧到音乐、烹饪、礼仪，以及其他可能吸引我们的事情，也都有老师。灵性之事关系重大得多，所需时间也长得多，但这个类比仍然贴切，因为它说明了有人引导胜于单打独斗。我们不仅要用功，还要用得有效率，而这就非有老师不可。</w:t>
       </w:r>
     </w:p>
     <w:p>
@@ -7218,41 +7251,41 @@
         <w:rPr>
           <w:rFonts w:ascii="SimSun" w:cs="SimSun" w:eastAsia="SimSun" w:hAnsi="SimSun"/>
         </w:rPr>
-        <w:t xml:space="preserve">一位好老师能极大地帮助我们认清自己力所能及的分寸，既不让我们太松懈，也不让我们太躁进。该守时他提醒我们守，该动时他鼓励我们动，这帮助我们专注于脚下的路。倘若你身处高树林中，颈上挂着一只指南针，心里自然踏实得多。禅修方法与哲学见地之繁杂，本是一团难以理清的乱麻；但有一位识途者引导，便不再如此。</w:t>
-      </w:r>
-    </w:p>
-    <w:p>
-      <w:pPr>
-        <w:spacing w:after="120" w:line="340"/>
-      </w:pPr>
-    </w:p>
-    <w:p>
-      <w:pPr>
-        <w:spacing w:after="120" w:line="340"/>
-        <w:ind w:firstLine="480"/>
-      </w:pPr>
-      <w:r>
-        <w:rPr>
-          <w:rFonts w:ascii="SimSun" w:cs="SimSun" w:eastAsia="SimSun" w:hAnsi="SimSun"/>
-        </w:rPr>
-        <w:t xml:space="preserve">只要我们为依止作好准备，机缘自会找上门来。最令一位师父欢喜的，莫过于发现一个可堪作弟子的成熟学人。这一点在各行各业都是如此——体育、学术、医学、科学以及其他学科皆然。我们以自己的受教之心，感召来自己前行所需的一切。如前所述，这在灵性之事上尤为关键，因为一个崇高的理想所要求的是终身的承担。人生中没有哪一项事业有如此之高的利害，也没有哪一项能给予如此之多。</w:t>
-      </w:r>
-    </w:p>
-    <w:p>
-      <w:pPr>
-        <w:spacing w:after="120" w:line="340"/>
-      </w:pPr>
-    </w:p>
-    <w:p>
-      <w:pPr>
-        <w:spacing w:after="120" w:line="340"/>
-        <w:ind w:firstLine="480"/>
-      </w:pPr>
-      <w:r>
-        <w:rPr>
-          <w:rFonts w:ascii="SimSun" w:cs="SimSun" w:eastAsia="SimSun" w:hAnsi="SimSun"/>
-        </w:rPr>
-        <w:t xml:space="preserve">有了老师，还附带一个好处：成为他僧团中的一员——那就像一个法上的家庭。同一位老师座下的同门之间的纽带称为三昧耶（samaya），这个梵文词的意思是“誓约”。弟子之间的三昧耶是佛法修持中不可或缺的一环，它的作用是化去对自己的贪着，转而利益整体。除了共有利他求证悟之志所带来的那份无形的同袍情谊之外，还有一个实际的好处：能与同修道友彼此交流见解、辩论、探究。格鲁派各大寺院每晚的辩经就是极好的例证——僧人与在家人每天傍晚都要辩上几个小时，周末下午也如此，场面十分热烈。</w:t>
+        <w:t xml:space="preserve">一位好老师能极大地帮助我们认清自己力所能及的分寸，既不让我们太松懈，也不让我们太躁进。该守时他提醒我们守，该动时他鼓励我们动，这帮助我们专注于脚下的路。倘若你身处一片高木参天的森林，颈上挂着一只指南针，心里自然踏实得多。禅修方法与哲学见地之繁杂，本是一团难以理清的乱麻；但有一位识途者引导，便不再如此。</w:t>
+      </w:r>
+    </w:p>
+    <w:p>
+      <w:pPr>
+        <w:spacing w:after="120" w:line="340"/>
+      </w:pPr>
+    </w:p>
+    <w:p>
+      <w:pPr>
+        <w:spacing w:after="120" w:line="340"/>
+        <w:ind w:firstLine="480"/>
+      </w:pPr>
+      <w:r>
+        <w:rPr>
+          <w:rFonts w:ascii="SimSun" w:cs="SimSun" w:eastAsia="SimSun" w:hAnsi="SimSun"/>
+        </w:rPr>
+        <w:t xml:space="preserve">只要我们为依止作好准备，机缘自会找上门来。最令一位师父欢喜的，莫过于发现一个可堪作弟子的成熟学人。这一点在各行各业都是如此——体育、学术、医学、科学以及其他学科皆然。我们以自己的受教之心，感召来自己前行所需的一切。如前所述，这在灵性之事上尤为关键，因为一个崇高的理想所要求的是终身的承担。人生中没有哪一项事业关系如此重大，也没有哪一项能给予如此之多。</w:t>
+      </w:r>
+    </w:p>
+    <w:p>
+      <w:pPr>
+        <w:spacing w:after="120" w:line="340"/>
+      </w:pPr>
+    </w:p>
+    <w:p>
+      <w:pPr>
+        <w:spacing w:after="120" w:line="340"/>
+        <w:ind w:firstLine="480"/>
+      </w:pPr>
+      <w:r>
+        <w:rPr>
+          <w:rFonts w:ascii="SimSun" w:cs="SimSun" w:eastAsia="SimSun" w:hAnsi="SimSun"/>
+        </w:rPr>
+        <w:t xml:space="preserve">有了老师，还附带一个好处：成为他僧团中的一员——那就像一个灵性的大家庭。同一位老师座下的同门之间的纽带称为三昧耶（samaya），这个梵文词的意思是“誓约”。弟子之间的三昧耶是佛法修持中不可或缺的一环，它的作用是化去对自己的贪着，转而利益整体。除了共有利他求证悟之志所带来的那份无形的同袍情谊之外，还有一个实际的好处：能与同修道友彼此交流见解、辩论、探究。大多数格鲁派寺院每晚的辩经就是极好的例证——僧人与在家人每天傍晚都要辩上几个小时，周末下午也如此，场面十分热烈。</w:t>
       </w:r>
     </w:p>
     <w:p>
@@ -7348,7 +7381,7 @@
         <w:rPr>
           <w:rFonts w:ascii="SimSun" w:cs="SimSun" w:eastAsia="SimSun" w:hAnsi="SimSun"/>
         </w:rPr>
-        <w:t xml:space="preserve">佛门有一句名言：“慎勿信汝意。”研习为心的成长提供了一个框架；这个框架虽是人为的，却不可或缺。没有框架，我们很容易进入虚假的禅定境界，还以为那是真的。这些心识上的境界可能带有乐受，生出喜悦、轻安等种种享受，却毫无依据可言。而植根于正解的禅修体验，则伴随着观慧：这观慧随动机而生起，是真实的，并自然而然地贯穿我们每一次打坐。</w:t>
+        <w:t xml:space="preserve">佛门有一句名言：“慎勿信汝意。”研习为心的成长提供了一个框架；这个框架虽是人为的，却不可或缺。没有框架，我们很容易进入虚假的禅定境界，还以为那是真的。这些心识上的境界可能带有乐受，生出喜悦、轻盈等种种享受，却毫无依据可言。而植根于正解的禅修体验，则伴随着观慧：这观慧随动机而生起，是真实的，并自然而然地贯穿我们每一次打坐。</w:t>
       </w:r>
     </w:p>
     <w:p>
@@ -7450,7 +7483,7 @@
         <w:rPr>
           <w:rFonts w:ascii="SimSun" w:cs="SimSun" w:eastAsia="SimSun" w:hAnsi="SimSun"/>
         </w:rPr>
-        <w:t xml:space="preserve">把禅修的动机普世化，能让我们跳出流行禅修运动的狭隘范围——那种东西我称之为“留意”，因为尽管它自称是禅修，就灵性意义而言并不是禅修。有一个远为重大的问题是“留意”无法触及的，那就是我们对自身存在本身的无明。正是要洞穿这一奥秘，才应当成为我们禅修动机的根本，而不是个人的烦恼——顺带一提，那些个人烦恼在这场更大的参究中自会消融。</w:t>
+        <w:t xml:space="preserve">把禅修的动机普世化，能让我们跳出流行禅修运动的狭隘范围——那种东西我称之为“留意”，因为尽管它自称是禅修，就灵性意义而言并不是禅修。有一个远为重大的问题是“留意”无法触及的，那就是我们对自身存在本身的无明。我们禅修的动机，应当正是要洞穿这一奥秘，而不是个人的烦恼——顺带一提，那些个人烦恼在这场更大的参究中自会消融。</w:t>
       </w:r>
     </w:p>
     <w:p>
@@ -7495,24 +7528,24 @@
         <w:rPr>
           <w:rFonts w:ascii="SimSun" w:cs="SimSun" w:eastAsia="SimSun" w:hAnsi="SimSun"/>
         </w:rPr>
-        <w:t xml:space="preserve">无论我们信奉什么宗教，本体论承诺都至关重要。既然选定了某一种修持形式，就应当坚持下去，直到得到成果，或确知不会得到成果为止。在一个传统之内更换修法，或更换传统本身，其时机到来时不会是我们主动作出的选择，而是形势自然把它推到我们面前。若以为选择权在我们手里，我们只会在一种法门与另一种法门之间疲于奔命，像打水漂的石头，跳不了几下就沉了下去。</w:t>
-      </w:r>
-    </w:p>
-    <w:p>
-      <w:pPr>
-        <w:spacing w:after="120" w:line="340"/>
-      </w:pPr>
-    </w:p>
-    <w:p>
-      <w:pPr>
-        <w:spacing w:after="120" w:line="340"/>
-        <w:ind w:firstLine="480"/>
-      </w:pPr>
-      <w:r>
-        <w:rPr>
-          <w:rFonts w:ascii="SimSun" w:cs="SimSun" w:eastAsia="SimSun" w:hAnsi="SimSun"/>
-        </w:rPr>
-        <w:t xml:space="preserve">无论选择哪一种宗教，也无论在那个传统内选择哪一种修法，我们都必须全力以赴，抱定死守到底的决心。唯有这样的态度，才能感召到我们所需的加持，化去自身的障碍、烦恼与过失，最终得以把心力专注于宗教修持中那些关乎存在本身的课题。灵性修持有很大一部分是打基础，而打基础对所有宗教都是一样的，通常要花一到三年。到基础打好时，我们应当已经认同自己所选的这一宗教传统；如果没有，也可以改投一个自己觉得更相应的宗教。此后十年之内，大概不会再有改换的需要，甚至再也不会有。不过确实也会发生这样的情况：有成就的行者发现某些自己想深入的禅修方法，在本传统中发展得不够充分。在这种情况下，一位师父留在自己的传统内，同时向另一传统中以自己所欠缺的某种修持见长的上师求受灌顶，也并不罕见。</w:t>
+        <w:t xml:space="preserve">无论我们信奉什么宗教，本体论承诺都至关重要。既然选定了某一种修持形式，就应当坚持下去，直到得到成果，或确知不会得到成果为止。何时在一个传统之内更换修法，或更换传统本身，并不由我们自己选择；时机成熟时，形势自会把它推到我们面前。若以为选择权在我们手里，我们只会在一种法门与另一种法门之间疲于奔命，像打水漂的石头，跳不了几下就沉了下去。</w:t>
+      </w:r>
+    </w:p>
+    <w:p>
+      <w:pPr>
+        <w:spacing w:after="120" w:line="340"/>
+      </w:pPr>
+    </w:p>
+    <w:p>
+      <w:pPr>
+        <w:spacing w:after="120" w:line="340"/>
+        <w:ind w:firstLine="480"/>
+      </w:pPr>
+      <w:r>
+        <w:rPr>
+          <w:rFonts w:ascii="SimSun" w:cs="SimSun" w:eastAsia="SimSun" w:hAnsi="SimSun"/>
+        </w:rPr>
+        <w:t xml:space="preserve">无论选择哪一种宗教，也无论在那个传统内选择哪一种修法，我们都必须全力以赴，抱定死守到底的决心。唯有这样的态度，才能感召到我们所需的加持，化去自身的障碍、烦恼与过失，最终得以把心力专注于宗教修持中那些关乎存在本身的课题。灵性修持有很大一部分是打基础，而打基础对所有宗教都是一样的，通常要花一到三年。到基础打好时，我们应当已经认同自己所选的这一宗教传统；如果没有，也可以改投一个自己觉得更相应的宗教。此后十年之内，都不会再感到需要改换，甚至可能永远不会。不过确实也会发生这样的情况：有成就的行者发现某些自己想深入的禅修方法，在本传统中发展得不够充分。在这种情况下，一位师父留在自己的传统内，同时向另一传统中以自己所欠缺的某种修持见长的上师求受灌顶，也并不罕见。</w:t>
       </w:r>
     </w:p>
     <w:p>
@@ -7546,7 +7579,7 @@
         <w:rPr>
           <w:rFonts w:ascii="SimSun" w:cs="SimSun" w:eastAsia="SimSun" w:hAnsi="SimSun"/>
         </w:rPr>
-        <w:t xml:space="preserve">在当今各大宗教中，基督教最不容易受其他宗教影响，但这种情况正在迅速改变。“造物主”“人子”“玛利亚”“选民”这些观念，如今即便在基督教内部，也在以更为开明的眼光来看待。当然，佛教或印度教的禅修方法，完全可以由一位理解力足够深入、心胸足够开放的人在基督教环境中加以运用。佛教徒或印度教徒采纳基督教禅修法的情形较为少见，主要是因为这类方法本就稀少，但也绝非闻所未闻。在印度教这边，把基督教修法引入印度教环境的两位大圣者，可见于帕拉宏撒·尤迦南达（Paramahansa Yogananda）与拉玛那·马哈希的生平——这两位大师都常常引用《圣经》。</w:t>
+        <w:t xml:space="preserve">在当今各大宗教中，基督教最不容易受其他宗教影响，但这种情况正在迅速改变。“造物主”“人子”“玛利亚”“选民”这些观念，如今即便在基督教内部，也在以更为开明的眼光来看待。当然，佛教或印度教的禅修方法，完全可以由一位理解力足够深入、心胸足够开放的人在基督教环境中加以运用。佛教徒或印度教徒采纳基督教禅修法的情形较为少见，主要是因为这类方法本就稀少，但也绝非闻所未闻。在印度教这边，帕拉宏撒·尤迦南达（Paramahansa Yogananda）与拉玛那·马哈希的生平，便是两位大圣者把基督教修法引入印度教环境的例证——这两位大师都常常引用《圣经》。</w:t>
       </w:r>
     </w:p>
     <w:p>
@@ -7659,24 +7692,24 @@
         <w:rPr>
           <w:rFonts w:ascii="SimSun" w:cs="SimSun" w:eastAsia="SimSun" w:hAnsi="SimSun"/>
         </w:rPr>
-        <w:t xml:space="preserve">有人富有，有人在情感上并不坚强，有人则很软弱，然而给予的能力始终都在。对于被抑郁、嗔怒、憎恨所苦的人来说，布施或许是最好的疗法，因为负面情绪无一例外都是无法与他人相连的症状。也许最好的疗法正是慷慨——舍弃财富与执着。也许，一点点慷慨所需的微小努力，比任何别的办法（包括心理治疗）都更能卸下烦恼情绪这副昂贵的重担。这一点也许不那么显而易见：烦恼情绪其实是自私的结果，而对治自私，还有什么比布施更好？顺着这个思路再说一句：物质礼物的价值，在于施予者的动机，而不在于所赠之物的价格。</w:t>
-      </w:r>
-    </w:p>
-    <w:p>
-      <w:pPr>
-        <w:spacing w:after="120" w:line="340"/>
-      </w:pPr>
-    </w:p>
-    <w:p>
-      <w:pPr>
-        <w:spacing w:after="120" w:line="340"/>
-        <w:ind w:firstLine="480"/>
-      </w:pPr>
-      <w:r>
-        <w:rPr>
-          <w:rFonts w:ascii="SimSun" w:cs="SimSun" w:eastAsia="SimSun" w:hAnsi="SimSun"/>
-        </w:rPr>
-        <w:t xml:space="preserve">领受与给予是相连的：如果我们慷慨地给予，也就更可能优雅地领受。这一切与社会地位、阶级、收入群体、智力高低，或其他被强加为自我价值标准的社会分别都无关——凡此种种，都可能掩盖着一颗破产的心。一切系于我们那份纯真而发自内心的意愿：做佛法的守护者，并以与之相称的方式行事。</w:t>
+        <w:t xml:space="preserve">有人富有，有人不然；有人情感坚强，有人脆弱；然而给予的能力始终都在。对于被抑郁、嗔怒、憎恨所苦的人来说，布施或许是最好的疗法，因为负面情绪无一例外都是无法与他人相连的症状。也许最好的疗法正是慷慨——舍弃财富与执着。也许，一点点慷慨所需的微小努力，比任何别的办法（包括心理治疗）都更能卸下烦恼情绪这副昂贵的重担。这一点也许不那么显而易见：烦恼情绪其实是自私的结果，而对治自私，还有什么比布施更好？顺着这个思路再说一句：物质礼物的价值，在于施予者的动机，而不在于所赠之物的价格。</w:t>
+      </w:r>
+    </w:p>
+    <w:p>
+      <w:pPr>
+        <w:spacing w:after="120" w:line="340"/>
+      </w:pPr>
+    </w:p>
+    <w:p>
+      <w:pPr>
+        <w:spacing w:after="120" w:line="340"/>
+        <w:ind w:firstLine="480"/>
+      </w:pPr>
+      <w:r>
+        <w:rPr>
+          <w:rFonts w:ascii="SimSun" w:cs="SimSun" w:eastAsia="SimSun" w:hAnsi="SimSun"/>
+        </w:rPr>
+        <w:t xml:space="preserve">领受与给予是相连的：如果我们慷慨地给予，也就更可能心怀感恩地领受。这一切与社会地位、阶级、收入群体、智力高低，或其他被强加为自我价值标准的社会分别都无关——凡此种种，都可能掩盖着一颗破产的心。一切系于我们那份纯真而发自内心的意愿：做佛法的守护者，并以与之相称的方式行事。</w:t>
       </w:r>
     </w:p>
     <w:p>
@@ -7710,7 +7743,7 @@
         <w:rPr>
           <w:rFonts w:ascii="SimSun" w:cs="SimSun" w:eastAsia="SimSun" w:hAnsi="SimSun"/>
         </w:rPr>
-        <w:t xml:space="preserve">一个好的起点，是每天花一点时间，思量我们生活中那些日常物品，以及制造它们的人。他们过着怎样的生活，住在哪里，有什么忧虑，有什么需要，是否被公平对待，是不是年纪太老或太小而不该在做工？这些问题看似老生常谈，是因为我们从未深入想过，以至于对那些人生不起真切的关怀——我们的食物、衣服、汽车，以及种种随手取用之物，都亏欠于他们。</w:t>
+        <w:t xml:space="preserve">一个好的起点，是每天花一点时间，思量我们生活中那些日常物品，以及制造它们的人。他们过着怎样的生活，住在哪里，有什么忧虑，有什么需要，是否被公平对待，是不是年纪太老或太小而不该在做工？这些问题看似老生常谈，是因为我们从未深入想过，以至于对那些人生不起真切的关怀——我们能有食物、衣服、汽车，以及种种随手取用、却从不曾想过是谁辛苦造出的物品，都是受惠于他们。</w:t>
       </w:r>
     </w:p>
     <w:p>
@@ -7829,7 +7862,7 @@
         <w:rPr>
           <w:rFonts w:ascii="SimSun" w:cs="SimSun" w:eastAsia="SimSun" w:hAnsi="SimSun"/>
         </w:rPr>
-        <w:t xml:space="preserve">因缘到了，我们的处境自会改变，不需刻意营造。只要动机端正，我们需要什么就会感召什么。明白了这一点，还有什么可求、可取的呢？不如把心思放在他人的需要与福祉上。透过祈祷、禅修的力量，或以财物、劳务供养他人，我们所能为自己脸上带来的笑容，胜过任何别的事情。既然他人无量而自己只有一个，那么简单算一笔账就明白：当我们设法让他人快乐，而不只是利益自己时，我们获得快乐的可能性也随之增大。</w:t>
+        <w:t xml:space="preserve">因缘到了，我们的处境自会改变，不需刻意营造。只要动机端正，我们需要什么就会感召什么。明白了这一点，还有什么可求、可取的呢？不如把心思放在他人的需要与福祉上。透过祈祷、禅修的力量，或以财物、劳务供养他人，我们所能为自己脸上带来的笑容，胜过任何别的事情。既然他人众多而自己只有一个，那么简单算一笔账就明白：当我们设法让他人快乐，而不只是利益自己时，我们获得快乐的可能性也随之增大。</w:t>
       </w:r>
     </w:p>
     <w:p>
@@ -7881,7 +7914,7 @@
           <w:ilvl w:val="0"/>
           <w:numId w:val="1"/>
         </w:numPr>
-        <w:spacing w:after="100" w:line="340"/>
+        <w:spacing w:after="80" w:line="340"/>
       </w:pPr>
       <w:r>
         <w:rPr>
@@ -7897,7 +7930,7 @@
           <w:ilvl w:val="0"/>
           <w:numId w:val="1"/>
         </w:numPr>
-        <w:spacing w:after="100" w:line="340"/>
+        <w:spacing w:after="80" w:line="340"/>
       </w:pPr>
       <w:r>
         <w:rPr>
@@ -7913,7 +7946,7 @@
           <w:ilvl w:val="0"/>
           <w:numId w:val="1"/>
         </w:numPr>
-        <w:spacing w:after="100" w:line="340"/>
+        <w:spacing w:after="80" w:line="340"/>
       </w:pPr>
       <w:r>
         <w:rPr>
@@ -7929,7 +7962,7 @@
           <w:ilvl w:val="0"/>
           <w:numId w:val="1"/>
         </w:numPr>
-        <w:spacing w:after="100" w:line="340"/>
+        <w:spacing w:after="80" w:line="340"/>
       </w:pPr>
       <w:r>
         <w:rPr>
@@ -7945,7 +7978,7 @@
           <w:ilvl w:val="0"/>
           <w:numId w:val="1"/>
         </w:numPr>
-        <w:spacing w:after="100" w:line="340"/>
+        <w:spacing w:after="80" w:line="340"/>
       </w:pPr>
       <w:r>
         <w:rPr>
@@ -7961,7 +7994,7 @@
           <w:ilvl w:val="0"/>
           <w:numId w:val="1"/>
         </w:numPr>
-        <w:spacing w:after="100" w:line="340"/>
+        <w:spacing w:after="80" w:line="340"/>
       </w:pPr>
       <w:r>
         <w:rPr>
@@ -7977,7 +8010,7 @@
           <w:ilvl w:val="0"/>
           <w:numId w:val="1"/>
         </w:numPr>
-        <w:spacing w:after="100" w:line="340"/>
+        <w:spacing w:after="80" w:line="340"/>
       </w:pPr>
       <w:r>
         <w:rPr>
@@ -7993,7 +8026,7 @@
           <w:ilvl w:val="0"/>
           <w:numId w:val="1"/>
         </w:numPr>
-        <w:spacing w:after="100" w:line="340"/>
+        <w:spacing w:after="80" w:line="340"/>
       </w:pPr>
       <w:r>
         <w:rPr>
@@ -8009,23 +8042,23 @@
           <w:ilvl w:val="0"/>
           <w:numId w:val="1"/>
         </w:numPr>
-        <w:spacing w:after="100" w:line="340"/>
-      </w:pPr>
-      <w:r>
-        <w:rPr>
-          <w:rFonts w:ascii="SimSun" w:cs="SimSun" w:eastAsia="SimSun" w:hAnsi="SimSun"/>
-        </w:rPr>
-        <w:t xml:space="preserve">其实天国就在我们心内；只要我们不再摆出宗教机构所要求的那些造作的慷慨、道德与学问的姿态，转而加倍地独自向内寻求，真理自会找上我们。</w:t>
-      </w:r>
-    </w:p>
-    <w:p>
-      <w:pPr>
-        <w:pStyle w:val="ListParagraph"/>
-        <w:numPr>
-          <w:ilvl w:val="0"/>
-          <w:numId w:val="1"/>
-        </w:numPr>
-        <w:spacing w:after="100" w:line="340"/>
+        <w:spacing w:after="80" w:line="340"/>
+      </w:pPr>
+      <w:r>
+        <w:rPr>
+          <w:rFonts w:ascii="SimSun" w:cs="SimSun" w:eastAsia="SimSun" w:hAnsi="SimSun"/>
+        </w:rPr>
+        <w:t xml:space="preserve">其实天国就在我们心内；只要我们不再摆出宗教机构所要求的那些造作的慷慨、道德与研读的姿态，转而加倍地独自向内寻求，它就会向我们显现，真理自会找上我们。</w:t>
+      </w:r>
+    </w:p>
+    <w:p>
+      <w:pPr>
+        <w:pStyle w:val="ListParagraph"/>
+        <w:numPr>
+          <w:ilvl w:val="0"/>
+          <w:numId w:val="1"/>
+        </w:numPr>
+        <w:spacing w:after="80" w:line="340"/>
       </w:pPr>
       <w:r>
         <w:rPr>
@@ -8041,7 +8074,7 @@
           <w:ilvl w:val="0"/>
           <w:numId w:val="1"/>
         </w:numPr>
-        <w:spacing w:after="100" w:line="340"/>
+        <w:spacing w:after="80" w:line="340"/>
       </w:pPr>
       <w:r>
         <w:rPr>
@@ -8057,23 +8090,23 @@
           <w:ilvl w:val="0"/>
           <w:numId w:val="1"/>
         </w:numPr>
-        <w:spacing w:after="100" w:line="340"/>
-      </w:pPr>
-      <w:r>
-        <w:rPr>
-          <w:rFonts w:ascii="SimSun" w:cs="SimSun" w:eastAsia="SimSun" w:hAnsi="SimSun"/>
-        </w:rPr>
-        <w:t xml:space="preserve">祖师们的光并没有在所有住持、神父和喇嘛身上熄灭，我们的功课是把其中真正值得倾心依止的人辨认出来。</w:t>
-      </w:r>
-    </w:p>
-    <w:p>
-      <w:pPr>
-        <w:pStyle w:val="ListParagraph"/>
-        <w:numPr>
-          <w:ilvl w:val="0"/>
-          <w:numId w:val="1"/>
-        </w:numPr>
-        <w:spacing w:after="100" w:line="340"/>
+        <w:spacing w:after="80" w:line="340"/>
+      </w:pPr>
+      <w:r>
+        <w:rPr>
+          <w:rFonts w:ascii="SimSun" w:cs="SimSun" w:eastAsia="SimSun" w:hAnsi="SimSun"/>
+        </w:rPr>
+        <w:t xml:space="preserve">祖师们的光并非在所有住持、神父和喇嘛身上都已熄灭，我们的功课是把其中真正值得倾心依止的人辨认出来。</w:t>
+      </w:r>
+    </w:p>
+    <w:p>
+      <w:pPr>
+        <w:pStyle w:val="ListParagraph"/>
+        <w:numPr>
+          <w:ilvl w:val="0"/>
+          <w:numId w:val="1"/>
+        </w:numPr>
+        <w:spacing w:after="80" w:line="340"/>
       </w:pPr>
       <w:r>
         <w:rPr>
@@ -8089,7 +8122,7 @@
           <w:ilvl w:val="0"/>
           <w:numId w:val="1"/>
         </w:numPr>
-        <w:spacing w:after="100" w:line="340"/>
+        <w:spacing w:after="80" w:line="340"/>
       </w:pPr>
       <w:r>
         <w:rPr>
@@ -8105,7 +8138,7 @@
           <w:ilvl w:val="0"/>
           <w:numId w:val="1"/>
         </w:numPr>
-        <w:spacing w:after="100" w:line="340"/>
+        <w:spacing w:after="80" w:line="340"/>
       </w:pPr>
       <w:r>
         <w:rPr>
@@ -8121,7 +8154,7 @@
           <w:ilvl w:val="0"/>
           <w:numId w:val="1"/>
         </w:numPr>
-        <w:spacing w:after="100" w:line="340"/>
+        <w:spacing w:after="80" w:line="340"/>
       </w:pPr>
       <w:r>
         <w:rPr>
@@ -8137,23 +8170,23 @@
           <w:ilvl w:val="0"/>
           <w:numId w:val="1"/>
         </w:numPr>
-        <w:spacing w:after="100" w:line="340"/>
-      </w:pPr>
-      <w:r>
-        <w:rPr>
-          <w:rFonts w:ascii="SimSun" w:cs="SimSun" w:eastAsia="SimSun" w:hAnsi="SimSun"/>
-        </w:rPr>
-        <w:t xml:space="preserve">各式各样的念头争抢我们的注意力，记忆被翻搅起来，眼前那些似乎火烧眉毛的事、情绪，还有种种散乱的念头……难怪我们会被里头这番喧闹弄得心灰，怀疑“天国就在心内”这种说法到底靠不靠得住。可即便如此，我们仍会察觉自己身上有一面一直在那里等着我们，像舞会上靠墙站着、等人邀她下场的那个人。</w:t>
-      </w:r>
-    </w:p>
-    <w:p>
-      <w:pPr>
-        <w:pStyle w:val="ListParagraph"/>
-        <w:numPr>
-          <w:ilvl w:val="0"/>
-          <w:numId w:val="1"/>
-        </w:numPr>
-        <w:spacing w:after="100" w:line="340"/>
+        <w:spacing w:after="80" w:line="340"/>
+      </w:pPr>
+      <w:r>
+        <w:rPr>
+          <w:rFonts w:ascii="SimSun" w:cs="SimSun" w:eastAsia="SimSun" w:hAnsi="SimSun"/>
+        </w:rPr>
+        <w:t xml:space="preserve">各式各样的念头争抢我们的注意力，记忆被翻搅起来，眼前那些似乎火烧眉毛的事、情绪，还有种种散乱的念头……难怪我们会被里头这番喧闹弄得心灰，怀疑“天国就在心内”这种说法到底靠不靠得住。可即便如此，我们仍会察觉自己身上有一面一直在那里等着我们，像舞会上靠墙站着、等人来请她跳舞的那个人。</w:t>
+      </w:r>
+    </w:p>
+    <w:p>
+      <w:pPr>
+        <w:pStyle w:val="ListParagraph"/>
+        <w:numPr>
+          <w:ilvl w:val="0"/>
+          <w:numId w:val="1"/>
+        </w:numPr>
+        <w:spacing w:after="80" w:line="340"/>
       </w:pPr>
       <w:r>
         <w:rPr>
@@ -8169,7 +8202,7 @@
           <w:ilvl w:val="0"/>
           <w:numId w:val="1"/>
         </w:numPr>
-        <w:spacing w:after="100" w:line="340"/>
+        <w:spacing w:after="80" w:line="340"/>
       </w:pPr>
       <w:r>
         <w:rPr>
@@ -8185,7 +8218,7 @@
           <w:ilvl w:val="0"/>
           <w:numId w:val="1"/>
         </w:numPr>
-        <w:spacing w:after="100" w:line="340"/>
+        <w:spacing w:after="80" w:line="340"/>
       </w:pPr>
       <w:r>
         <w:rPr>
@@ -8201,7 +8234,7 @@
           <w:ilvl w:val="0"/>
           <w:numId w:val="1"/>
         </w:numPr>
-        <w:spacing w:after="100" w:line="340"/>
+        <w:spacing w:after="80" w:line="340"/>
       </w:pPr>
       <w:r>
         <w:rPr>
@@ -8217,7 +8250,7 @@
           <w:ilvl w:val="0"/>
           <w:numId w:val="1"/>
         </w:numPr>
-        <w:spacing w:after="100" w:line="340"/>
+        <w:spacing w:after="80" w:line="340"/>
       </w:pPr>
       <w:r>
         <w:rPr>
@@ -8233,23 +8266,23 @@
           <w:ilvl w:val="0"/>
           <w:numId w:val="1"/>
         </w:numPr>
-        <w:spacing w:after="100" w:line="340"/>
-      </w:pPr>
-      <w:r>
-        <w:rPr>
-          <w:rFonts w:ascii="SimSun" w:cs="SimSun" w:eastAsia="SimSun" w:hAnsi="SimSun"/>
-        </w:rPr>
-        <w:t xml:space="preserve">敞开那颗肯信任的心、放下所有防卫，是很耗能量的事——这正是静坐为什么是最好也最省力的办法。</w:t>
-      </w:r>
-    </w:p>
-    <w:p>
-      <w:pPr>
-        <w:pStyle w:val="ListParagraph"/>
-        <w:numPr>
-          <w:ilvl w:val="0"/>
-          <w:numId w:val="1"/>
-        </w:numPr>
-        <w:spacing w:after="100" w:line="340"/>
+        <w:spacing w:after="80" w:line="340"/>
+      </w:pPr>
+      <w:r>
+        <w:rPr>
+          <w:rFonts w:ascii="SimSun" w:cs="SimSun" w:eastAsia="SimSun" w:hAnsi="SimSun"/>
+        </w:rPr>
+        <w:t xml:space="preserve">敞开那颗肯信任的心、放下所有防卫，是很耗能量的事；正因如此，静坐才是最好、也最高效的办法。</w:t>
+      </w:r>
+    </w:p>
+    <w:p>
+      <w:pPr>
+        <w:pStyle w:val="ListParagraph"/>
+        <w:numPr>
+          <w:ilvl w:val="0"/>
+          <w:numId w:val="1"/>
+        </w:numPr>
+        <w:spacing w:after="80" w:line="340"/>
       </w:pPr>
       <w:r>
         <w:rPr>
@@ -8265,7 +8298,7 @@
           <w:ilvl w:val="0"/>
           <w:numId w:val="1"/>
         </w:numPr>
-        <w:spacing w:after="100" w:line="340"/>
+        <w:spacing w:after="80" w:line="340"/>
       </w:pPr>
       <w:r>
         <w:rPr>
@@ -8281,7 +8314,7 @@
           <w:ilvl w:val="0"/>
           <w:numId w:val="1"/>
         </w:numPr>
-        <w:spacing w:after="100" w:line="340"/>
+        <w:spacing w:after="80" w:line="340"/>
       </w:pPr>
       <w:r>
         <w:rPr>
@@ -8297,23 +8330,23 @@
           <w:ilvl w:val="0"/>
           <w:numId w:val="1"/>
         </w:numPr>
-        <w:spacing w:after="100" w:line="340"/>
-      </w:pPr>
-      <w:r>
-        <w:rPr>
-          <w:rFonts w:ascii="SimSun" w:cs="SimSun" w:eastAsia="SimSun" w:hAnsi="SimSun"/>
-        </w:rPr>
-        <w:t xml:space="preserve">我们的任务是见证念头，而不是评判它、铺陈它。无论那是关于自己的念头、关于别人的念头，还是关于物件的念头，都一样。</w:t>
-      </w:r>
-    </w:p>
-    <w:p>
-      <w:pPr>
-        <w:pStyle w:val="ListParagraph"/>
-        <w:numPr>
-          <w:ilvl w:val="0"/>
-          <w:numId w:val="1"/>
-        </w:numPr>
-        <w:spacing w:after="100" w:line="340"/>
+        <w:spacing w:after="80" w:line="340"/>
+      </w:pPr>
+      <w:r>
+        <w:rPr>
+          <w:rFonts w:ascii="SimSun" w:cs="SimSun" w:eastAsia="SimSun" w:hAnsi="SimSun"/>
+        </w:rPr>
+        <w:t xml:space="preserve">我们的任务是见证念头，而不是评判它、铺陈它。无论那是关于自己的念头、关于别人的念头，甚至是关于物件的念头，都一样。</w:t>
+      </w:r>
+    </w:p>
+    <w:p>
+      <w:pPr>
+        <w:pStyle w:val="ListParagraph"/>
+        <w:numPr>
+          <w:ilvl w:val="0"/>
+          <w:numId w:val="1"/>
+        </w:numPr>
+        <w:spacing w:after="80" w:line="340"/>
       </w:pPr>
       <w:r>
         <w:rPr>
@@ -8329,7 +8362,7 @@
           <w:ilvl w:val="0"/>
           <w:numId w:val="1"/>
         </w:numPr>
-        <w:spacing w:after="100" w:line="340"/>
+        <w:spacing w:after="80" w:line="340"/>
       </w:pPr>
       <w:r>
         <w:rPr>
@@ -8345,23 +8378,23 @@
           <w:ilvl w:val="0"/>
           <w:numId w:val="1"/>
         </w:numPr>
-        <w:spacing w:after="100" w:line="340"/>
-      </w:pPr>
-      <w:r>
-        <w:rPr>
-          <w:rFonts w:ascii="SimSun" w:cs="SimSun" w:eastAsia="SimSun" w:hAnsi="SimSun"/>
-        </w:rPr>
-        <w:t xml:space="preserve">法庭上的证人不会为所犯的罪感到心虚，因为站在被告席上的不是他；同样，一旦坐上蒲团，就要以平等心看待一切念头。</w:t>
-      </w:r>
-    </w:p>
-    <w:p>
-      <w:pPr>
-        <w:pStyle w:val="ListParagraph"/>
-        <w:numPr>
-          <w:ilvl w:val="0"/>
-          <w:numId w:val="1"/>
-        </w:numPr>
-        <w:spacing w:after="100" w:line="340"/>
+        <w:spacing w:after="80" w:line="340"/>
+      </w:pPr>
+      <w:r>
+        <w:rPr>
+          <w:rFonts w:ascii="SimSun" w:cs="SimSun" w:eastAsia="SimSun" w:hAnsi="SimSun"/>
+        </w:rPr>
+        <w:t xml:space="preserve">法庭上的证人不会为案中的罪行感到心虚，因为站在被告席上的不是他；同样，一旦坐上蒲团，就要以平等心看待一切念头。</w:t>
+      </w:r>
+    </w:p>
+    <w:p>
+      <w:pPr>
+        <w:pStyle w:val="ListParagraph"/>
+        <w:numPr>
+          <w:ilvl w:val="0"/>
+          <w:numId w:val="1"/>
+        </w:numPr>
+        <w:spacing w:after="80" w:line="340"/>
       </w:pPr>
       <w:r>
         <w:rPr>
@@ -8377,7 +8410,7 @@
           <w:ilvl w:val="0"/>
           <w:numId w:val="1"/>
         </w:numPr>
-        <w:spacing w:after="100" w:line="340"/>
+        <w:spacing w:after="80" w:line="340"/>
       </w:pPr>
       <w:r>
         <w:rPr>
@@ -8393,7 +8426,7 @@
           <w:ilvl w:val="0"/>
           <w:numId w:val="1"/>
         </w:numPr>
-        <w:spacing w:after="100" w:line="340"/>
+        <w:spacing w:after="80" w:line="340"/>
       </w:pPr>
       <w:r>
         <w:rPr>
@@ -8409,7 +8442,7 @@
           <w:ilvl w:val="0"/>
           <w:numId w:val="1"/>
         </w:numPr>
-        <w:spacing w:after="100" w:line="340"/>
+        <w:spacing w:after="80" w:line="340"/>
       </w:pPr>
       <w:r>
         <w:rPr>
@@ -8425,7 +8458,7 @@
           <w:ilvl w:val="0"/>
           <w:numId w:val="1"/>
         </w:numPr>
-        <w:spacing w:after="100" w:line="340"/>
+        <w:spacing w:after="80" w:line="340"/>
       </w:pPr>
       <w:r>
         <w:rPr>
@@ -8441,7 +8474,7 @@
           <w:ilvl w:val="0"/>
           <w:numId w:val="1"/>
         </w:numPr>
-        <w:spacing w:after="100" w:line="340"/>
+        <w:spacing w:after="80" w:line="340"/>
       </w:pPr>
       <w:r>
         <w:rPr>
@@ -8457,7 +8490,7 @@
           <w:ilvl w:val="0"/>
           <w:numId w:val="1"/>
         </w:numPr>
-        <w:spacing w:after="100" w:line="340"/>
+        <w:spacing w:after="80" w:line="340"/>
       </w:pPr>
       <w:r>
         <w:rPr>
@@ -8473,7 +8506,7 @@
           <w:ilvl w:val="0"/>
           <w:numId w:val="1"/>
         </w:numPr>
-        <w:spacing w:after="100" w:line="340"/>
+        <w:spacing w:after="80" w:line="340"/>
       </w:pPr>
       <w:r>
         <w:rPr>
@@ -8489,7 +8522,7 @@
           <w:ilvl w:val="0"/>
           <w:numId w:val="1"/>
         </w:numPr>
-        <w:spacing w:after="100" w:line="340"/>
+        <w:spacing w:after="80" w:line="340"/>
       </w:pPr>
       <w:r>
         <w:rPr>
@@ -8505,7 +8538,7 @@
           <w:ilvl w:val="0"/>
           <w:numId w:val="1"/>
         </w:numPr>
-        <w:spacing w:after="100" w:line="340"/>
+        <w:spacing w:after="80" w:line="340"/>
       </w:pPr>
       <w:r>
         <w:rPr>
@@ -8521,7 +8554,7 @@
           <w:ilvl w:val="0"/>
           <w:numId w:val="1"/>
         </w:numPr>
-        <w:spacing w:after="100" w:line="340"/>
+        <w:spacing w:after="80" w:line="340"/>
       </w:pPr>
       <w:r>
         <w:rPr>
@@ -8537,7 +8570,7 @@
           <w:ilvl w:val="0"/>
           <w:numId w:val="1"/>
         </w:numPr>
-        <w:spacing w:after="100" w:line="340"/>
+        <w:spacing w:after="80" w:line="340"/>
       </w:pPr>
       <w:r>
         <w:rPr>
@@ -8553,23 +8586,23 @@
           <w:ilvl w:val="0"/>
           <w:numId w:val="1"/>
         </w:numPr>
-        <w:spacing w:after="100" w:line="340"/>
-      </w:pPr>
-      <w:r>
-        <w:rPr>
-          <w:rFonts w:ascii="SimSun" w:cs="SimSun" w:eastAsia="SimSun" w:hAnsi="SimSun"/>
-        </w:rPr>
-        <w:t xml:space="preserve">每日的禅修用功不贪多，修行才长久。一上来就猛冲的，走不远。</w:t>
-      </w:r>
-    </w:p>
-    <w:p>
-      <w:pPr>
-        <w:pStyle w:val="ListParagraph"/>
-        <w:numPr>
-          <w:ilvl w:val="0"/>
-          <w:numId w:val="1"/>
-        </w:numPr>
-        <w:spacing w:after="100" w:line="340"/>
+        <w:spacing w:after="80" w:line="340"/>
+      </w:pPr>
+      <w:r>
+        <w:rPr>
+          <w:rFonts w:ascii="SimSun" w:cs="SimSun" w:eastAsia="SimSun" w:hAnsi="SimSun"/>
+        </w:rPr>
+        <w:t xml:space="preserve">每日的禅修用功不贪多，就能保证修行长久。一上来就猛冲的，走不远。</w:t>
+      </w:r>
+    </w:p>
+    <w:p>
+      <w:pPr>
+        <w:pStyle w:val="ListParagraph"/>
+        <w:numPr>
+          <w:ilvl w:val="0"/>
+          <w:numId w:val="1"/>
+        </w:numPr>
+        <w:spacing w:after="80" w:line="340"/>
       </w:pPr>
       <w:r>
         <w:rPr>
@@ -8585,7 +8618,7 @@
           <w:ilvl w:val="0"/>
           <w:numId w:val="1"/>
         </w:numPr>
-        <w:spacing w:after="100" w:line="340"/>
+        <w:spacing w:after="80" w:line="340"/>
       </w:pPr>
       <w:r>
         <w:rPr>
@@ -8601,7 +8634,7 @@
           <w:ilvl w:val="0"/>
           <w:numId w:val="1"/>
         </w:numPr>
-        <w:spacing w:after="100" w:line="340"/>
+        <w:spacing w:after="80" w:line="340"/>
       </w:pPr>
       <w:r>
         <w:rPr>
@@ -8617,7 +8650,7 @@
           <w:ilvl w:val="0"/>
           <w:numId w:val="1"/>
         </w:numPr>
-        <w:spacing w:after="100" w:line="340"/>
+        <w:spacing w:after="80" w:line="340"/>
       </w:pPr>
       <w:r>
         <w:rPr>
@@ -8633,23 +8666,23 @@
           <w:ilvl w:val="0"/>
           <w:numId w:val="1"/>
         </w:numPr>
-        <w:spacing w:after="100" w:line="340"/>
-      </w:pPr>
-      <w:r>
-        <w:rPr>
-          <w:rFonts w:ascii="SimSun" w:cs="SimSun" w:eastAsia="SimSun" w:hAnsi="SimSun"/>
-        </w:rPr>
-        <w:t xml:space="preserve">孩子们一发觉老师在看着，就安静了。见证者一观照那颗忙碌的心，心也安静了。两者都不曾去干涉正在发生的事。</w:t>
-      </w:r>
-    </w:p>
-    <w:p>
-      <w:pPr>
-        <w:pStyle w:val="ListParagraph"/>
-        <w:numPr>
-          <w:ilvl w:val="0"/>
-          <w:numId w:val="1"/>
-        </w:numPr>
-        <w:spacing w:after="100" w:line="340"/>
+        <w:spacing w:after="80" w:line="340"/>
+      </w:pPr>
+      <w:r>
+        <w:rPr>
+          <w:rFonts w:ascii="SimSun" w:cs="SimSun" w:eastAsia="SimSun" w:hAnsi="SimSun"/>
+        </w:rPr>
+        <w:t xml:space="preserve">孩子们一发觉老师在看着，就安静了。见证者一观照那颗忙碌的心，心也安静了。两者都不曾去干涉心里正在发生的事。</w:t>
+      </w:r>
+    </w:p>
+    <w:p>
+      <w:pPr>
+        <w:pStyle w:val="ListParagraph"/>
+        <w:numPr>
+          <w:ilvl w:val="0"/>
+          <w:numId w:val="1"/>
+        </w:numPr>
+        <w:spacing w:after="80" w:line="340"/>
       </w:pPr>
       <w:r>
         <w:rPr>
@@ -8665,7 +8698,7 @@
           <w:ilvl w:val="0"/>
           <w:numId w:val="1"/>
         </w:numPr>
-        <w:spacing w:after="100" w:line="340"/>
+        <w:spacing w:after="80" w:line="340"/>
       </w:pPr>
       <w:r>
         <w:rPr>
@@ -8681,7 +8714,7 @@
           <w:ilvl w:val="0"/>
           <w:numId w:val="1"/>
         </w:numPr>
-        <w:spacing w:after="100" w:line="340"/>
+        <w:spacing w:after="80" w:line="340"/>
       </w:pPr>
       <w:r>
         <w:rPr>
@@ -8697,7 +8730,7 @@
           <w:ilvl w:val="0"/>
           <w:numId w:val="1"/>
         </w:numPr>
-        <w:spacing w:after="100" w:line="340"/>
+        <w:spacing w:after="80" w:line="340"/>
       </w:pPr>
       <w:r>
         <w:rPr>
@@ -8713,7 +8746,7 @@
           <w:ilvl w:val="0"/>
           <w:numId w:val="1"/>
         </w:numPr>
-        <w:spacing w:after="100" w:line="340"/>
+        <w:spacing w:after="80" w:line="340"/>
       </w:pPr>
       <w:r>
         <w:rPr>
@@ -8729,7 +8762,7 @@
           <w:ilvl w:val="0"/>
           <w:numId w:val="1"/>
         </w:numPr>
-        <w:spacing w:after="100" w:line="340"/>
+        <w:spacing w:after="80" w:line="340"/>
       </w:pPr>
       <w:r>
         <w:rPr>
@@ -8745,7 +8778,7 @@
           <w:ilvl w:val="0"/>
           <w:numId w:val="1"/>
         </w:numPr>
-        <w:spacing w:after="100" w:line="340"/>
+        <w:spacing w:after="80" w:line="340"/>
       </w:pPr>
       <w:r>
         <w:rPr>
@@ -8761,7 +8794,7 @@
           <w:ilvl w:val="0"/>
           <w:numId w:val="1"/>
         </w:numPr>
-        <w:spacing w:after="100" w:line="340"/>
+        <w:spacing w:after="80" w:line="340"/>
       </w:pPr>
       <w:r>
         <w:rPr>
@@ -8777,23 +8810,23 @@
           <w:ilvl w:val="0"/>
           <w:numId w:val="1"/>
         </w:numPr>
-        <w:spacing w:after="100" w:line="340"/>
-      </w:pPr>
-      <w:r>
-        <w:rPr>
-          <w:rFonts w:ascii="SimSun" w:cs="SimSun" w:eastAsia="SimSun" w:hAnsi="SimSun"/>
-        </w:rPr>
-        <w:t xml:space="preserve">就像害羞的新娘拒绝一切进逼，那羞怯的“我”要等我们停止寻找时才来。“静”本身也是捉摸不定的：越想静下来，就越躁动。</w:t>
-      </w:r>
-    </w:p>
-    <w:p>
-      <w:pPr>
-        <w:pStyle w:val="ListParagraph"/>
-        <w:numPr>
-          <w:ilvl w:val="0"/>
-          <w:numId w:val="1"/>
-        </w:numPr>
-        <w:spacing w:after="100" w:line="340"/>
+        <w:spacing w:after="80" w:line="340"/>
+      </w:pPr>
+      <w:r>
+        <w:rPr>
+          <w:rFonts w:ascii="SimSun" w:cs="SimSun" w:eastAsia="SimSun" w:hAnsi="SimSun"/>
+        </w:rPr>
+        <w:t xml:space="preserve">就像害羞的新娘推拒一切亲近，那羞怯的“我”要等我们停止寻找时才来。“静”本身也是捉摸不定的：越想静下来，就越躁动。</w:t>
+      </w:r>
+    </w:p>
+    <w:p>
+      <w:pPr>
+        <w:pStyle w:val="ListParagraph"/>
+        <w:numPr>
+          <w:ilvl w:val="0"/>
+          <w:numId w:val="1"/>
+        </w:numPr>
+        <w:spacing w:after="80" w:line="340"/>
       </w:pPr>
       <w:r>
         <w:rPr>
@@ -8809,7 +8842,7 @@
           <w:ilvl w:val="0"/>
           <w:numId w:val="1"/>
         </w:numPr>
-        <w:spacing w:after="100" w:line="340"/>
+        <w:spacing w:after="80" w:line="340"/>
       </w:pPr>
       <w:r>
         <w:rPr>
@@ -8825,7 +8858,7 @@
           <w:ilvl w:val="0"/>
           <w:numId w:val="1"/>
         </w:numPr>
-        <w:spacing w:after="100" w:line="340"/>
+        <w:spacing w:after="80" w:line="340"/>
       </w:pPr>
       <w:r>
         <w:rPr>
@@ -8841,7 +8874,7 @@
           <w:ilvl w:val="0"/>
           <w:numId w:val="1"/>
         </w:numPr>
-        <w:spacing w:after="100" w:line="340"/>
+        <w:spacing w:after="80" w:line="340"/>
       </w:pPr>
       <w:r>
         <w:rPr>
@@ -8857,7 +8890,7 @@
           <w:ilvl w:val="0"/>
           <w:numId w:val="1"/>
         </w:numPr>
-        <w:spacing w:after="100" w:line="340"/>
+        <w:spacing w:after="80" w:line="340"/>
       </w:pPr>
       <w:r>
         <w:rPr>
@@ -8873,7 +8906,7 @@
           <w:ilvl w:val="0"/>
           <w:numId w:val="1"/>
         </w:numPr>
-        <w:spacing w:after="100" w:line="340"/>
+        <w:spacing w:after="80" w:line="340"/>
       </w:pPr>
       <w:r>
         <w:rPr>
@@ -8889,7 +8922,7 @@
           <w:ilvl w:val="0"/>
           <w:numId w:val="1"/>
         </w:numPr>
-        <w:spacing w:after="100" w:line="340"/>
+        <w:spacing w:after="80" w:line="340"/>
       </w:pPr>
       <w:r>
         <w:rPr>
@@ -8905,7 +8938,7 @@
           <w:ilvl w:val="0"/>
           <w:numId w:val="1"/>
         </w:numPr>
-        <w:spacing w:after="100" w:line="340"/>
+        <w:spacing w:after="80" w:line="340"/>
       </w:pPr>
       <w:r>
         <w:rPr>
@@ -8921,7 +8954,7 @@
           <w:ilvl w:val="0"/>
           <w:numId w:val="1"/>
         </w:numPr>
-        <w:spacing w:after="100" w:line="340"/>
+        <w:spacing w:after="80" w:line="340"/>
       </w:pPr>
       <w:r>
         <w:rPr>
@@ -8937,23 +8970,23 @@
           <w:ilvl w:val="0"/>
           <w:numId w:val="1"/>
         </w:numPr>
-        <w:spacing w:after="100" w:line="340"/>
-      </w:pPr>
-      <w:r>
-        <w:rPr>
-          <w:rFonts w:ascii="SimSun" w:cs="SimSun" w:eastAsia="SimSun" w:hAnsi="SimSun"/>
-        </w:rPr>
-        <w:t xml:space="preserve">打坐时要让开自己这条路，很难。我们既是天生的禅修者，也是天生爱插手的人。</w:t>
-      </w:r>
-    </w:p>
-    <w:p>
-      <w:pPr>
-        <w:pStyle w:val="ListParagraph"/>
-        <w:numPr>
-          <w:ilvl w:val="0"/>
-          <w:numId w:val="1"/>
-        </w:numPr>
-        <w:spacing w:after="100" w:line="340"/>
+        <w:spacing w:after="80" w:line="340"/>
+      </w:pPr>
+      <w:r>
+        <w:rPr>
+          <w:rFonts w:ascii="SimSun" w:cs="SimSun" w:eastAsia="SimSun" w:hAnsi="SimSun"/>
+        </w:rPr>
+        <w:t xml:space="preserve">打坐时要做到不自己挡自己的路，很难。我们既是天生的禅修者，也是天生爱插手的人。</w:t>
+      </w:r>
+    </w:p>
+    <w:p>
+      <w:pPr>
+        <w:pStyle w:val="ListParagraph"/>
+        <w:numPr>
+          <w:ilvl w:val="0"/>
+          <w:numId w:val="1"/>
+        </w:numPr>
+        <w:spacing w:after="80" w:line="340"/>
       </w:pPr>
       <w:r>
         <w:rPr>
@@ -8969,7 +9002,7 @@
           <w:ilvl w:val="0"/>
           <w:numId w:val="1"/>
         </w:numPr>
-        <w:spacing w:after="100" w:line="340"/>
+        <w:spacing w:after="80" w:line="340"/>
       </w:pPr>
       <w:r>
         <w:rPr>
@@ -8985,7 +9018,7 @@
           <w:ilvl w:val="0"/>
           <w:numId w:val="1"/>
         </w:numPr>
-        <w:spacing w:after="100" w:line="340"/>
+        <w:spacing w:after="80" w:line="340"/>
       </w:pPr>
       <w:r>
         <w:rPr>
@@ -9001,7 +9034,7 @@
           <w:ilvl w:val="0"/>
           <w:numId w:val="1"/>
         </w:numPr>
-        <w:spacing w:after="100" w:line="340"/>
+        <w:spacing w:after="80" w:line="340"/>
       </w:pPr>
       <w:r>
         <w:rPr>
@@ -9017,7 +9050,7 @@
           <w:ilvl w:val="0"/>
           <w:numId w:val="1"/>
         </w:numPr>
-        <w:spacing w:after="100" w:line="340"/>
+        <w:spacing w:after="80" w:line="340"/>
       </w:pPr>
       <w:r>
         <w:rPr>
@@ -9033,7 +9066,7 @@
           <w:ilvl w:val="0"/>
           <w:numId w:val="1"/>
         </w:numPr>
-        <w:spacing w:after="100" w:line="340"/>
+        <w:spacing w:after="80" w:line="340"/>
       </w:pPr>
       <w:r>
         <w:rPr>
@@ -9049,7 +9082,7 @@
           <w:ilvl w:val="0"/>
           <w:numId w:val="1"/>
         </w:numPr>
-        <w:spacing w:after="100" w:line="340"/>
+        <w:spacing w:after="80" w:line="340"/>
       </w:pPr>
       <w:r>
         <w:rPr>
@@ -9065,7 +9098,7 @@
           <w:ilvl w:val="0"/>
           <w:numId w:val="1"/>
         </w:numPr>
-        <w:spacing w:after="100" w:line="340"/>
+        <w:spacing w:after="80" w:line="340"/>
       </w:pPr>
       <w:r>
         <w:rPr>
@@ -9081,7 +9114,7 @@
           <w:ilvl w:val="0"/>
           <w:numId w:val="1"/>
         </w:numPr>
-        <w:spacing w:after="100" w:line="340"/>
+        <w:spacing w:after="80" w:line="340"/>
       </w:pPr>
       <w:r>
         <w:rPr>
@@ -9097,7 +9130,7 @@
           <w:ilvl w:val="0"/>
           <w:numId w:val="1"/>
         </w:numPr>
-        <w:spacing w:after="100" w:line="340"/>
+        <w:spacing w:after="80" w:line="340"/>
       </w:pPr>
       <w:r>
         <w:rPr>
@@ -9113,7 +9146,7 @@
           <w:ilvl w:val="0"/>
           <w:numId w:val="1"/>
         </w:numPr>
-        <w:spacing w:after="100" w:line="340"/>
+        <w:spacing w:after="80" w:line="340"/>
       </w:pPr>
       <w:r>
         <w:rPr>
@@ -9129,7 +9162,7 @@
           <w:ilvl w:val="0"/>
           <w:numId w:val="1"/>
         </w:numPr>
-        <w:spacing w:after="100" w:line="340"/>
+        <w:spacing w:after="80" w:line="340"/>
       </w:pPr>
       <w:r>
         <w:rPr>
@@ -9145,7 +9178,7 @@
           <w:ilvl w:val="0"/>
           <w:numId w:val="1"/>
         </w:numPr>
-        <w:spacing w:after="100" w:line="340"/>
+        <w:spacing w:after="80" w:line="340"/>
       </w:pPr>
       <w:r>
         <w:rPr>
@@ -9161,7 +9194,7 @@
           <w:ilvl w:val="0"/>
           <w:numId w:val="1"/>
         </w:numPr>
-        <w:spacing w:after="100" w:line="340"/>
+        <w:spacing w:after="80" w:line="340"/>
       </w:pPr>
       <w:r>
         <w:rPr>
@@ -9177,7 +9210,7 @@
           <w:ilvl w:val="0"/>
           <w:numId w:val="1"/>
         </w:numPr>
-        <w:spacing w:after="100" w:line="340"/>
+        <w:spacing w:after="80" w:line="340"/>
       </w:pPr>
       <w:r>
         <w:rPr>
@@ -9193,7 +9226,7 @@
           <w:ilvl w:val="0"/>
           <w:numId w:val="1"/>
         </w:numPr>
-        <w:spacing w:after="100" w:line="340"/>
+        <w:spacing w:after="80" w:line="340"/>
       </w:pPr>
       <w:r>
         <w:rPr>
@@ -9209,7 +9242,7 @@
           <w:ilvl w:val="0"/>
           <w:numId w:val="1"/>
         </w:numPr>
-        <w:spacing w:after="100" w:line="340"/>
+        <w:spacing w:after="80" w:line="340"/>
       </w:pPr>
       <w:r>
         <w:rPr>
@@ -9225,7 +9258,7 @@
           <w:ilvl w:val="0"/>
           <w:numId w:val="1"/>
         </w:numPr>
-        <w:spacing w:after="100" w:line="340"/>
+        <w:spacing w:after="80" w:line="340"/>
       </w:pPr>
       <w:r>
         <w:rPr>
@@ -9241,7 +9274,7 @@
           <w:ilvl w:val="0"/>
           <w:numId w:val="1"/>
         </w:numPr>
-        <w:spacing w:after="100" w:line="340"/>
+        <w:spacing w:after="80" w:line="340"/>
       </w:pPr>
       <w:r>
         <w:rPr>
@@ -9257,23 +9290,23 @@
           <w:ilvl w:val="0"/>
           <w:numId w:val="1"/>
         </w:numPr>
-        <w:spacing w:after="100" w:line="340"/>
-      </w:pPr>
-      <w:r>
-        <w:rPr>
-          <w:rFonts w:ascii="SimSun" w:cs="SimSun" w:eastAsia="SimSun" w:hAnsi="SimSun"/>
-        </w:rPr>
-        <w:t xml:space="preserve">一段时间是长是短，取决于我们的心怎么框它。对一个忙着盘算这个那个的人来说，禅修过得很快；对一个真正安住在所缘上的人来说，禅修也过得很快。前一种人从踏进禅堂的那一刻起就在骗自己。</w:t>
-      </w:r>
-    </w:p>
-    <w:p>
-      <w:pPr>
-        <w:pStyle w:val="ListParagraph"/>
-        <w:numPr>
-          <w:ilvl w:val="0"/>
-          <w:numId w:val="1"/>
-        </w:numPr>
-        <w:spacing w:after="100" w:line="340"/>
+        <w:spacing w:after="80" w:line="340"/>
+      </w:pPr>
+      <w:r>
+        <w:rPr>
+          <w:rFonts w:ascii="SimSun" w:cs="SimSun" w:eastAsia="SimSun" w:hAnsi="SimSun"/>
+        </w:rPr>
+        <w:t xml:space="preserve">一段时间是长是短，取决于我们怎样框定自己的心。对一个忙着盘算这个那个的人来说，禅修过得很快；对一个真正安住在所缘上的人来说，禅修也过得很快。前一种人从踏进禅堂的那一刻起就在骗自己。</w:t>
+      </w:r>
+    </w:p>
+    <w:p>
+      <w:pPr>
+        <w:pStyle w:val="ListParagraph"/>
+        <w:numPr>
+          <w:ilvl w:val="0"/>
+          <w:numId w:val="1"/>
+        </w:numPr>
+        <w:spacing w:after="80" w:line="340"/>
       </w:pPr>
       <w:r>
         <w:rPr>
@@ -9289,7 +9322,7 @@
           <w:ilvl w:val="0"/>
           <w:numId w:val="1"/>
         </w:numPr>
-        <w:spacing w:after="100" w:line="340"/>
+        <w:spacing w:after="80" w:line="340"/>
       </w:pPr>
       <w:r>
         <w:rPr>
@@ -9305,23 +9338,23 @@
           <w:ilvl w:val="0"/>
           <w:numId w:val="1"/>
         </w:numPr>
-        <w:spacing w:after="100" w:line="340"/>
-      </w:pPr>
-      <w:r>
-        <w:rPr>
-          <w:rFonts w:ascii="SimSun" w:cs="SimSun" w:eastAsia="SimSun" w:hAnsi="SimSun"/>
-        </w:rPr>
-        <w:t xml:space="preserve">见证也分几种：见证为己的念头，见证利他的念头，或专注于单一的念头。第一种招来恶业，第二种带出利他之心与善业，第三种则通向“正见”与殊胜的善业。</w:t>
-      </w:r>
-    </w:p>
-    <w:p>
-      <w:pPr>
-        <w:pStyle w:val="ListParagraph"/>
-        <w:numPr>
-          <w:ilvl w:val="0"/>
-          <w:numId w:val="1"/>
-        </w:numPr>
-        <w:spacing w:after="100" w:line="340"/>
+        <w:spacing w:after="80" w:line="340"/>
+      </w:pPr>
+      <w:r>
+        <w:rPr>
+          <w:rFonts w:ascii="SimSun" w:cs="SimSun" w:eastAsia="SimSun" w:hAnsi="SimSun"/>
+        </w:rPr>
+        <w:t xml:space="preserve">见证也分几种：见证为己的念头，见证利他的念头，或专注于单一的念头。第一种招来恶业，第二种带出利他之心与善业，第三种则通向“正见”与白业。</w:t>
+      </w:r>
+    </w:p>
+    <w:p>
+      <w:pPr>
+        <w:pStyle w:val="ListParagraph"/>
+        <w:numPr>
+          <w:ilvl w:val="0"/>
+          <w:numId w:val="1"/>
+        </w:numPr>
+        <w:spacing w:after="80" w:line="340"/>
       </w:pPr>
       <w:r>
         <w:rPr>
@@ -9337,7 +9370,7 @@
           <w:ilvl w:val="0"/>
           <w:numId w:val="1"/>
         </w:numPr>
-        <w:spacing w:after="100" w:line="340"/>
+        <w:spacing w:after="80" w:line="340"/>
       </w:pPr>
       <w:r>
         <w:rPr>
@@ -9353,7 +9386,7 @@
           <w:ilvl w:val="0"/>
           <w:numId w:val="1"/>
         </w:numPr>
-        <w:spacing w:after="100" w:line="340"/>
+        <w:spacing w:after="80" w:line="340"/>
       </w:pPr>
       <w:r>
         <w:rPr>
@@ -9369,7 +9402,7 @@
           <w:ilvl w:val="0"/>
           <w:numId w:val="1"/>
         </w:numPr>
-        <w:spacing w:after="100" w:line="340"/>
+        <w:spacing w:after="80" w:line="340"/>
       </w:pPr>
       <w:r>
         <w:rPr>
@@ -9385,7 +9418,7 @@
           <w:ilvl w:val="0"/>
           <w:numId w:val="1"/>
         </w:numPr>
-        <w:spacing w:after="100" w:line="340"/>
+        <w:spacing w:after="80" w:line="340"/>
       </w:pPr>
       <w:r>
         <w:rPr>
@@ -9401,7 +9434,7 @@
           <w:ilvl w:val="0"/>
           <w:numId w:val="1"/>
         </w:numPr>
-        <w:spacing w:after="100" w:line="340"/>
+        <w:spacing w:after="80" w:line="340"/>
       </w:pPr>
       <w:r>
         <w:rPr>
@@ -9417,7 +9450,7 @@
           <w:ilvl w:val="0"/>
           <w:numId w:val="1"/>
         </w:numPr>
-        <w:spacing w:after="100" w:line="340"/>
+        <w:spacing w:after="80" w:line="340"/>
       </w:pPr>
       <w:r>
         <w:rPr>
@@ -9433,7 +9466,7 @@
           <w:ilvl w:val="0"/>
           <w:numId w:val="1"/>
         </w:numPr>
-        <w:spacing w:after="100" w:line="340"/>
+        <w:spacing w:after="80" w:line="340"/>
       </w:pPr>
       <w:r>
         <w:rPr>
@@ -9449,7 +9482,7 @@
           <w:ilvl w:val="0"/>
           <w:numId w:val="1"/>
         </w:numPr>
-        <w:spacing w:after="100" w:line="340"/>
+        <w:spacing w:after="80" w:line="340"/>
       </w:pPr>
       <w:r>
         <w:rPr>
@@ -9465,23 +9498,23 @@
           <w:ilvl w:val="0"/>
           <w:numId w:val="1"/>
         </w:numPr>
-        <w:spacing w:after="100" w:line="340"/>
-      </w:pPr>
-      <w:r>
-        <w:rPr>
-          <w:rFonts w:ascii="SimSun" w:cs="SimSun" w:eastAsia="SimSun" w:hAnsi="SimSun"/>
-        </w:rPr>
-        <w:t xml:space="preserve">世界是照着我们的欲望向我们呈现的。我们向世界要得越少，它越能映出心的本性；向世界要得越多，它越映不出心的本性。我们的“想要”永远填不满，可我们的“需要”是能满足的。</w:t>
-      </w:r>
-    </w:p>
-    <w:p>
-      <w:pPr>
-        <w:pStyle w:val="ListParagraph"/>
-        <w:numPr>
-          <w:ilvl w:val="0"/>
-          <w:numId w:val="1"/>
-        </w:numPr>
-        <w:spacing w:after="100" w:line="340"/>
+        <w:spacing w:after="80" w:line="340"/>
+      </w:pPr>
+      <w:r>
+        <w:rPr>
+          <w:rFonts w:ascii="SimSun" w:cs="SimSun" w:eastAsia="SimSun" w:hAnsi="SimSun"/>
+        </w:rPr>
+        <w:t xml:space="preserve">世界是照着我们的欲望向我们呈现的。我们向世界要得越少，它越能映出心性；向世界要得越多，它越映不出心性。我们的“想要”永远填不满，可我们的“需要”是能满足的。</w:t>
+      </w:r>
+    </w:p>
+    <w:p>
+      <w:pPr>
+        <w:pStyle w:val="ListParagraph"/>
+        <w:numPr>
+          <w:ilvl w:val="0"/>
+          <w:numId w:val="1"/>
+        </w:numPr>
+        <w:spacing w:after="80" w:line="340"/>
       </w:pPr>
       <w:r>
         <w:rPr>
@@ -9497,7 +9530,7 @@
           <w:ilvl w:val="0"/>
           <w:numId w:val="1"/>
         </w:numPr>
-        <w:spacing w:after="100" w:line="340"/>
+        <w:spacing w:after="80" w:line="340"/>
       </w:pPr>
       <w:r>
         <w:rPr>
@@ -9513,7 +9546,7 @@
           <w:ilvl w:val="0"/>
           <w:numId w:val="1"/>
         </w:numPr>
-        <w:spacing w:after="100" w:line="340"/>
+        <w:spacing w:after="80" w:line="340"/>
       </w:pPr>
       <w:r>
         <w:rPr>
@@ -9529,7 +9562,7 @@
           <w:ilvl w:val="0"/>
           <w:numId w:val="1"/>
         </w:numPr>
-        <w:spacing w:after="100" w:line="340"/>
+        <w:spacing w:after="80" w:line="340"/>
       </w:pPr>
       <w:r>
         <w:rPr>
@@ -9545,23 +9578,23 @@
           <w:ilvl w:val="0"/>
           <w:numId w:val="1"/>
         </w:numPr>
-        <w:spacing w:after="100" w:line="340"/>
-      </w:pPr>
-      <w:r>
-        <w:rPr>
-          <w:rFonts w:ascii="SimSun" w:cs="SimSun" w:eastAsia="SimSun" w:hAnsi="SimSun"/>
-        </w:rPr>
-        <w:t xml:space="preserve">想吃得饱足，就先让别人吃饱；想东西多，就先把东西给人。一副身体用得了多少？总该把别人放在心上。</w:t>
-      </w:r>
-    </w:p>
-    <w:p>
-      <w:pPr>
-        <w:pStyle w:val="ListParagraph"/>
-        <w:numPr>
-          <w:ilvl w:val="0"/>
-          <w:numId w:val="1"/>
-        </w:numPr>
-        <w:spacing w:after="100" w:line="340"/>
+        <w:spacing w:after="80" w:line="340"/>
+      </w:pPr>
+      <w:r>
+        <w:rPr>
+          <w:rFonts w:ascii="SimSun" w:cs="SimSun" w:eastAsia="SimSun" w:hAnsi="SimSun"/>
+        </w:rPr>
+        <w:t xml:space="preserve">想吃得饱足，就先让别人吃饱；想要东西多，就先把东西给人。一副身体用得了多少？总该把别人放在心上。</w:t>
+      </w:r>
+    </w:p>
+    <w:p>
+      <w:pPr>
+        <w:pStyle w:val="ListParagraph"/>
+        <w:numPr>
+          <w:ilvl w:val="0"/>
+          <w:numId w:val="1"/>
+        </w:numPr>
+        <w:spacing w:after="80" w:line="340"/>
       </w:pPr>
       <w:r>
         <w:rPr>
@@ -9577,23 +9610,23 @@
           <w:ilvl w:val="0"/>
           <w:numId w:val="1"/>
         </w:numPr>
-        <w:spacing w:after="100" w:line="340"/>
-      </w:pPr>
-      <w:r>
-        <w:rPr>
-          <w:rFonts w:ascii="SimSun" w:cs="SimSun" w:eastAsia="SimSun" w:hAnsi="SimSun"/>
-        </w:rPr>
-        <w:t xml:space="preserve">我们能骑几辆自行车、开几辆车、睡几个房间、用几只碗吃饭、拿几支笔写字、穿几双鞋走路、开几把锁、踩几块冲浪板……一件在用、一件备着，不就够了吗？</w:t>
-      </w:r>
-    </w:p>
-    <w:p>
-      <w:pPr>
-        <w:pStyle w:val="ListParagraph"/>
-        <w:numPr>
-          <w:ilvl w:val="0"/>
-          <w:numId w:val="1"/>
-        </w:numPr>
-        <w:spacing w:after="100" w:line="340"/>
+        <w:spacing w:after="80" w:line="340"/>
+      </w:pPr>
+      <w:r>
+        <w:rPr>
+          <w:rFonts w:ascii="SimSun" w:cs="SimSun" w:eastAsia="SimSun" w:hAnsi="SimSun"/>
+        </w:rPr>
+        <w:t xml:space="preserve">我们能骑几辆自行车、开几辆车、睡几个房间、用几只碗吃饭、拿几支笔写字、穿几双鞋走路、开几把锁、踩几块冲浪板……？一件在用、一件备着，不就够了吗？</w:t>
+      </w:r>
+    </w:p>
+    <w:p>
+      <w:pPr>
+        <w:pStyle w:val="ListParagraph"/>
+        <w:numPr>
+          <w:ilvl w:val="0"/>
+          <w:numId w:val="1"/>
+        </w:numPr>
+        <w:spacing w:after="80" w:line="340"/>
       </w:pPr>
       <w:r>
         <w:rPr>
@@ -9609,7 +9642,7 @@
           <w:ilvl w:val="0"/>
           <w:numId w:val="1"/>
         </w:numPr>
-        <w:spacing w:after="100" w:line="340"/>
+        <w:spacing w:after="80" w:line="340"/>
       </w:pPr>
       <w:r>
         <w:rPr>
@@ -9625,7 +9658,7 @@
           <w:ilvl w:val="0"/>
           <w:numId w:val="1"/>
         </w:numPr>
-        <w:spacing w:after="100" w:line="340"/>
+        <w:spacing w:after="80" w:line="340"/>
       </w:pPr>
       <w:r>
         <w:rPr>
@@ -9641,7 +9674,7 @@
           <w:ilvl w:val="0"/>
           <w:numId w:val="1"/>
         </w:numPr>
-        <w:spacing w:after="100" w:line="340"/>
+        <w:spacing w:after="80" w:line="340"/>
       </w:pPr>
       <w:r>
         <w:rPr>
@@ -9657,7 +9690,7 @@
           <w:ilvl w:val="0"/>
           <w:numId w:val="1"/>
         </w:numPr>
-        <w:spacing w:after="100" w:line="340"/>
+        <w:spacing w:after="80" w:line="340"/>
       </w:pPr>
       <w:r>
         <w:rPr>
@@ -9673,7 +9706,7 @@
           <w:ilvl w:val="0"/>
           <w:numId w:val="1"/>
         </w:numPr>
-        <w:spacing w:after="100" w:line="340"/>
+        <w:spacing w:after="80" w:line="340"/>
       </w:pPr>
       <w:r>
         <w:rPr>
@@ -9689,7 +9722,7 @@
           <w:ilvl w:val="0"/>
           <w:numId w:val="1"/>
         </w:numPr>
-        <w:spacing w:after="100" w:line="340"/>
+        <w:spacing w:after="80" w:line="340"/>
       </w:pPr>
       <w:r>
         <w:rPr>
@@ -9705,7 +9738,7 @@
           <w:ilvl w:val="0"/>
           <w:numId w:val="1"/>
         </w:numPr>
-        <w:spacing w:after="100" w:line="340"/>
+        <w:spacing w:after="80" w:line="340"/>
       </w:pPr>
       <w:r>
         <w:rPr>
@@ -9721,7 +9754,7 @@
           <w:ilvl w:val="0"/>
           <w:numId w:val="1"/>
         </w:numPr>
-        <w:spacing w:after="100" w:line="340"/>
+        <w:spacing w:after="80" w:line="340"/>
       </w:pPr>
       <w:r>
         <w:rPr>
@@ -9737,7 +9770,7 @@
           <w:ilvl w:val="0"/>
           <w:numId w:val="1"/>
         </w:numPr>
-        <w:spacing w:after="100" w:line="340"/>
+        <w:spacing w:after="80" w:line="340"/>
       </w:pPr>
       <w:r>
         <w:rPr>
@@ -9753,7 +9786,7 @@
           <w:ilvl w:val="0"/>
           <w:numId w:val="1"/>
         </w:numPr>
-        <w:spacing w:after="100" w:line="340"/>
+        <w:spacing w:after="80" w:line="340"/>
       </w:pPr>
       <w:r>
         <w:rPr>
@@ -9769,7 +9802,7 @@
           <w:ilvl w:val="0"/>
           <w:numId w:val="1"/>
         </w:numPr>
-        <w:spacing w:after="100" w:line="340"/>
+        <w:spacing w:after="80" w:line="340"/>
       </w:pPr>
       <w:r>
         <w:rPr>
@@ -9785,7 +9818,7 @@
           <w:ilvl w:val="0"/>
           <w:numId w:val="1"/>
         </w:numPr>
-        <w:spacing w:after="100" w:line="340"/>
+        <w:spacing w:after="80" w:line="340"/>
       </w:pPr>
       <w:r>
         <w:rPr>
@@ -9801,7 +9834,7 @@
           <w:ilvl w:val="0"/>
           <w:numId w:val="1"/>
         </w:numPr>
-        <w:spacing w:after="100" w:line="340"/>
+        <w:spacing w:after="80" w:line="340"/>
       </w:pPr>
       <w:r>
         <w:rPr>
@@ -9817,7 +9850,7 @@
           <w:ilvl w:val="0"/>
           <w:numId w:val="1"/>
         </w:numPr>
-        <w:spacing w:after="100" w:line="340"/>
+        <w:spacing w:after="80" w:line="340"/>
       </w:pPr>
       <w:r>
         <w:rPr>
@@ -9833,7 +9866,7 @@
           <w:ilvl w:val="0"/>
           <w:numId w:val="1"/>
         </w:numPr>
-        <w:spacing w:after="100" w:line="340"/>
+        <w:spacing w:after="80" w:line="340"/>
       </w:pPr>
       <w:r>
         <w:rPr>
@@ -9849,7 +9882,7 @@
           <w:ilvl w:val="0"/>
           <w:numId w:val="1"/>
         </w:numPr>
-        <w:spacing w:after="100" w:line="340"/>
+        <w:spacing w:after="80" w:line="340"/>
       </w:pPr>
       <w:r>
         <w:rPr>
@@ -9865,7 +9898,7 @@
           <w:ilvl w:val="0"/>
           <w:numId w:val="1"/>
         </w:numPr>
-        <w:spacing w:after="100" w:line="340"/>
+        <w:spacing w:after="80" w:line="340"/>
       </w:pPr>
       <w:r>
         <w:rPr>
@@ -9881,7 +9914,7 @@
           <w:ilvl w:val="0"/>
           <w:numId w:val="1"/>
         </w:numPr>
-        <w:spacing w:after="100" w:line="340"/>
+        <w:spacing w:after="80" w:line="340"/>
       </w:pPr>
       <w:r>
         <w:rPr>
@@ -9897,7 +9930,7 @@
           <w:ilvl w:val="0"/>
           <w:numId w:val="1"/>
         </w:numPr>
-        <w:spacing w:after="100" w:line="340"/>
+        <w:spacing w:after="80" w:line="340"/>
       </w:pPr>
       <w:r>
         <w:rPr>
@@ -9913,7 +9946,7 @@
           <w:ilvl w:val="0"/>
           <w:numId w:val="1"/>
         </w:numPr>
-        <w:spacing w:after="100" w:line="340"/>
+        <w:spacing w:after="80" w:line="340"/>
       </w:pPr>
       <w:r>
         <w:rPr>
@@ -9929,7 +9962,7 @@
           <w:ilvl w:val="0"/>
           <w:numId w:val="1"/>
         </w:numPr>
-        <w:spacing w:after="100" w:line="340"/>
+        <w:spacing w:after="80" w:line="340"/>
       </w:pPr>
       <w:r>
         <w:rPr>
@@ -9945,7 +9978,7 @@
           <w:ilvl w:val="0"/>
           <w:numId w:val="1"/>
         </w:numPr>
-        <w:spacing w:after="100" w:line="340"/>
+        <w:spacing w:after="80" w:line="340"/>
       </w:pPr>
       <w:r>
         <w:rPr>
@@ -9961,7 +9994,7 @@
           <w:ilvl w:val="0"/>
           <w:numId w:val="1"/>
         </w:numPr>
-        <w:spacing w:after="100" w:line="340"/>
+        <w:spacing w:after="80" w:line="340"/>
       </w:pPr>
       <w:r>
         <w:rPr>
@@ -9977,7 +10010,7 @@
           <w:ilvl w:val="0"/>
           <w:numId w:val="1"/>
         </w:numPr>
-        <w:spacing w:after="100" w:line="340"/>
+        <w:spacing w:after="80" w:line="340"/>
       </w:pPr>
       <w:r>
         <w:rPr>
@@ -9993,7 +10026,7 @@
           <w:ilvl w:val="0"/>
           <w:numId w:val="1"/>
         </w:numPr>
-        <w:spacing w:after="100" w:line="340"/>
+        <w:spacing w:after="80" w:line="340"/>
       </w:pPr>
       <w:r>
         <w:rPr>
@@ -10009,7 +10042,7 @@
           <w:ilvl w:val="0"/>
           <w:numId w:val="1"/>
         </w:numPr>
-        <w:spacing w:after="100" w:line="340"/>
+        <w:spacing w:after="80" w:line="340"/>
       </w:pPr>
       <w:r>
         <w:rPr>
@@ -10025,7 +10058,7 @@
           <w:ilvl w:val="0"/>
           <w:numId w:val="1"/>
         </w:numPr>
-        <w:spacing w:after="100" w:line="340"/>
+        <w:spacing w:after="80" w:line="340"/>
       </w:pPr>
       <w:r>
         <w:rPr>
@@ -10041,7 +10074,7 @@
           <w:ilvl w:val="0"/>
           <w:numId w:val="1"/>
         </w:numPr>
-        <w:spacing w:after="100" w:line="340"/>
+        <w:spacing w:after="80" w:line="340"/>
       </w:pPr>
       <w:r>
         <w:rPr>
@@ -10057,7 +10090,7 @@
           <w:ilvl w:val="0"/>
           <w:numId w:val="1"/>
         </w:numPr>
-        <w:spacing w:after="100" w:line="340"/>
+        <w:spacing w:after="80" w:line="340"/>
       </w:pPr>
       <w:r>
         <w:rPr>
@@ -10073,23 +10106,23 @@
           <w:ilvl w:val="0"/>
           <w:numId w:val="1"/>
         </w:numPr>
-        <w:spacing w:after="100" w:line="340"/>
-      </w:pPr>
-      <w:r>
-        <w:rPr>
-          <w:rFonts w:ascii="SimSun" w:cs="SimSun" w:eastAsia="SimSun" w:hAnsi="SimSun"/>
-        </w:rPr>
-        <w:t xml:space="preserve">除了这个世界，还有什么考我们考得这么周全，却让我们偏偏漏掉了那道最要紧的题？</w:t>
-      </w:r>
-    </w:p>
-    <w:p>
-      <w:pPr>
-        <w:pStyle w:val="ListParagraph"/>
-        <w:numPr>
-          <w:ilvl w:val="0"/>
-          <w:numId w:val="1"/>
-        </w:numPr>
-        <w:spacing w:after="100" w:line="340"/>
+        <w:spacing w:after="80" w:line="340"/>
+      </w:pPr>
+      <w:r>
+        <w:rPr>
+          <w:rFonts w:ascii="SimSun" w:cs="SimSun" w:eastAsia="SimSun" w:hAnsi="SimSun"/>
+        </w:rPr>
+        <w:t xml:space="preserve">除了这个世界，还有什么考我们考得这么周全，以致我们偏偏漏掉了那道最要紧的题？</w:t>
+      </w:r>
+    </w:p>
+    <w:p>
+      <w:pPr>
+        <w:pStyle w:val="ListParagraph"/>
+        <w:numPr>
+          <w:ilvl w:val="0"/>
+          <w:numId w:val="1"/>
+        </w:numPr>
+        <w:spacing w:after="80" w:line="340"/>
       </w:pPr>
       <w:r>
         <w:rPr>
@@ -10105,7 +10138,7 @@
           <w:ilvl w:val="0"/>
           <w:numId w:val="1"/>
         </w:numPr>
-        <w:spacing w:after="100" w:line="340"/>
+        <w:spacing w:after="80" w:line="340"/>
       </w:pPr>
       <w:r>
         <w:rPr>
@@ -10121,7 +10154,7 @@
           <w:ilvl w:val="0"/>
           <w:numId w:val="1"/>
         </w:numPr>
-        <w:spacing w:after="100" w:line="340"/>
+        <w:spacing w:after="80" w:line="340"/>
       </w:pPr>
       <w:r>
         <w:rPr>
@@ -10137,7 +10170,7 @@
           <w:ilvl w:val="0"/>
           <w:numId w:val="1"/>
         </w:numPr>
-        <w:spacing w:after="100" w:line="340"/>
+        <w:spacing w:after="80" w:line="340"/>
       </w:pPr>
       <w:r>
         <w:rPr>
@@ -10153,7 +10186,7 @@
           <w:ilvl w:val="0"/>
           <w:numId w:val="1"/>
         </w:numPr>
-        <w:spacing w:after="100" w:line="340"/>
+        <w:spacing w:after="80" w:line="340"/>
       </w:pPr>
       <w:r>
         <w:rPr>
@@ -10169,23 +10202,23 @@
           <w:ilvl w:val="0"/>
           <w:numId w:val="1"/>
         </w:numPr>
-        <w:spacing w:after="100" w:line="340"/>
-      </w:pPr>
-      <w:r>
-        <w:rPr>
-          <w:rFonts w:ascii="SimSun" w:cs="SimSun" w:eastAsia="SimSun" w:hAnsi="SimSun"/>
-        </w:rPr>
-        <w:t xml:space="preserve">要找到“我们”该在的那一格，最好的办法就是不坚持、不挑拣。</w:t>
-      </w:r>
-    </w:p>
-    <w:p>
-      <w:pPr>
-        <w:pStyle w:val="ListParagraph"/>
-        <w:numPr>
-          <w:ilvl w:val="0"/>
-          <w:numId w:val="1"/>
-        </w:numPr>
-        <w:spacing w:after="100" w:line="340"/>
+        <w:spacing w:after="80" w:line="340"/>
+      </w:pPr>
+      <w:r>
+        <w:rPr>
+          <w:rFonts w:ascii="SimSun" w:cs="SimSun" w:eastAsia="SimSun" w:hAnsi="SimSun"/>
+        </w:rPr>
+        <w:t xml:space="preserve">要找到“我们”该在的那一格，最好的办法就是不坚持己见、不挑拣。</w:t>
+      </w:r>
+    </w:p>
+    <w:p>
+      <w:pPr>
+        <w:pStyle w:val="ListParagraph"/>
+        <w:numPr>
+          <w:ilvl w:val="0"/>
+          <w:numId w:val="1"/>
+        </w:numPr>
+        <w:spacing w:after="80" w:line="340"/>
       </w:pPr>
       <w:r>
         <w:rPr>
@@ -10201,7 +10234,7 @@
           <w:ilvl w:val="0"/>
           <w:numId w:val="1"/>
         </w:numPr>
-        <w:spacing w:after="100" w:line="340"/>
+        <w:spacing w:after="80" w:line="340"/>
       </w:pPr>
       <w:r>
         <w:rPr>
@@ -10217,7 +10250,7 @@
           <w:ilvl w:val="0"/>
           <w:numId w:val="1"/>
         </w:numPr>
-        <w:spacing w:after="100" w:line="340"/>
+        <w:spacing w:after="80" w:line="340"/>
       </w:pPr>
       <w:r>
         <w:rPr>
@@ -10233,7 +10266,7 @@
           <w:ilvl w:val="0"/>
           <w:numId w:val="1"/>
         </w:numPr>
-        <w:spacing w:after="100" w:line="340"/>
+        <w:spacing w:after="80" w:line="340"/>
       </w:pPr>
       <w:r>
         <w:rPr>
@@ -10249,7 +10282,7 @@
           <w:ilvl w:val="0"/>
           <w:numId w:val="1"/>
         </w:numPr>
-        <w:spacing w:after="100" w:line="340"/>
+        <w:spacing w:after="80" w:line="340"/>
       </w:pPr>
       <w:r>
         <w:rPr>
@@ -10265,7 +10298,7 @@
           <w:ilvl w:val="0"/>
           <w:numId w:val="1"/>
         </w:numPr>
-        <w:spacing w:after="100" w:line="340"/>
+        <w:spacing w:after="80" w:line="340"/>
       </w:pPr>
       <w:r>
         <w:rPr>
@@ -10281,7 +10314,7 @@
           <w:ilvl w:val="0"/>
           <w:numId w:val="1"/>
         </w:numPr>
-        <w:spacing w:after="100" w:line="340"/>
+        <w:spacing w:after="80" w:line="340"/>
       </w:pPr>
       <w:r>
         <w:rPr>
@@ -10297,7 +10330,7 @@
           <w:ilvl w:val="0"/>
           <w:numId w:val="1"/>
         </w:numPr>
-        <w:spacing w:after="100" w:line="340"/>
+        <w:spacing w:after="80" w:line="340"/>
       </w:pPr>
       <w:r>
         <w:rPr>
@@ -10313,7 +10346,7 @@
           <w:ilvl w:val="0"/>
           <w:numId w:val="1"/>
         </w:numPr>
-        <w:spacing w:after="100" w:line="340"/>
+        <w:spacing w:after="80" w:line="340"/>
       </w:pPr>
       <w:r>
         <w:rPr>
@@ -10329,7 +10362,7 @@
           <w:ilvl w:val="0"/>
           <w:numId w:val="1"/>
         </w:numPr>
-        <w:spacing w:after="100" w:line="340"/>
+        <w:spacing w:after="80" w:line="340"/>
       </w:pPr>
       <w:r>
         <w:rPr>
@@ -10345,7 +10378,7 @@
           <w:ilvl w:val="0"/>
           <w:numId w:val="1"/>
         </w:numPr>
-        <w:spacing w:after="100" w:line="340"/>
+        <w:spacing w:after="80" w:line="340"/>
       </w:pPr>
       <w:r>
         <w:rPr>
@@ -10361,7 +10394,7 @@
           <w:ilvl w:val="0"/>
           <w:numId w:val="1"/>
         </w:numPr>
-        <w:spacing w:after="100" w:line="340"/>
+        <w:spacing w:after="80" w:line="340"/>
       </w:pPr>
       <w:r>
         <w:rPr>
@@ -10377,23 +10410,23 @@
           <w:ilvl w:val="0"/>
           <w:numId w:val="1"/>
         </w:numPr>
-        <w:spacing w:after="100" w:line="340"/>
-      </w:pPr>
-      <w:r>
-        <w:rPr>
-          <w:rFonts w:ascii="SimSun" w:cs="SimSun" w:eastAsia="SimSun" w:hAnsi="SimSun"/>
-        </w:rPr>
-        <w:t xml:space="preserve">设身处地替别人活，其实很容易；这是利他自然而然的结果。</w:t>
-      </w:r>
-    </w:p>
-    <w:p>
-      <w:pPr>
-        <w:pStyle w:val="ListParagraph"/>
-        <w:numPr>
-          <w:ilvl w:val="0"/>
-          <w:numId w:val="1"/>
-        </w:numPr>
-        <w:spacing w:after="100" w:line="340"/>
+        <w:spacing w:after="80" w:line="340"/>
+      </w:pPr>
+      <w:r>
+        <w:rPr>
+          <w:rFonts w:ascii="SimSun" w:cs="SimSun" w:eastAsia="SimSun" w:hAnsi="SimSun"/>
+        </w:rPr>
+        <w:t xml:space="preserve">感同身受地活在别人的人生里，其实很容易；这是利他自然而然的结果。</w:t>
+      </w:r>
+    </w:p>
+    <w:p>
+      <w:pPr>
+        <w:pStyle w:val="ListParagraph"/>
+        <w:numPr>
+          <w:ilvl w:val="0"/>
+          <w:numId w:val="1"/>
+        </w:numPr>
+        <w:spacing w:after="80" w:line="340"/>
       </w:pPr>
       <w:r>
         <w:rPr>
@@ -10409,7 +10442,7 @@
           <w:ilvl w:val="0"/>
           <w:numId w:val="1"/>
         </w:numPr>
-        <w:spacing w:after="100" w:line="340"/>
+        <w:spacing w:after="80" w:line="340"/>
       </w:pPr>
       <w:r>
         <w:rPr>
@@ -10425,23 +10458,23 @@
           <w:ilvl w:val="0"/>
           <w:numId w:val="1"/>
         </w:numPr>
-        <w:spacing w:after="100" w:line="340"/>
-      </w:pPr>
-      <w:r>
-        <w:rPr>
-          <w:rFonts w:ascii="SimSun" w:cs="SimSun" w:eastAsia="SimSun" w:hAnsi="SimSun"/>
-        </w:rPr>
-        <w:t xml:space="preserve">一旦养成扎实的禅修习惯，往后做什么事你都做得来。客人来家里吃饭，你先给谁盛饭？客人即是神明。凡是好主人，招待客人的欢喜，总远胜过自己吃那一份。</w:t>
-      </w:r>
-    </w:p>
-    <w:p>
-      <w:pPr>
-        <w:pStyle w:val="ListParagraph"/>
-        <w:numPr>
-          <w:ilvl w:val="0"/>
-          <w:numId w:val="1"/>
-        </w:numPr>
-        <w:spacing w:after="100" w:line="340"/>
+        <w:spacing w:after="80" w:line="340"/>
+      </w:pPr>
+      <w:r>
+        <w:rPr>
+          <w:rFonts w:ascii="SimSun" w:cs="SimSun" w:eastAsia="SimSun" w:hAnsi="SimSun"/>
+        </w:rPr>
+        <w:t xml:space="preserve">一旦养成扎实的禅修习惯，其余的事你都会放到它之后再做。客人来家里吃饭，你先给谁盛饭？客人即是神明。凡是好主人，招待客人的欢喜，总远胜过自己吃那一份。</w:t>
+      </w:r>
+    </w:p>
+    <w:p>
+      <w:pPr>
+        <w:pStyle w:val="ListParagraph"/>
+        <w:numPr>
+          <w:ilvl w:val="0"/>
+          <w:numId w:val="1"/>
+        </w:numPr>
+        <w:spacing w:after="80" w:line="340"/>
       </w:pPr>
       <w:r>
         <w:rPr>
@@ -10457,7 +10490,7 @@
           <w:ilvl w:val="0"/>
           <w:numId w:val="1"/>
         </w:numPr>
-        <w:spacing w:after="100" w:line="340"/>
+        <w:spacing w:after="80" w:line="340"/>
       </w:pPr>
       <w:r>
         <w:rPr>
@@ -10473,7 +10506,7 @@
           <w:ilvl w:val="0"/>
           <w:numId w:val="1"/>
         </w:numPr>
-        <w:spacing w:after="100" w:line="340"/>
+        <w:spacing w:after="80" w:line="340"/>
       </w:pPr>
       <w:r>
         <w:rPr>
@@ -10489,7 +10522,7 @@
           <w:ilvl w:val="0"/>
           <w:numId w:val="1"/>
         </w:numPr>
-        <w:spacing w:after="100" w:line="340"/>
+        <w:spacing w:after="80" w:line="340"/>
       </w:pPr>
       <w:r>
         <w:rPr>
@@ -10505,7 +10538,7 @@
           <w:ilvl w:val="0"/>
           <w:numId w:val="1"/>
         </w:numPr>
-        <w:spacing w:after="100" w:line="340"/>
+        <w:spacing w:after="80" w:line="340"/>
       </w:pPr>
       <w:r>
         <w:rPr>
@@ -10521,7 +10554,7 @@
           <w:ilvl w:val="0"/>
           <w:numId w:val="1"/>
         </w:numPr>
-        <w:spacing w:after="100" w:line="340"/>
+        <w:spacing w:after="80" w:line="340"/>
       </w:pPr>
       <w:r>
         <w:rPr>
@@ -10537,7 +10570,7 @@
           <w:ilvl w:val="0"/>
           <w:numId w:val="1"/>
         </w:numPr>
-        <w:spacing w:after="100" w:line="340"/>
+        <w:spacing w:after="80" w:line="340"/>
       </w:pPr>
       <w:r>
         <w:rPr>
@@ -10553,7 +10586,7 @@
           <w:ilvl w:val="0"/>
           <w:numId w:val="1"/>
         </w:numPr>
-        <w:spacing w:after="100" w:line="340"/>
+        <w:spacing w:after="80" w:line="340"/>
       </w:pPr>
       <w:r>
         <w:rPr>
@@ -10569,7 +10602,7 @@
           <w:ilvl w:val="0"/>
           <w:numId w:val="1"/>
         </w:numPr>
-        <w:spacing w:after="100" w:line="340"/>
+        <w:spacing w:after="80" w:line="340"/>
       </w:pPr>
       <w:r>
         <w:rPr>
@@ -10585,7 +10618,7 @@
           <w:ilvl w:val="0"/>
           <w:numId w:val="1"/>
         </w:numPr>
-        <w:spacing w:after="100" w:line="340"/>
+        <w:spacing w:after="80" w:line="340"/>
       </w:pPr>
       <w:r>
         <w:rPr>
@@ -10600,7 +10633,7 @@
       </w:pPr>
     </w:p>
     <w:sectPr>
-      <w:footerReference w:type="default" r:id="rId7"/>
+      <w:footerReference w:type="default" r:id="rId6"/>
       <w:pgSz w:w="11906" w:h="16838" w:orient="portrait"/>
       <w:pgMar w:top="1440" w:right="1440" w:bottom="1440" w:left="1440" w:header="708" w:footer="708" w:gutter="0"/>
       <w:pgNumType/>
@@ -10608,10 +10641,6 @@
     </w:sectPr>
   </w:body>
 </w:document>
-</file>
-
-<file path=word/comments.xml><?xml version="1.0" encoding="utf-8"?>
-<w:comments xmlns:cx="http://schemas.microsoft.com/office/drawing/2014/chartex" xmlns:cx1="http://schemas.microsoft.com/office/drawing/2015/9/8/chartex" xmlns:cx2="http://schemas.microsoft.com/office/drawing/2015/10/21/chartex" xmlns:cx3="http://schemas.microsoft.com/office/drawing/2016/5/9/chartex" xmlns:cx4="http://schemas.microsoft.com/office/drawing/2016/5/10/chartex" xmlns:cx5="http://schemas.microsoft.com/office/drawing/2016/5/11/chartex" xmlns:cx6="http://schemas.microsoft.com/office/drawing/2016/5/12/chartex" xmlns:cx7="http://schemas.microsoft.com/office/drawing/2016/5/13/chartex" xmlns:cx8="http://schemas.microsoft.com/office/drawing/2016/5/14/chartex" xmlns:mc="http://schemas.openxmlformats.org/markup-compatibility/2006" xmlns:aink="http://schemas.microsoft.com/office/drawing/2016/ink" xmlns:am3d="http://schemas.microsoft.com/office/drawing/2017/model3d" xmlns:o="urn:schemas-microsoft-com:office:office" xmlns:r="http://schemas.openxmlformats.org/officeDocument/2006/relationships" xmlns:m="http://schemas.openxmlformats.org/officeDocument/2006/math" xmlns:v="urn:schemas-microsoft-com:vml" xmlns:wp14="http://schemas.microsoft.com/office/word/2010/wordprocessingDrawing" xmlns:wp="http://schemas.openxmlformats.org/drawingml/2006/wordprocessingDrawing" xmlns:w10="urn:schemas-microsoft-com:office:word" xmlns:w="http://schemas.openxmlformats.org/wordprocessingml/2006/main" xmlns:w14="http://schemas.microsoft.com/office/word/2010/wordml" xmlns:w15="http://schemas.microsoft.com/office/word/2012/wordml" xmlns:w16cex="http://schemas.microsoft.com/office/word/2018/wordml/cex" xmlns:w16cid="http://schemas.microsoft.com/office/word/2016/wordml/cid" xmlns:w16="http://schemas.microsoft.com/office/word/2018/wordml" xmlns:w16sdtdh="http://schemas.microsoft.com/office/word/2020/wordml/sdtdatahash" xmlns:w16se="http://schemas.microsoft.com/office/word/2015/wordml/symex" xmlns:wpg="http://schemas.microsoft.com/office/word/2010/wordprocessingGroup" xmlns:wpi="http://schemas.microsoft.com/office/word/2010/wordprocessingInk" xmlns:wne="http://schemas.microsoft.com/office/word/2006/wordml" xmlns:wps="http://schemas.microsoft.com/office/word/2010/wordprocessingShape"/>
 </file>
 
 <file path=word/endnotes.xml><?xml version="1.0" encoding="utf-8"?>
@@ -10738,7 +10767,7 @@
           <w:sz w:val="18"/>
           <w:szCs w:val="18"/>
         </w:rPr>
-        <w:t xml:space="preserve">“话头”指的是一句话说出口之前那一刻特有的心的状态。参话头这一修法，就是设法把那一刻拉长。常用的是一个“谁”字。</w:t>
+        <w:t xml:space="preserve">“话头”指的是一句话说出口之前那一刻特有的心的状态。参话头这一修法，就是设法把那一刻拉长。常用的是一个“谁”字：既不真正说出口，也不把它否定掉。</w:t>
       </w:r>
     </w:p>
   </w:footnote>
@@ -10767,7 +10796,7 @@
 <w:numbering xmlns:wpc="http://schemas.microsoft.com/office/word/2010/wordprocessingCanvas" xmlns:mc="http://schemas.openxmlformats.org/markup-compatibility/2006" xmlns:o="urn:schemas-microsoft-com:office:office" xmlns:r="http://schemas.openxmlformats.org/officeDocument/2006/relationships" xmlns:m="http://schemas.openxmlformats.org/officeDocument/2006/math" xmlns:v="urn:schemas-microsoft-com:vml" xmlns:wp14="http://schemas.microsoft.com/office/word/2010/wordprocessingDrawing" xmlns:wp="http://schemas.openxmlformats.org/drawingml/2006/wordprocessingDrawing" xmlns:w10="urn:schemas-microsoft-com:office:word" xmlns:w="http://schemas.openxmlformats.org/wordprocessingml/2006/main" xmlns:w14="http://schemas.microsoft.com/office/word/2010/wordml" xmlns:w15="http://schemas.microsoft.com/office/word/2012/wordml" xmlns:wpg="http://schemas.microsoft.com/office/word/2010/wordprocessingGroup" xmlns:wpi="http://schemas.microsoft.com/office/word/2010/wordprocessingInk" xmlns:wne="http://schemas.microsoft.com/office/word/2006/wordml" xmlns:wps="http://schemas.microsoft.com/office/word/2010/wordprocessingShape" mc:Ignorable="w14 w15 wp14">
   <w:abstractNum w:abstractNumId="1" w15:restartNumberingAfterBreak="0">
     <w:multiLevelType w:val="hybridMultilevel"/>
-    <w:lvl w:ilvl="0" w15:tentative="1">
+    <w:lvl w:ilvl="0" w:tentative="1">
       <w:start w:val="1"/>
       <w:numFmt w:val="bullet"/>
       <w:lvlText w:val="●"/>
@@ -10776,7 +10805,7 @@
         <w:ind w:left="720" w:hanging="360"/>
       </w:pPr>
     </w:lvl>
-    <w:lvl w:ilvl="1" w15:tentative="1">
+    <w:lvl w:ilvl="1" w:tentative="1">
       <w:start w:val="1"/>
       <w:numFmt w:val="bullet"/>
       <w:lvlText w:val="○"/>
@@ -10785,7 +10814,7 @@
         <w:ind w:left="1440" w:hanging="360"/>
       </w:pPr>
     </w:lvl>
-    <w:lvl w:ilvl="2" w15:tentative="1">
+    <w:lvl w:ilvl="2" w:tentative="1">
       <w:start w:val="1"/>
       <w:numFmt w:val="bullet"/>
       <w:lvlText w:val="■"/>
@@ -10794,7 +10823,7 @@
         <w:ind w:left="2160" w:hanging="360"/>
       </w:pPr>
     </w:lvl>
-    <w:lvl w:ilvl="3" w15:tentative="1">
+    <w:lvl w:ilvl="3" w:tentative="1">
       <w:start w:val="1"/>
       <w:numFmt w:val="bullet"/>
       <w:lvlText w:val="●"/>
@@ -10803,7 +10832,7 @@
         <w:ind w:left="2880" w:hanging="360"/>
       </w:pPr>
     </w:lvl>
-    <w:lvl w:ilvl="4" w15:tentative="1">
+    <w:lvl w:ilvl="4" w:tentative="1">
       <w:start w:val="1"/>
       <w:numFmt w:val="bullet"/>
       <w:lvlText w:val="○"/>
@@ -10812,7 +10841,7 @@
         <w:ind w:left="3600" w:hanging="360"/>
       </w:pPr>
     </w:lvl>
-    <w:lvl w:ilvl="5" w15:tentative="1">
+    <w:lvl w:ilvl="5" w:tentative="1">
       <w:start w:val="1"/>
       <w:numFmt w:val="bullet"/>
       <w:lvlText w:val="■"/>
@@ -10821,7 +10850,7 @@
         <w:ind w:left="4320" w:hanging="360"/>
       </w:pPr>
     </w:lvl>
-    <w:lvl w:ilvl="6" w15:tentative="1">
+    <w:lvl w:ilvl="6" w:tentative="1">
       <w:start w:val="1"/>
       <w:numFmt w:val="bullet"/>
       <w:lvlText w:val="●"/>
@@ -10830,7 +10859,7 @@
         <w:ind w:left="5040" w:hanging="360"/>
       </w:pPr>
     </w:lvl>
-    <w:lvl w:ilvl="7" w15:tentative="1">
+    <w:lvl w:ilvl="7" w:tentative="1">
       <w:start w:val="1"/>
       <w:numFmt w:val="bullet"/>
       <w:lvlText w:val="●"/>
@@ -10839,7 +10868,7 @@
         <w:ind w:left="5760" w:hanging="360"/>
       </w:pPr>
     </w:lvl>
-    <w:lvl w:ilvl="8" w15:tentative="1">
+    <w:lvl w:ilvl="8" w:tentative="1">
       <w:start w:val="1"/>
       <w:numFmt w:val="bullet"/>
       <w:lvlText w:val="●"/>
@@ -10870,6 +10899,10 @@
     </w:rPrDefault>
     <w:pPrDefault/>
   </w:docDefaults>
+  <w:style w:type="paragraph" w:styleId="Normal" w:default="1">
+    <w:name w:val="Normal"/>
+    <w:qFormat/>
+  </w:style>
   <w:style w:type="paragraph" w:styleId="Title">
     <w:name w:val="Title"/>
     <w:basedOn w:val="Normal"/>
@@ -11045,4 +11078,294 @@
     </w:rPr>
   </w:style>
 </w:styles>
+</file>
+
+<file path=word/theme/theme1.xml><?xml version="1.0" encoding="utf-8"?>
+<a:theme xmlns:a="http://schemas.openxmlformats.org/drawingml/2006/main" name="Office Theme">
+  <a:themeElements>
+    <a:clrScheme name="Office">
+      <a:dk1>
+        <a:sysClr val="windowText" lastClr="000000"/>
+      </a:dk1>
+      <a:lt1>
+        <a:sysClr val="window" lastClr="FFFFFF"/>
+      </a:lt1>
+      <a:dk2>
+        <a:srgbClr val="44546A"/>
+      </a:dk2>
+      <a:lt2>
+        <a:srgbClr val="E7E6E6"/>
+      </a:lt2>
+      <a:accent1>
+        <a:srgbClr val="4472C4"/>
+      </a:accent1>
+      <a:accent2>
+        <a:srgbClr val="ED7D31"/>
+      </a:accent2>
+      <a:accent3>
+        <a:srgbClr val="A5A5A5"/>
+      </a:accent3>
+      <a:accent4>
+        <a:srgbClr val="FFC000"/>
+      </a:accent4>
+      <a:accent5>
+        <a:srgbClr val="5B9BD5"/>
+      </a:accent5>
+      <a:accent6>
+        <a:srgbClr val="70AD47"/>
+      </a:accent6>
+      <a:hlink>
+        <a:srgbClr val="0563C1"/>
+      </a:hlink>
+      <a:folHlink>
+        <a:srgbClr val="954F72"/>
+      </a:folHlink>
+    </a:clrScheme>
+    <a:fontScheme name="Office">
+      <a:majorFont>
+        <a:latin typeface="Calibri Light" panose="020F0302020204030204"/>
+        <a:ea typeface=""/>
+        <a:cs typeface=""/>
+        <a:font script="Jpan" typeface="游ゴシック Light"/>
+        <a:font script="Hang" typeface="맑은 고딕"/>
+        <a:font script="Hans" typeface="等线 Light"/>
+        <a:font script="Hant" typeface="新細明體"/>
+        <a:font script="Arab" typeface="Times New Roman"/>
+        <a:font script="Hebr" typeface="Times New Roman"/>
+        <a:font script="Thai" typeface="Angsana New"/>
+        <a:font script="Ethi" typeface="Nyala"/>
+        <a:font script="Beng" typeface="Vrinda"/>
+        <a:font script="Gujr" typeface="Shruti"/>
+        <a:font script="Khmr" typeface="MoolBoran"/>
+        <a:font script="Knda" typeface="Tunga"/>
+        <a:font script="Guru" typeface="Raavi"/>
+        <a:font script="Cans" typeface="Euphemia"/>
+        <a:font script="Cher" typeface="Plantagenet Cherokee"/>
+        <a:font script="Yiii" typeface="Microsoft Yi Baiti"/>
+        <a:font script="Tibt" typeface="Microsoft Himalaya"/>
+        <a:font script="Thaa" typeface="MV Boli"/>
+        <a:font script="Deva" typeface="Mangal"/>
+        <a:font script="Telu" typeface="Gautami"/>
+        <a:font script="Taml" typeface="Latha"/>
+        <a:font script="Syrc" typeface="Estrangelo Edessa"/>
+        <a:font script="Orya" typeface="Kalinga"/>
+        <a:font script="Mlym" typeface="Kartika"/>
+        <a:font script="Laoo" typeface="DokChampa"/>
+        <a:font script="Sinh" typeface="Iskoola Pota"/>
+        <a:font script="Mong" typeface="Mongolian Baiti"/>
+        <a:font script="Viet" typeface="Times New Roman"/>
+        <a:font script="Uigh" typeface="Microsoft Uighur"/>
+        <a:font script="Geor" typeface="Sylfaen"/>
+        <a:font script="Armn" typeface="Arial"/>
+        <a:font script="Bugi" typeface="Leelawadee UI"/>
+        <a:font script="Bopo" typeface="Microsoft JhengHei"/>
+        <a:font script="Java" typeface="Javanese Text"/>
+        <a:font script="Lisu" typeface="Segoe UI"/>
+        <a:font script="Mymr" typeface="Myanmar Text"/>
+        <a:font script="Nkoo" typeface="Ebrima"/>
+        <a:font script="Olck" typeface="Nirmala UI"/>
+        <a:font script="Osma" typeface="Ebrima"/>
+        <a:font script="Phag" typeface="Phagspa"/>
+        <a:font script="Syrn" typeface="Estrangelo Edessa"/>
+        <a:font script="Syrj" typeface="Estrangelo Edessa"/>
+        <a:font script="Syre" typeface="Estrangelo Edessa"/>
+        <a:font script="Sora" typeface="Nirmala UI"/>
+        <a:font script="Tale" typeface="Microsoft Tai Le"/>
+        <a:font script="Talu" typeface="Microsoft New Tai Lue"/>
+        <a:font script="Tfng" typeface="Ebrima"/>
+      </a:majorFont>
+      <a:minorFont>
+        <a:latin typeface="Calibri" panose="020F0502020204030204"/>
+        <a:ea typeface=""/>
+        <a:cs typeface=""/>
+        <a:font script="Jpan" typeface="游明朝"/>
+        <a:font script="Hang" typeface="맑은 고딕"/>
+        <a:font script="Hans" typeface="等线"/>
+        <a:font script="Hant" typeface="新細明體"/>
+        <a:font script="Arab" typeface="Arial"/>
+        <a:font script="Hebr" typeface="Arial"/>
+        <a:font script="Thai" typeface="Cordia New"/>
+        <a:font script="Ethi" typeface="Nyala"/>
+        <a:font script="Beng" typeface="Vrinda"/>
+        <a:font script="Gujr" typeface="Shruti"/>
+        <a:font script="Khmr" typeface="DaunPenh"/>
+        <a:font script="Knda" typeface="Tunga"/>
+        <a:font script="Guru" typeface="Raavi"/>
+        <a:font script="Cans" typeface="Euphemia"/>
+        <a:font script="Cher" typeface="Plantagenet Cherokee"/>
+        <a:font script="Yiii" typeface="Microsoft Yi Baiti"/>
+        <a:font script="Tibt" typeface="Microsoft Himalaya"/>
+        <a:font script="Thaa" typeface="MV Boli"/>
+        <a:font script="Deva" typeface="Mangal"/>
+        <a:font script="Telu" typeface="Gautami"/>
+        <a:font script="Taml" typeface="Latha"/>
+        <a:font script="Syrc" typeface="Estrangelo Edessa"/>
+        <a:font script="Orya" typeface="Kalinga"/>
+        <a:font script="Mlym" typeface="Kartika"/>
+        <a:font script="Laoo" typeface="DokChampa"/>
+        <a:font script="Sinh" typeface="Iskoola Pota"/>
+        <a:font script="Mong" typeface="Mongolian Baiti"/>
+        <a:font script="Viet" typeface="Arial"/>
+        <a:font script="Uigh" typeface="Microsoft Uighur"/>
+        <a:font script="Geor" typeface="Sylfaen"/>
+        <a:font script="Armn" typeface="Arial"/>
+        <a:font script="Bugi" typeface="Leelawadee UI"/>
+        <a:font script="Bopo" typeface="Microsoft JhengHei"/>
+        <a:font script="Java" typeface="Javanese Text"/>
+        <a:font script="Lisu" typeface="Segoe UI"/>
+        <a:font script="Mymr" typeface="Myanmar Text"/>
+        <a:font script="Nkoo" typeface="Ebrima"/>
+        <a:font script="Olck" typeface="Nirmala UI"/>
+        <a:font script="Osma" typeface="Ebrima"/>
+        <a:font script="Phag" typeface="Phagspa"/>
+        <a:font script="Syrn" typeface="Estrangelo Edessa"/>
+        <a:font script="Syrj" typeface="Estrangelo Edessa"/>
+        <a:font script="Syre" typeface="Estrangelo Edessa"/>
+        <a:font script="Sora" typeface="Nirmala UI"/>
+        <a:font script="Tale" typeface="Microsoft Tai Le"/>
+        <a:font script="Talu" typeface="Microsoft New Tai Lue"/>
+        <a:font script="Tfng" typeface="Ebrima"/>
+      </a:minorFont>
+    </a:fontScheme>
+    <a:fmtScheme name="Office">
+      <a:fillStyleLst>
+        <a:solidFill>
+          <a:schemeClr val="phClr"/>
+        </a:solidFill>
+        <a:gradFill rotWithShape="true">
+          <a:gsLst>
+            <a:gs pos="0">
+              <a:schemeClr val="phClr">
+                <a:lumMod val="110000"/>
+                <a:satMod val="105000"/>
+                <a:tint val="67000"/>
+              </a:schemeClr>
+            </a:gs>
+            <a:gs pos="50000">
+              <a:schemeClr val="phClr">
+                <a:lumMod val="105000"/>
+                <a:satMod val="103000"/>
+                <a:tint val="73000"/>
+              </a:schemeClr>
+            </a:gs>
+            <a:gs pos="100000">
+              <a:schemeClr val="phClr">
+                <a:lumMod val="105000"/>
+                <a:satMod val="109000"/>
+                <a:tint val="81000"/>
+              </a:schemeClr>
+            </a:gs>
+          </a:gsLst>
+          <a:lin ang="5400000" scaled="false"/>
+        </a:gradFill>
+        <a:gradFill rotWithShape="true">
+          <a:gsLst>
+            <a:gs pos="0">
+              <a:schemeClr val="phClr">
+                <a:satMod val="103000"/>
+                <a:lumMod val="102000"/>
+                <a:tint val="94000"/>
+              </a:schemeClr>
+            </a:gs>
+            <a:gs pos="50000">
+              <a:schemeClr val="phClr">
+                <a:satMod val="110000"/>
+                <a:lumMod val="100000"/>
+                <a:shade val="100000"/>
+              </a:schemeClr>
+            </a:gs>
+            <a:gs pos="100000">
+              <a:schemeClr val="phClr">
+                <a:lumMod val="99000"/>
+                <a:satMod val="120000"/>
+                <a:shade val="78000"/>
+              </a:schemeClr>
+            </a:gs>
+          </a:gsLst>
+          <a:lin ang="5400000" scaled="false"/>
+        </a:gradFill>
+      </a:fillStyleLst>
+      <a:lnStyleLst>
+        <a:ln w="6350" cap="flat" cmpd="sng" algn="ctr">
+          <a:solidFill>
+            <a:schemeClr val="phClr"/>
+          </a:solidFill>
+          <a:prstDash val="solid"/>
+          <a:miter lim="800000"/>
+        </a:ln>
+        <a:ln w="12700" cap="flat" cmpd="sng" algn="ctr">
+          <a:solidFill>
+            <a:schemeClr val="phClr"/>
+          </a:solidFill>
+          <a:prstDash val="solid"/>
+          <a:miter lim="800000"/>
+        </a:ln>
+        <a:ln w="19050" cap="flat" cmpd="sng" algn="ctr">
+          <a:solidFill>
+            <a:schemeClr val="phClr"/>
+          </a:solidFill>
+          <a:prstDash val="solid"/>
+          <a:miter lim="800000"/>
+        </a:ln>
+      </a:lnStyleLst>
+      <a:effectStyleLst>
+        <a:effectStyle>
+          <a:effectLst/>
+        </a:effectStyle>
+        <a:effectStyle>
+          <a:effectLst/>
+        </a:effectStyle>
+        <a:effectStyle>
+          <a:effectLst>
+            <a:outerShdw blurRad="57150" dist="19050" dir="5400000" algn="ctr" rotWithShape="false">
+              <a:srgbClr val="000000">
+                <a:alpha val="63000"/>
+              </a:srgbClr>
+            </a:outerShdw>
+          </a:effectLst>
+        </a:effectStyle>
+      </a:effectStyleLst>
+      <a:bgFillStyleLst>
+        <a:solidFill>
+          <a:schemeClr val="phClr"/>
+        </a:solidFill>
+        <a:solidFill>
+          <a:schemeClr val="phClr">
+            <a:tint val="95000"/>
+            <a:satMod val="170000"/>
+          </a:schemeClr>
+        </a:solidFill>
+        <a:gradFill rotWithShape="true">
+          <a:gsLst>
+            <a:gs pos="0">
+              <a:schemeClr val="phClr">
+                <a:tint val="93000"/>
+                <a:satMod val="150000"/>
+                <a:shade val="98000"/>
+                <a:lumMod val="102000"/>
+              </a:schemeClr>
+            </a:gs>
+            <a:gs pos="50000">
+              <a:schemeClr val="phClr">
+                <a:tint val="98000"/>
+                <a:satMod val="130000"/>
+                <a:shade val="90000"/>
+                <a:lumMod val="103000"/>
+              </a:schemeClr>
+            </a:gs>
+            <a:gs pos="100000">
+              <a:schemeClr val="phClr">
+                <a:shade val="63000"/>
+                <a:satMod val="120000"/>
+              </a:schemeClr>
+            </a:gs>
+          </a:gsLst>
+          <a:lin ang="5400000" scaled="false"/>
+        </a:gradFill>
+      </a:bgFillStyleLst>
+    </a:fmtScheme>
+  </a:themeElements>
+  <a:objectDefaults/>
+  <a:extraClrSchemeLst/>
+</a:theme>
 </file>
</xml_diff>